<commit_message>
docs(testing-course): Times New Roman 14, black text, intro paragraph instead of title
</commit_message>
<xml_diff>
--- a/testing-course/documents/01-test-cases.docx
+++ b/testing-course/documents/01-test-cases.docx
@@ -3,19 +3,8 @@
 <w:document xmlns:wpc="http://schemas.microsoft.com/office/word/2010/wordprocessingCanvas" xmlns:mo="http://schemas.microsoft.com/office/mac/office/2008/main" xmlns:mc="http://schemas.openxmlformats.org/markup-compatibility/2006" xmlns:mv="urn:schemas-microsoft-com:mac:vml" xmlns:o="urn:schemas-microsoft-com:office:office" xmlns:r="http://schemas.openxmlformats.org/officeDocument/2006/relationships" xmlns:m="http://schemas.openxmlformats.org/officeDocument/2006/math" xmlns:v="urn:schemas-microsoft-com:vml" xmlns:wp14="http://schemas.microsoft.com/office/word/2010/wordprocessingDrawing" xmlns:wp="http://schemas.openxmlformats.org/drawingml/2006/wordprocessingDrawing" xmlns:w10="urn:schemas-microsoft-com:office:word" xmlns:w="http://schemas.openxmlformats.org/wordprocessingml/2006/main" xmlns:w14="http://schemas.microsoft.com/office/word/2010/wordml" xmlns:wpg="http://schemas.microsoft.com/office/word/2010/wordprocessingGroup" xmlns:wpi="http://schemas.microsoft.com/office/word/2010/wordprocessingInk" xmlns:wne="http://schemas.microsoft.com/office/word/2006/wordml" xmlns:wps="http://schemas.microsoft.com/office/word/2010/wordprocessingShape" mc:Ignorable="w14 wp14">
   <w:body>
     <w:p>
-      <w:pPr>
-        <w:pStyle w:val="Title"/>
-      </w:pPr>
       <w:r>
-        <w:t>Тест-кейсы: форма заявки DSLKit</w:t>
-      </w:r>
-    </w:p>
-    <w:p>
-      <w:r>
-        <w:rPr>
-          <w:color w:val="555555"/>
-        </w:rPr>
-        <w:t>Лабораторная работа №2. Объект: форма «Записаться в бету» на главной странице, проверка validateWaitlist (site/js/utils/validation.js).</w:t>
+        <w:t>Лабораторная работа №2 «Разработка тест-кейсов». В документе разработаны и выполнены тест-кейсы для формы заявки «Записаться в бету» на главной странице проекта DSLKit (проверка функции validateWaitlist): позитивные, негативные и граничные случаи с результатами выполнения и скриншотами.</w:t>
       </w:r>
     </w:p>
     <w:p>
@@ -71,13 +60,13 @@
           <w:p>
             <w:r>
               <w:rPr>
-                <w:sz w:val="18"/>
+                <w:sz w:val="24"/>
               </w:rPr>
             </w:r>
             <w:r>
               <w:rPr>
                 <w:b/>
-                <w:sz w:val="18"/>
+                <w:sz w:val="24"/>
               </w:rPr>
               <w:t>ID</w:t>
             </w:r>
@@ -91,13 +80,13 @@
           <w:p>
             <w:r>
               <w:rPr>
-                <w:sz w:val="18"/>
+                <w:sz w:val="24"/>
               </w:rPr>
             </w:r>
             <w:r>
               <w:rPr>
                 <w:b/>
-                <w:sz w:val="18"/>
+                <w:sz w:val="24"/>
               </w:rPr>
               <w:t>Тип</w:t>
             </w:r>
@@ -111,13 +100,13 @@
           <w:p>
             <w:r>
               <w:rPr>
-                <w:sz w:val="18"/>
+                <w:sz w:val="24"/>
               </w:rPr>
             </w:r>
             <w:r>
               <w:rPr>
                 <w:b/>
-                <w:sz w:val="18"/>
+                <w:sz w:val="24"/>
               </w:rPr>
               <w:t>Приоритет</w:t>
             </w:r>
@@ -131,13 +120,13 @@
           <w:p>
             <w:r>
               <w:rPr>
-                <w:sz w:val="18"/>
+                <w:sz w:val="24"/>
               </w:rPr>
             </w:r>
             <w:r>
               <w:rPr>
                 <w:b/>
-                <w:sz w:val="18"/>
+                <w:sz w:val="24"/>
               </w:rPr>
               <w:t>Заголовок</w:t>
             </w:r>
@@ -151,13 +140,13 @@
           <w:p>
             <w:r>
               <w:rPr>
-                <w:sz w:val="18"/>
+                <w:sz w:val="24"/>
               </w:rPr>
             </w:r>
             <w:r>
               <w:rPr>
                 <w:b/>
-                <w:sz w:val="18"/>
+                <w:sz w:val="24"/>
               </w:rPr>
               <w:t>Статус</w:t>
             </w:r>
@@ -172,7 +161,7 @@
           <w:p>
             <w:r>
               <w:rPr>
-                <w:sz w:val="18"/>
+                <w:sz w:val="24"/>
               </w:rPr>
               <w:t>TC-WL-001</w:t>
             </w:r>
@@ -185,7 +174,7 @@
           <w:p>
             <w:r>
               <w:rPr>
-                <w:sz w:val="18"/>
+                <w:sz w:val="24"/>
               </w:rPr>
               <w:t>позитивный</w:t>
             </w:r>
@@ -198,7 +187,7 @@
           <w:p>
             <w:r>
               <w:rPr>
-                <w:sz w:val="18"/>
+                <w:sz w:val="24"/>
               </w:rPr>
               <w:t>High</w:t>
             </w:r>
@@ -211,7 +200,7 @@
           <w:p>
             <w:r>
               <w:rPr>
-                <w:sz w:val="18"/>
+                <w:sz w:val="24"/>
               </w:rPr>
               <w:t>Все поля корректны</w:t>
             </w:r>
@@ -225,7 +214,7 @@
           <w:p>
             <w:r>
               <w:rPr>
-                <w:sz w:val="18"/>
+                <w:sz w:val="24"/>
               </w:rPr>
               <w:t>Passed</w:t>
             </w:r>
@@ -240,7 +229,7 @@
           <w:p>
             <w:r>
               <w:rPr>
-                <w:sz w:val="18"/>
+                <w:sz w:val="24"/>
               </w:rPr>
               <w:t>TC-WL-002</w:t>
             </w:r>
@@ -253,7 +242,7 @@
           <w:p>
             <w:r>
               <w:rPr>
-                <w:sz w:val="18"/>
+                <w:sz w:val="24"/>
               </w:rPr>
               <w:t>граничный</w:t>
             </w:r>
@@ -266,7 +255,7 @@
           <w:p>
             <w:r>
               <w:rPr>
-                <w:sz w:val="18"/>
+                <w:sz w:val="24"/>
               </w:rPr>
               <w:t>High</w:t>
             </w:r>
@@ -279,7 +268,7 @@
           <w:p>
             <w:r>
               <w:rPr>
-                <w:sz w:val="18"/>
+                <w:sz w:val="24"/>
               </w:rPr>
               <w:t>Имя из 1 символа (ниже границы 2)</w:t>
             </w:r>
@@ -293,7 +282,7 @@
           <w:p>
             <w:r>
               <w:rPr>
-                <w:sz w:val="18"/>
+                <w:sz w:val="24"/>
               </w:rPr>
               <w:t>Passed</w:t>
             </w:r>
@@ -308,7 +297,7 @@
           <w:p>
             <w:r>
               <w:rPr>
-                <w:sz w:val="18"/>
+                <w:sz w:val="24"/>
               </w:rPr>
               <w:t>TC-WL-003</w:t>
             </w:r>
@@ -321,7 +310,7 @@
           <w:p>
             <w:r>
               <w:rPr>
-                <w:sz w:val="18"/>
+                <w:sz w:val="24"/>
               </w:rPr>
               <w:t>граничный</w:t>
             </w:r>
@@ -334,7 +323,7 @@
           <w:p>
             <w:r>
               <w:rPr>
-                <w:sz w:val="18"/>
+                <w:sz w:val="24"/>
               </w:rPr>
               <w:t>Medium</w:t>
             </w:r>
@@ -347,7 +336,7 @@
           <w:p>
             <w:r>
               <w:rPr>
-                <w:sz w:val="18"/>
+                <w:sz w:val="24"/>
               </w:rPr>
               <w:t>Имя из 2 символов (нижняя граница)</w:t>
             </w:r>
@@ -361,7 +350,7 @@
           <w:p>
             <w:r>
               <w:rPr>
-                <w:sz w:val="18"/>
+                <w:sz w:val="24"/>
               </w:rPr>
               <w:t>Passed</w:t>
             </w:r>
@@ -376,7 +365,7 @@
           <w:p>
             <w:r>
               <w:rPr>
-                <w:sz w:val="18"/>
+                <w:sz w:val="24"/>
               </w:rPr>
               <w:t>TC-WL-004</w:t>
             </w:r>
@@ -389,7 +378,7 @@
           <w:p>
             <w:r>
               <w:rPr>
-                <w:sz w:val="18"/>
+                <w:sz w:val="24"/>
               </w:rPr>
               <w:t>граничный</w:t>
             </w:r>
@@ -402,7 +391,7 @@
           <w:p>
             <w:r>
               <w:rPr>
-                <w:sz w:val="18"/>
+                <w:sz w:val="24"/>
               </w:rPr>
               <w:t>Medium</w:t>
             </w:r>
@@ -415,7 +404,7 @@
           <w:p>
             <w:r>
               <w:rPr>
-                <w:sz w:val="18"/>
+                <w:sz w:val="24"/>
               </w:rPr>
               <w:t>Имя из 60 символов (верхняя граница)</w:t>
             </w:r>
@@ -429,7 +418,7 @@
           <w:p>
             <w:r>
               <w:rPr>
-                <w:sz w:val="18"/>
+                <w:sz w:val="24"/>
               </w:rPr>
               <w:t>Passed</w:t>
             </w:r>
@@ -444,7 +433,7 @@
           <w:p>
             <w:r>
               <w:rPr>
-                <w:sz w:val="18"/>
+                <w:sz w:val="24"/>
               </w:rPr>
               <w:t>TC-WL-005</w:t>
             </w:r>
@@ -457,7 +446,7 @@
           <w:p>
             <w:r>
               <w:rPr>
-                <w:sz w:val="18"/>
+                <w:sz w:val="24"/>
               </w:rPr>
               <w:t>граничный</w:t>
             </w:r>
@@ -470,7 +459,7 @@
           <w:p>
             <w:r>
               <w:rPr>
-                <w:sz w:val="18"/>
+                <w:sz w:val="24"/>
               </w:rPr>
               <w:t>Medium</w:t>
             </w:r>
@@ -483,7 +472,7 @@
           <w:p>
             <w:r>
               <w:rPr>
-                <w:sz w:val="18"/>
+                <w:sz w:val="24"/>
               </w:rPr>
               <w:t>Имя из 61 символа (выше границы)</w:t>
             </w:r>
@@ -497,7 +486,7 @@
           <w:p>
             <w:r>
               <w:rPr>
-                <w:sz w:val="18"/>
+                <w:sz w:val="24"/>
               </w:rPr>
               <w:t>Passed</w:t>
             </w:r>
@@ -512,7 +501,7 @@
           <w:p>
             <w:r>
               <w:rPr>
-                <w:sz w:val="18"/>
+                <w:sz w:val="24"/>
               </w:rPr>
               <w:t>TC-WL-006</w:t>
             </w:r>
@@ -525,7 +514,7 @@
           <w:p>
             <w:r>
               <w:rPr>
-                <w:sz w:val="18"/>
+                <w:sz w:val="24"/>
               </w:rPr>
               <w:t>негативный</w:t>
             </w:r>
@@ -538,7 +527,7 @@
           <w:p>
             <w:r>
               <w:rPr>
-                <w:sz w:val="18"/>
+                <w:sz w:val="24"/>
               </w:rPr>
               <w:t>High</w:t>
             </w:r>
@@ -551,7 +540,7 @@
           <w:p>
             <w:r>
               <w:rPr>
-                <w:sz w:val="18"/>
+                <w:sz w:val="24"/>
               </w:rPr>
               <w:t>Имя с цифрой</w:t>
             </w:r>
@@ -565,7 +554,7 @@
           <w:p>
             <w:r>
               <w:rPr>
-                <w:sz w:val="18"/>
+                <w:sz w:val="24"/>
               </w:rPr>
               <w:t>Passed</w:t>
             </w:r>
@@ -580,7 +569,7 @@
           <w:p>
             <w:r>
               <w:rPr>
-                <w:sz w:val="18"/>
+                <w:sz w:val="24"/>
               </w:rPr>
               <w:t>TC-WL-007</w:t>
             </w:r>
@@ -593,7 +582,7 @@
           <w:p>
             <w:r>
               <w:rPr>
-                <w:sz w:val="18"/>
+                <w:sz w:val="24"/>
               </w:rPr>
               <w:t>позитивный</w:t>
             </w:r>
@@ -606,7 +595,7 @@
           <w:p>
             <w:r>
               <w:rPr>
-                <w:sz w:val="18"/>
+                <w:sz w:val="24"/>
               </w:rPr>
               <w:t>Low</w:t>
             </w:r>
@@ -619,7 +608,7 @@
           <w:p>
             <w:r>
               <w:rPr>
-                <w:sz w:val="18"/>
+                <w:sz w:val="24"/>
               </w:rPr>
               <w:t>Имя с апострофом и дефисом</w:t>
             </w:r>
@@ -633,7 +622,7 @@
           <w:p>
             <w:r>
               <w:rPr>
-                <w:sz w:val="18"/>
+                <w:sz w:val="24"/>
               </w:rPr>
               <w:t>Passed</w:t>
             </w:r>
@@ -648,7 +637,7 @@
           <w:p>
             <w:r>
               <w:rPr>
-                <w:sz w:val="18"/>
+                <w:sz w:val="24"/>
               </w:rPr>
               <w:t>TC-WL-008</w:t>
             </w:r>
@@ -661,7 +650,7 @@
           <w:p>
             <w:r>
               <w:rPr>
-                <w:sz w:val="18"/>
+                <w:sz w:val="24"/>
               </w:rPr>
               <w:t>негативный</w:t>
             </w:r>
@@ -674,7 +663,7 @@
           <w:p>
             <w:r>
               <w:rPr>
-                <w:sz w:val="18"/>
+                <w:sz w:val="24"/>
               </w:rPr>
               <w:t>High</w:t>
             </w:r>
@@ -687,7 +676,7 @@
           <w:p>
             <w:r>
               <w:rPr>
-                <w:sz w:val="18"/>
+                <w:sz w:val="24"/>
               </w:rPr>
               <w:t>Email без символа @</w:t>
             </w:r>
@@ -701,7 +690,7 @@
           <w:p>
             <w:r>
               <w:rPr>
-                <w:sz w:val="18"/>
+                <w:sz w:val="24"/>
               </w:rPr>
               <w:t>Passed</w:t>
             </w:r>
@@ -716,7 +705,7 @@
           <w:p>
             <w:r>
               <w:rPr>
-                <w:sz w:val="18"/>
+                <w:sz w:val="24"/>
               </w:rPr>
               <w:t>TC-WL-009</w:t>
             </w:r>
@@ -729,7 +718,7 @@
           <w:p>
             <w:r>
               <w:rPr>
-                <w:sz w:val="18"/>
+                <w:sz w:val="24"/>
               </w:rPr>
               <w:t>негативный</w:t>
             </w:r>
@@ -742,7 +731,7 @@
           <w:p>
             <w:r>
               <w:rPr>
-                <w:sz w:val="18"/>
+                <w:sz w:val="24"/>
               </w:rPr>
               <w:t>Medium</w:t>
             </w:r>
@@ -755,7 +744,7 @@
           <w:p>
             <w:r>
               <w:rPr>
-                <w:sz w:val="18"/>
+                <w:sz w:val="24"/>
               </w:rPr>
               <w:t>Email без домена верхнего уровня</w:t>
             </w:r>
@@ -769,7 +758,7 @@
           <w:p>
             <w:r>
               <w:rPr>
-                <w:sz w:val="18"/>
+                <w:sz w:val="24"/>
               </w:rPr>
               <w:t>Passed</w:t>
             </w:r>
@@ -784,7 +773,7 @@
           <w:p>
             <w:r>
               <w:rPr>
-                <w:sz w:val="18"/>
+                <w:sz w:val="24"/>
               </w:rPr>
               <w:t>TC-WL-010</w:t>
             </w:r>
@@ -797,7 +786,7 @@
           <w:p>
             <w:r>
               <w:rPr>
-                <w:sz w:val="18"/>
+                <w:sz w:val="24"/>
               </w:rPr>
               <w:t>граничный</w:t>
             </w:r>
@@ -810,7 +799,7 @@
           <w:p>
             <w:r>
               <w:rPr>
-                <w:sz w:val="18"/>
+                <w:sz w:val="24"/>
               </w:rPr>
               <w:t>Medium</w:t>
             </w:r>
@@ -823,7 +812,7 @@
           <w:p>
             <w:r>
               <w:rPr>
-                <w:sz w:val="18"/>
+                <w:sz w:val="24"/>
               </w:rPr>
               <w:t>Email длиной 120 символов</w:t>
             </w:r>
@@ -837,7 +826,7 @@
           <w:p>
             <w:r>
               <w:rPr>
-                <w:sz w:val="18"/>
+                <w:sz w:val="24"/>
               </w:rPr>
               <w:t>Passed</w:t>
             </w:r>
@@ -852,7 +841,7 @@
           <w:p>
             <w:r>
               <w:rPr>
-                <w:sz w:val="18"/>
+                <w:sz w:val="24"/>
               </w:rPr>
               <w:t>TC-WL-011</w:t>
             </w:r>
@@ -865,7 +854,7 @@
           <w:p>
             <w:r>
               <w:rPr>
-                <w:sz w:val="18"/>
+                <w:sz w:val="24"/>
               </w:rPr>
               <w:t>граничный</w:t>
             </w:r>
@@ -878,7 +867,7 @@
           <w:p>
             <w:r>
               <w:rPr>
-                <w:sz w:val="18"/>
+                <w:sz w:val="24"/>
               </w:rPr>
               <w:t>Medium</w:t>
             </w:r>
@@ -891,7 +880,7 @@
           <w:p>
             <w:r>
               <w:rPr>
-                <w:sz w:val="18"/>
+                <w:sz w:val="24"/>
               </w:rPr>
               <w:t>Email длиной 121 символ</w:t>
             </w:r>
@@ -905,7 +894,7 @@
           <w:p>
             <w:r>
               <w:rPr>
-                <w:sz w:val="18"/>
+                <w:sz w:val="24"/>
               </w:rPr>
               <w:t>Passed</w:t>
             </w:r>
@@ -920,7 +909,7 @@
           <w:p>
             <w:r>
               <w:rPr>
-                <w:sz w:val="18"/>
+                <w:sz w:val="24"/>
               </w:rPr>
               <w:t>TC-WL-012</w:t>
             </w:r>
@@ -933,7 +922,7 @@
           <w:p>
             <w:r>
               <w:rPr>
-                <w:sz w:val="18"/>
+                <w:sz w:val="24"/>
               </w:rPr>
               <w:t>граничный</w:t>
             </w:r>
@@ -946,7 +935,7 @@
           <w:p>
             <w:r>
               <w:rPr>
-                <w:sz w:val="18"/>
+                <w:sz w:val="24"/>
               </w:rPr>
               <w:t>High</w:t>
             </w:r>
@@ -959,7 +948,7 @@
           <w:p>
             <w:r>
               <w:rPr>
-                <w:sz w:val="18"/>
+                <w:sz w:val="24"/>
               </w:rPr>
               <w:t>Размер команды 0 (нижняя граница)</w:t>
             </w:r>
@@ -973,7 +962,7 @@
           <w:p>
             <w:r>
               <w:rPr>
-                <w:sz w:val="18"/>
+                <w:sz w:val="24"/>
               </w:rPr>
               <w:t>Passed</w:t>
             </w:r>
@@ -988,7 +977,7 @@
           <w:p>
             <w:r>
               <w:rPr>
-                <w:sz w:val="18"/>
+                <w:sz w:val="24"/>
               </w:rPr>
               <w:t>TC-WL-013</w:t>
             </w:r>
@@ -1001,7 +990,7 @@
           <w:p>
             <w:r>
               <w:rPr>
-                <w:sz w:val="18"/>
+                <w:sz w:val="24"/>
               </w:rPr>
               <w:t>граничный</w:t>
             </w:r>
@@ -1014,7 +1003,7 @@
           <w:p>
             <w:r>
               <w:rPr>
-                <w:sz w:val="18"/>
+                <w:sz w:val="24"/>
               </w:rPr>
               <w:t>High</w:t>
             </w:r>
@@ -1027,7 +1016,7 @@
           <w:p>
             <w:r>
               <w:rPr>
-                <w:sz w:val="18"/>
+                <w:sz w:val="24"/>
               </w:rPr>
               <w:t>Размер команды 500 (верхняя граница)</w:t>
             </w:r>
@@ -1041,7 +1030,7 @@
           <w:p>
             <w:r>
               <w:rPr>
-                <w:sz w:val="18"/>
+                <w:sz w:val="24"/>
               </w:rPr>
               <w:t>Passed</w:t>
             </w:r>
@@ -1056,7 +1045,7 @@
           <w:p>
             <w:r>
               <w:rPr>
-                <w:sz w:val="18"/>
+                <w:sz w:val="24"/>
               </w:rPr>
               <w:t>TC-WL-014</w:t>
             </w:r>
@@ -1069,7 +1058,7 @@
           <w:p>
             <w:r>
               <w:rPr>
-                <w:sz w:val="18"/>
+                <w:sz w:val="24"/>
               </w:rPr>
               <w:t>граничный</w:t>
             </w:r>
@@ -1082,7 +1071,7 @@
           <w:p>
             <w:r>
               <w:rPr>
-                <w:sz w:val="18"/>
+                <w:sz w:val="24"/>
               </w:rPr>
               <w:t>High</w:t>
             </w:r>
@@ -1095,7 +1084,7 @@
           <w:p>
             <w:r>
               <w:rPr>
-                <w:sz w:val="18"/>
+                <w:sz w:val="24"/>
               </w:rPr>
               <w:t>Размер команды 501 (выше границы)</w:t>
             </w:r>
@@ -1109,7 +1098,7 @@
           <w:p>
             <w:r>
               <w:rPr>
-                <w:sz w:val="18"/>
+                <w:sz w:val="24"/>
               </w:rPr>
               <w:t>Passed</w:t>
             </w:r>
@@ -1124,7 +1113,7 @@
           <w:p>
             <w:r>
               <w:rPr>
-                <w:sz w:val="18"/>
+                <w:sz w:val="24"/>
               </w:rPr>
               <w:t>TC-WL-015</w:t>
             </w:r>
@@ -1137,7 +1126,7 @@
           <w:p>
             <w:r>
               <w:rPr>
-                <w:sz w:val="18"/>
+                <w:sz w:val="24"/>
               </w:rPr>
               <w:t>граничный</w:t>
             </w:r>
@@ -1150,7 +1139,7 @@
           <w:p>
             <w:r>
               <w:rPr>
-                <w:sz w:val="18"/>
+                <w:sz w:val="24"/>
               </w:rPr>
               <w:t>Medium</w:t>
             </w:r>
@@ -1163,7 +1152,7 @@
           <w:p>
             <w:r>
               <w:rPr>
-                <w:sz w:val="18"/>
+                <w:sz w:val="24"/>
               </w:rPr>
               <w:t>Размер команды -1 (ниже границы)</w:t>
             </w:r>
@@ -1177,7 +1166,7 @@
           <w:p>
             <w:r>
               <w:rPr>
-                <w:sz w:val="18"/>
+                <w:sz w:val="24"/>
               </w:rPr>
               <w:t>Passed</w:t>
             </w:r>
@@ -1192,7 +1181,7 @@
           <w:p>
             <w:r>
               <w:rPr>
-                <w:sz w:val="18"/>
+                <w:sz w:val="24"/>
               </w:rPr>
               <w:t>TC-WL-016</w:t>
             </w:r>
@@ -1205,7 +1194,7 @@
           <w:p>
             <w:r>
               <w:rPr>
-                <w:sz w:val="18"/>
+                <w:sz w:val="24"/>
               </w:rPr>
               <w:t>негативный</w:t>
             </w:r>
@@ -1218,7 +1207,7 @@
           <w:p>
             <w:r>
               <w:rPr>
-                <w:sz w:val="18"/>
+                <w:sz w:val="24"/>
               </w:rPr>
               <w:t>Medium</w:t>
             </w:r>
@@ -1231,7 +1220,7 @@
           <w:p>
             <w:r>
               <w:rPr>
-                <w:sz w:val="18"/>
+                <w:sz w:val="24"/>
               </w:rPr>
               <w:t>Размер команды — не число</w:t>
             </w:r>
@@ -1245,7 +1234,7 @@
           <w:p>
             <w:r>
               <w:rPr>
-                <w:sz w:val="18"/>
+                <w:sz w:val="24"/>
               </w:rPr>
               <w:t>Passed</w:t>
             </w:r>
@@ -1260,7 +1249,7 @@
           <w:p>
             <w:r>
               <w:rPr>
-                <w:sz w:val="18"/>
+                <w:sz w:val="24"/>
               </w:rPr>
               <w:t>TC-WL-017</w:t>
             </w:r>
@@ -1273,7 +1262,7 @@
           <w:p>
             <w:r>
               <w:rPr>
-                <w:sz w:val="18"/>
+                <w:sz w:val="24"/>
               </w:rPr>
               <w:t>позитивный</w:t>
             </w:r>
@@ -1286,7 +1275,7 @@
           <w:p>
             <w:r>
               <w:rPr>
-                <w:sz w:val="18"/>
+                <w:sz w:val="24"/>
               </w:rPr>
               <w:t>Low</w:t>
             </w:r>
@@ -1299,7 +1288,7 @@
           <w:p>
             <w:r>
               <w:rPr>
-                <w:sz w:val="18"/>
+                <w:sz w:val="24"/>
               </w:rPr>
               <w:t>Размер команды строкой "12"</w:t>
             </w:r>
@@ -1313,7 +1302,7 @@
           <w:p>
             <w:r>
               <w:rPr>
-                <w:sz w:val="18"/>
+                <w:sz w:val="24"/>
               </w:rPr>
               <w:t>Passed</w:t>
             </w:r>
@@ -1328,7 +1317,7 @@
           <w:p>
             <w:r>
               <w:rPr>
-                <w:sz w:val="18"/>
+                <w:sz w:val="24"/>
               </w:rPr>
               <w:t>TC-WL-018</w:t>
             </w:r>
@@ -1341,7 +1330,7 @@
           <w:p>
             <w:r>
               <w:rPr>
-                <w:sz w:val="18"/>
+                <w:sz w:val="24"/>
               </w:rPr>
               <w:t>негативный</w:t>
             </w:r>
@@ -1354,7 +1343,7 @@
           <w:p>
             <w:r>
               <w:rPr>
-                <w:sz w:val="18"/>
+                <w:sz w:val="24"/>
               </w:rPr>
               <w:t>High</w:t>
             </w:r>
@@ -1367,7 +1356,7 @@
           <w:p>
             <w:r>
               <w:rPr>
-                <w:sz w:val="18"/>
+                <w:sz w:val="24"/>
               </w:rPr>
               <w:t>Нотация вне списка</w:t>
             </w:r>
@@ -1381,7 +1370,7 @@
           <w:p>
             <w:r>
               <w:rPr>
-                <w:sz w:val="18"/>
+                <w:sz w:val="24"/>
               </w:rPr>
               <w:t>Passed</w:t>
             </w:r>
@@ -1396,7 +1385,7 @@
           <w:p>
             <w:r>
               <w:rPr>
-                <w:sz w:val="18"/>
+                <w:sz w:val="24"/>
               </w:rPr>
               <w:t>TC-WL-019</w:t>
             </w:r>
@@ -1409,7 +1398,7 @@
           <w:p>
             <w:r>
               <w:rPr>
-                <w:sz w:val="18"/>
+                <w:sz w:val="24"/>
               </w:rPr>
               <w:t>граничный</w:t>
             </w:r>
@@ -1422,7 +1411,7 @@
           <w:p>
             <w:r>
               <w:rPr>
-                <w:sz w:val="18"/>
+                <w:sz w:val="24"/>
               </w:rPr>
               <w:t>Low</w:t>
             </w:r>
@@ -1435,7 +1424,7 @@
           <w:p>
             <w:r>
               <w:rPr>
-                <w:sz w:val="18"/>
+                <w:sz w:val="24"/>
               </w:rPr>
               <w:t>Комментарий 500 символов</w:t>
             </w:r>
@@ -1449,7 +1438,7 @@
           <w:p>
             <w:r>
               <w:rPr>
-                <w:sz w:val="18"/>
+                <w:sz w:val="24"/>
               </w:rPr>
               <w:t>Passed</w:t>
             </w:r>
@@ -1464,7 +1453,7 @@
           <w:p>
             <w:r>
               <w:rPr>
-                <w:sz w:val="18"/>
+                <w:sz w:val="24"/>
               </w:rPr>
               <w:t>TC-WL-020</w:t>
             </w:r>
@@ -1477,7 +1466,7 @@
           <w:p>
             <w:r>
               <w:rPr>
-                <w:sz w:val="18"/>
+                <w:sz w:val="24"/>
               </w:rPr>
               <w:t>граничный</w:t>
             </w:r>
@@ -1490,7 +1479,7 @@
           <w:p>
             <w:r>
               <w:rPr>
-                <w:sz w:val="18"/>
+                <w:sz w:val="24"/>
               </w:rPr>
               <w:t>Low</w:t>
             </w:r>
@@ -1503,7 +1492,7 @@
           <w:p>
             <w:r>
               <w:rPr>
-                <w:sz w:val="18"/>
+                <w:sz w:val="24"/>
               </w:rPr>
               <w:t>Комментарий 501 символ</w:t>
             </w:r>
@@ -1517,7 +1506,7 @@
           <w:p>
             <w:r>
               <w:rPr>
-                <w:sz w:val="18"/>
+                <w:sz w:val="24"/>
               </w:rPr>
               <w:t>Passed</w:t>
             </w:r>
@@ -1532,7 +1521,7 @@
           <w:p>
             <w:r>
               <w:rPr>
-                <w:sz w:val="18"/>
+                <w:sz w:val="24"/>
               </w:rPr>
               <w:t>TC-WL-021</w:t>
             </w:r>
@@ -1545,7 +1534,7 @@
           <w:p>
             <w:r>
               <w:rPr>
-                <w:sz w:val="18"/>
+                <w:sz w:val="24"/>
               </w:rPr>
               <w:t>негативный</w:t>
             </w:r>
@@ -1558,7 +1547,7 @@
           <w:p>
             <w:r>
               <w:rPr>
-                <w:sz w:val="18"/>
+                <w:sz w:val="24"/>
               </w:rPr>
               <w:t>High</w:t>
             </w:r>
@@ -1571,7 +1560,7 @@
           <w:p>
             <w:r>
               <w:rPr>
-                <w:sz w:val="18"/>
+                <w:sz w:val="24"/>
               </w:rPr>
               <w:t>Согласие на обработку не дано</w:t>
             </w:r>
@@ -1585,7 +1574,7 @@
           <w:p>
             <w:r>
               <w:rPr>
-                <w:sz w:val="18"/>
+                <w:sz w:val="24"/>
               </w:rPr>
               <w:t>Passed</w:t>
             </w:r>
@@ -1600,7 +1589,7 @@
           <w:p>
             <w:r>
               <w:rPr>
-                <w:sz w:val="18"/>
+                <w:sz w:val="24"/>
               </w:rPr>
               <w:t>TC-WL-022</w:t>
             </w:r>
@@ -1613,7 +1602,7 @@
           <w:p>
             <w:r>
               <w:rPr>
-                <w:sz w:val="18"/>
+                <w:sz w:val="24"/>
               </w:rPr>
               <w:t>негативный</w:t>
             </w:r>
@@ -1626,7 +1615,7 @@
           <w:p>
             <w:r>
               <w:rPr>
-                <w:sz w:val="18"/>
+                <w:sz w:val="24"/>
               </w:rPr>
               <w:t>High</w:t>
             </w:r>
@@ -1639,7 +1628,7 @@
           <w:p>
             <w:r>
               <w:rPr>
-                <w:sz w:val="18"/>
+                <w:sz w:val="24"/>
               </w:rPr>
               <w:t>Пустая форма</w:t>
             </w:r>
@@ -1653,7 +1642,7 @@
           <w:p>
             <w:r>
               <w:rPr>
-                <w:sz w:val="18"/>
+                <w:sz w:val="24"/>
               </w:rPr>
               <w:t>Passed</w:t>
             </w:r>
@@ -7391,8 +7380,9 @@
     <w:qFormat/>
     <w:rsid w:val="00FC693F"/>
     <w:rPr>
-      <w:rFonts w:ascii="Calibri" w:hAnsi="Calibri"/>
-      <w:sz w:val="21"/>
+      <w:rFonts w:ascii="Times New Roman" w:hAnsi="Times New Roman" w:eastAsia="Times New Roman"/>
+      <w:color w:val="000000"/>
+      <w:sz w:val="28"/>
     </w:rPr>
   </w:style>
   <w:style w:type="paragraph" w:styleId="Header">
@@ -7454,11 +7444,11 @@
       <w:outlineLvl w:val="0"/>
     </w:pPr>
     <w:rPr>
-      <w:rFonts w:asciiTheme="majorHAnsi" w:eastAsiaTheme="majorEastAsia" w:hAnsiTheme="majorHAnsi" w:cstheme="majorBidi"/>
+      <w:rFonts w:ascii="Times New Roman" w:hAnsi="Times New Roman" w:eastAsia="Times New Roman"/>
       <w:b/>
       <w:bCs/>
-      <w:color w:val="365F91" w:themeColor="accent1" w:themeShade="BF"/>
-      <w:sz w:val="28"/>
+      <w:color w:val="000000"/>
+      <w:sz w:val="32"/>
       <w:szCs w:val="28"/>
     </w:rPr>
   </w:style>
@@ -7478,11 +7468,11 @@
       <w:outlineLvl w:val="1"/>
     </w:pPr>
     <w:rPr>
-      <w:rFonts w:asciiTheme="majorHAnsi" w:eastAsiaTheme="majorEastAsia" w:hAnsiTheme="majorHAnsi" w:cstheme="majorBidi"/>
+      <w:rFonts w:ascii="Times New Roman" w:hAnsi="Times New Roman" w:eastAsia="Times New Roman"/>
       <w:b/>
       <w:bCs/>
-      <w:color w:val="4F81BD" w:themeColor="accent1"/>
-      <w:sz w:val="26"/>
+      <w:color w:val="000000"/>
+      <w:sz w:val="30"/>
       <w:szCs w:val="26"/>
     </w:rPr>
   </w:style>
@@ -7502,10 +7492,11 @@
       <w:outlineLvl w:val="2"/>
     </w:pPr>
     <w:rPr>
-      <w:rFonts w:asciiTheme="majorHAnsi" w:eastAsiaTheme="majorEastAsia" w:hAnsiTheme="majorHAnsi" w:cstheme="majorBidi"/>
+      <w:rFonts w:ascii="Times New Roman" w:hAnsi="Times New Roman" w:eastAsia="Times New Roman"/>
       <w:b/>
       <w:bCs/>
-      <w:color w:val="4F81BD" w:themeColor="accent1"/>
+      <w:color w:val="000000"/>
+      <w:sz w:val="28"/>
     </w:rPr>
   </w:style>
   <w:style w:type="paragraph" w:styleId="Heading4">

</xml_diff>

<commit_message>
docs(testing-course): complete use case with traceability in labs 1-3
</commit_message>
<xml_diff>
--- a/testing-course/documents/01-test-cases.docx
+++ b/testing-course/documents/01-test-cases.docx
@@ -12,17 +12,511 @@
         <w:pStyle w:val="Heading1"/>
       </w:pPr>
       <w:r>
-        <w:t>1. Область и подход</w:t>
+        <w:t>1. Use Case и требования</w:t>
       </w:r>
     </w:p>
     <w:p>
       <w:r>
-        <w:t>Use case: пользователь оставляет заявку в листе ожидания. Поля: имя (2–60 букв, пробел, дефис, апостроф), email (формат, до 120 символов), нотация (из 6), размер команды (целое 0–500), комментарий (до 500), согласие (обязательно). Применены эквивалентное разбиение и анализ граничных значений. Базовый корректный набор: name="Анна Иванова", email="anna@example.com", notation="idef0", team=5, comment="", consent=true.</w:t>
+        <w:t>Тестируется вариант использования UC-01 (подробное описание ниже). Применены эквивалентное разбиение и анализ граничных значений. Базовый корректный набор данных: name="Анна Иванова", email="anna@example.com", notation="idef0", team=5, comment="", consent=true. Общие предусловия тест-кейсов: проект запущен (npm start, http://localhost:5173), форма открыта. Общие постусловия: состояние системы не меняется.</w:t>
       </w:r>
     </w:p>
+    <w:tbl>
+      <w:tblPr>
+        <w:tblStyle w:val="TableGrid"/>
+        <w:tblW w:type="auto" w:w="0"/>
+        <w:tblLook w:firstColumn="1" w:firstRow="1" w:lastColumn="0" w:lastRow="0" w:noHBand="0" w:noVBand="1" w:val="04A0"/>
+      </w:tblPr>
+      <w:tblGrid>
+        <w:gridCol w:w="5100"/>
+        <w:gridCol w:w="5100"/>
+      </w:tblGrid>
+      <w:tr>
+        <w:tc>
+          <w:tcPr>
+            <w:tcW w:type="dxa" w:w="2381"/>
+            <w:shd w:val="clear" w:fill="F2F2F2"/>
+          </w:tcPr>
+          <w:p>
+            <w:r>
+              <w:rPr>
+                <w:b/>
+                <w:sz w:val="24"/>
+              </w:rPr>
+              <w:t>Название</w:t>
+            </w:r>
+          </w:p>
+        </w:tc>
+        <w:tc>
+          <w:tcPr>
+            <w:tcW w:type="dxa" w:w="7370"/>
+          </w:tcPr>
+          <w:p>
+            <w:r>
+              <w:rPr>
+                <w:sz w:val="24"/>
+              </w:rPr>
+              <w:t>UC-01. Подать заявку в лист ожидания (форма «Записаться в бету», главная страница DSLKit)</w:t>
+            </w:r>
+          </w:p>
+        </w:tc>
+      </w:tr>
+      <w:tr>
+        <w:tc>
+          <w:tcPr>
+            <w:tcW w:type="dxa" w:w="2381"/>
+            <w:shd w:val="clear" w:fill="F2F2F2"/>
+          </w:tcPr>
+          <w:p>
+            <w:r>
+              <w:rPr>
+                <w:b/>
+                <w:sz w:val="24"/>
+              </w:rPr>
+              <w:t>Идентификатор, версия, приоритет</w:t>
+            </w:r>
+          </w:p>
+        </w:tc>
+        <w:tc>
+          <w:tcPr>
+            <w:tcW w:type="dxa" w:w="7370"/>
+          </w:tcPr>
+          <w:p>
+            <w:r>
+              <w:rPr>
+                <w:sz w:val="24"/>
+              </w:rPr>
+              <w:t>UC-01, версия 1.0, приоритет High: единственный способ оставить контакты для беты.</w:t>
+            </w:r>
+          </w:p>
+        </w:tc>
+      </w:tr>
+      <w:tr>
+        <w:tc>
+          <w:tcPr>
+            <w:tcW w:type="dxa" w:w="2381"/>
+            <w:shd w:val="clear" w:fill="F2F2F2"/>
+          </w:tcPr>
+          <w:p>
+            <w:r>
+              <w:rPr>
+                <w:b/>
+                <w:sz w:val="24"/>
+              </w:rPr>
+              <w:t>Краткое описание цели и задачи</w:t>
+            </w:r>
+          </w:p>
+        </w:tc>
+        <w:tc>
+          <w:tcPr>
+            <w:tcW w:type="dxa" w:w="7370"/>
+          </w:tcPr>
+          <w:p>
+            <w:r>
+              <w:rPr>
+                <w:sz w:val="24"/>
+              </w:rPr>
+              <w:t>Посетитель оставляет контактные данные и сведения о проекте, чтобы команда DSLKit могла прислать ему приглашение в бету после запуска. Задача формы: принять только корректную заявку и сохранить её.</w:t>
+            </w:r>
+          </w:p>
+        </w:tc>
+      </w:tr>
+      <w:tr>
+        <w:tc>
+          <w:tcPr>
+            <w:tcW w:type="dxa" w:w="2381"/>
+            <w:shd w:val="clear" w:fill="F2F2F2"/>
+          </w:tcPr>
+          <w:p>
+            <w:r>
+              <w:rPr>
+                <w:b/>
+                <w:sz w:val="24"/>
+              </w:rPr>
+              <w:t>Связанные требования</w:t>
+            </w:r>
+          </w:p>
+        </w:tc>
+        <w:tc>
+          <w:tcPr>
+            <w:tcW w:type="dxa" w:w="7370"/>
+          </w:tcPr>
+          <w:p>
+            <w:r>
+              <w:rPr>
+                <w:sz w:val="24"/>
+              </w:rPr>
+              <w:t>R4 «Форма заявки и валидация» (лаб. 3, раздел 1). Реализация: site/index.html (форма #waitlist-form), site/js/components/waitlist-form.js, site/js/utils/validation.js, site/thanks.html и site/en/thanks.html.</w:t>
+            </w:r>
+          </w:p>
+        </w:tc>
+      </w:tr>
+      <w:tr>
+        <w:tc>
+          <w:tcPr>
+            <w:tcW w:type="dxa" w:w="2381"/>
+            <w:shd w:val="clear" w:fill="F2F2F2"/>
+          </w:tcPr>
+          <w:p>
+            <w:r>
+              <w:rPr>
+                <w:b/>
+                <w:sz w:val="24"/>
+              </w:rPr>
+              <w:t>Подзадачи</w:t>
+            </w:r>
+          </w:p>
+        </w:tc>
+        <w:tc>
+          <w:tcPr>
+            <w:tcW w:type="dxa" w:w="7370"/>
+          </w:tcPr>
+          <w:p>
+            <w:r>
+              <w:rPr>
+                <w:sz w:val="24"/>
+              </w:rPr>
+              <w:t>UC-01.1 Показ формы и подсказок к полям (шаги 1–6).</w:t>
+              <w:br/>
+              <w:t>UC-01.2 Очистка и проверка значений по П1–П6 (шаги 8–9).</w:t>
+              <w:br/>
+              <w:t>UC-01.3 Показ ошибок, фокус и повторная проверка (A1, A2).</w:t>
+              <w:br/>
+              <w:t>UC-01.4 Сохранение заявки в LocalStorage (шаг 10, A4, E1).</w:t>
+              <w:br/>
+              <w:t>UC-01.5 Переход на страницу благодарности (шаг 11).</w:t>
+            </w:r>
+          </w:p>
+        </w:tc>
+      </w:tr>
+      <w:tr>
+        <w:tc>
+          <w:tcPr>
+            <w:tcW w:type="dxa" w:w="2381"/>
+            <w:shd w:val="clear" w:fill="F2F2F2"/>
+          </w:tcPr>
+          <w:p>
+            <w:r>
+              <w:rPr>
+                <w:b/>
+                <w:sz w:val="24"/>
+              </w:rPr>
+              <w:t>Связанные задачи и use case</w:t>
+            </w:r>
+          </w:p>
+        </w:tc>
+        <w:tc>
+          <w:tcPr>
+            <w:tcW w:type="dxa" w:w="7370"/>
+          </w:tcPr>
+          <w:p>
+            <w:r>
+              <w:rPr>
+                <w:sz w:val="24"/>
+              </w:rPr>
+              <w:t>UC-00 «Прочитать политику конфиденциальности»: ссылка в тексте согласия ведёт на privacy.html (шаг 6).</w:t>
+              <w:br/>
+              <w:t>Лаб. 2: тест-кейсы TC-WL-001…022.</w:t>
+              <w:br/>
+              <w:t>Лаб. 3: проверки SM-07, CP-35, CP-36.</w:t>
+              <w:br/>
+              <w:t>Дефекты реализации: D-1 (повторные заявки), D-2 (потеря заявки при сбое хранилища).</w:t>
+            </w:r>
+          </w:p>
+        </w:tc>
+      </w:tr>
+      <w:tr>
+        <w:tc>
+          <w:tcPr>
+            <w:tcW w:type="dxa" w:w="2381"/>
+            <w:shd w:val="clear" w:fill="F2F2F2"/>
+          </w:tcPr>
+          <w:p>
+            <w:r>
+              <w:rPr>
+                <w:b/>
+                <w:sz w:val="24"/>
+              </w:rPr>
+              <w:t>Соответствие STAR</w:t>
+            </w:r>
+          </w:p>
+        </w:tc>
+        <w:tc>
+          <w:tcPr>
+            <w:tcW w:type="dxa" w:w="7370"/>
+          </w:tcPr>
+          <w:p>
+            <w:r>
+              <w:rPr>
+                <w:sz w:val="24"/>
+              </w:rPr>
+              <w:t>Situation (ситуация): предусловия 1–2.</w:t>
+              <w:br/>
+              <w:t>Task (задача): краткое описание цели и задачи.</w:t>
+              <w:br/>
+              <w:t>Action (действия): основной поток, шаги 1–11, и альтернативные потоки A1–A4.</w:t>
+              <w:br/>
+              <w:t>Result (результат): постусловия и исключительные ситуации E1–E2.</w:t>
+            </w:r>
+          </w:p>
+        </w:tc>
+      </w:tr>
+      <w:tr>
+        <w:tc>
+          <w:tcPr>
+            <w:tcW w:type="dxa" w:w="2381"/>
+            <w:shd w:val="clear" w:fill="F2F2F2"/>
+          </w:tcPr>
+          <w:p>
+            <w:r>
+              <w:rPr>
+                <w:b/>
+                <w:sz w:val="24"/>
+              </w:rPr>
+              <w:t>Основной актор</w:t>
+            </w:r>
+          </w:p>
+        </w:tc>
+        <w:tc>
+          <w:tcPr>
+            <w:tcW w:type="dxa" w:w="7370"/>
+          </w:tcPr>
+          <w:p>
+            <w:r>
+              <w:rPr>
+                <w:sz w:val="24"/>
+              </w:rPr>
+              <w:t>Посетитель сайта (неавторизованный пользователь). Внешних систем в сценарии нет.</w:t>
+            </w:r>
+          </w:p>
+        </w:tc>
+      </w:tr>
+      <w:tr>
+        <w:tc>
+          <w:tcPr>
+            <w:tcW w:type="dxa" w:w="2381"/>
+            <w:shd w:val="clear" w:fill="F2F2F2"/>
+          </w:tcPr>
+          <w:p>
+            <w:r>
+              <w:rPr>
+                <w:b/>
+                <w:sz w:val="24"/>
+              </w:rPr>
+              <w:t>Предусловия</w:t>
+            </w:r>
+          </w:p>
+        </w:tc>
+        <w:tc>
+          <w:tcPr>
+            <w:tcW w:type="dxa" w:w="7370"/>
+          </w:tcPr>
+          <w:p>
+            <w:r>
+              <w:rPr>
+                <w:sz w:val="24"/>
+              </w:rPr>
+              <w:t>1. Открыта главная страница сайта (русская или английская версия).</w:t>
+              <w:br/>
+              <w:t>2. Форма «Записаться в бету» отображается, все поля пусты, поле «Размер команды» содержит 0.</w:t>
+            </w:r>
+          </w:p>
+        </w:tc>
+      </w:tr>
+      <w:tr>
+        <w:tc>
+          <w:tcPr>
+            <w:tcW w:type="dxa" w:w="2381"/>
+            <w:shd w:val="clear" w:fill="F2F2F2"/>
+          </w:tcPr>
+          <w:p>
+            <w:r>
+              <w:rPr>
+                <w:b/>
+                <w:sz w:val="24"/>
+              </w:rPr>
+              <w:t>Основной поток событий</w:t>
+            </w:r>
+          </w:p>
+        </w:tc>
+        <w:tc>
+          <w:tcPr>
+            <w:tcW w:type="dxa" w:w="7370"/>
+          </w:tcPr>
+          <w:p>
+            <w:r>
+              <w:rPr>
+                <w:sz w:val="24"/>
+              </w:rPr>
+              <w:t>1. Посетитель вводит имя в поле «Имя».</w:t>
+              <w:br/>
+              <w:t>2. Посетитель вводит адрес в поле «Электронная почта».</w:t>
+              <w:br/>
+              <w:t>3. Посетитель выбирает значение в списке «Нотация».</w:t>
+              <w:br/>
+              <w:t>4. Посетитель вводит целое число в поле «Размер команды».</w:t>
+              <w:br/>
+              <w:t>5. Посетитель при желании вводит текст в поле «Комментарий».</w:t>
+              <w:br/>
+              <w:t>6. Посетитель отмечает флажок согласия.</w:t>
+              <w:br/>
+              <w:t>7. Посетитель нажимает кнопку «Отправить».</w:t>
+              <w:br/>
+              <w:t>8. Система удаляет пробелы по краям у имени, почты и комментария.</w:t>
+              <w:br/>
+              <w:t>9. Система проверяет все поля по правилам П1–П6 (ниже).</w:t>
+              <w:br/>
+              <w:t>10. Система сохраняет заявку в LocalStorage браузера под ключом dslkit.waitlist: имя, почта, нотация, размер команды, комментарий, время создания.</w:t>
+              <w:br/>
+              <w:t>11. Система открывает страницу благодарности thanks.html.</w:t>
+            </w:r>
+          </w:p>
+        </w:tc>
+      </w:tr>
+      <w:tr>
+        <w:tc>
+          <w:tcPr>
+            <w:tcW w:type="dxa" w:w="2381"/>
+            <w:shd w:val="clear" w:fill="F2F2F2"/>
+          </w:tcPr>
+          <w:p>
+            <w:r>
+              <w:rPr>
+                <w:b/>
+                <w:sz w:val="24"/>
+              </w:rPr>
+              <w:t>Правила проверки полей</w:t>
+            </w:r>
+          </w:p>
+        </w:tc>
+        <w:tc>
+          <w:tcPr>
+            <w:tcW w:type="dxa" w:w="7370"/>
+          </w:tcPr>
+          <w:p>
+            <w:r>
+              <w:rPr>
+                <w:sz w:val="24"/>
+              </w:rPr>
+              <w:t>П1. Имя: 2–60 символов, начинается с буквы, далее буквы, пробел, дефис, апостроф.</w:t>
+              <w:br/>
+              <w:t>П2. Почта: вид name@domain.zone, домен верхнего уровня не короче двух символов, длина не более 120.</w:t>
+              <w:br/>
+              <w:t>П3. Нотация: одно из значений idef0, dfd, erd, bpmn, uml, petri.</w:t>
+              <w:br/>
+              <w:t>П4. Размер команды: целое число от 0 до 500 включительно.</w:t>
+              <w:br/>
+              <w:t>П5. Комментарий: не более 500 символов, поле необязательное.</w:t>
+              <w:br/>
+              <w:t>П6. Согласие: флажок обязательно отмечен.</w:t>
+            </w:r>
+          </w:p>
+        </w:tc>
+      </w:tr>
+      <w:tr>
+        <w:tc>
+          <w:tcPr>
+            <w:tcW w:type="dxa" w:w="2381"/>
+            <w:shd w:val="clear" w:fill="F2F2F2"/>
+          </w:tcPr>
+          <w:p>
+            <w:r>
+              <w:rPr>
+                <w:b/>
+                <w:sz w:val="24"/>
+              </w:rPr>
+              <w:t>Альтернативные потоки</w:t>
+            </w:r>
+          </w:p>
+        </w:tc>
+        <w:tc>
+          <w:tcPr>
+            <w:tcW w:type="dxa" w:w="7370"/>
+          </w:tcPr>
+          <w:p>
+            <w:r>
+              <w:rPr>
+                <w:sz w:val="24"/>
+              </w:rPr>
+              <w:t>A1. Одно или несколько полей не прошли проверку (шаг 9): под каждым неверным полем появляется сообщение об ошибке, фокус переходит на первое неверное поле, заявка не сохраняется. После исправления поля и ухода из него сообщение исчезает. Сценарий продолжается с шага 7.</w:t>
+              <w:br/>
+              <w:t>A2. Согласие не отмечено (шаг 9): применяется A1 для поля согласия.</w:t>
+              <w:br/>
+              <w:t>A3. Посетитель закрывает страницу или уходит со страницы до шага 7: данные не сохраняются, состояние системы не меняется.</w:t>
+              <w:br/>
+              <w:t>A4. Повторная заявка с тем же адресом почты (шаг 10): заявка принимается как новая отдельная запись, сообщения о дубликате нет.</w:t>
+            </w:r>
+          </w:p>
+        </w:tc>
+      </w:tr>
+      <w:tr>
+        <w:tc>
+          <w:tcPr>
+            <w:tcW w:type="dxa" w:w="2381"/>
+            <w:shd w:val="clear" w:fill="F2F2F2"/>
+          </w:tcPr>
+          <w:p>
+            <w:r>
+              <w:rPr>
+                <w:b/>
+                <w:sz w:val="24"/>
+              </w:rPr>
+              <w:t>Постусловия</w:t>
+            </w:r>
+          </w:p>
+        </w:tc>
+        <w:tc>
+          <w:tcPr>
+            <w:tcW w:type="dxa" w:w="7370"/>
+          </w:tcPr>
+          <w:p>
+            <w:r>
+              <w:rPr>
+                <w:sz w:val="24"/>
+              </w:rPr>
+              <w:t>Успех: в LocalStorage на одну запись больше, открыта страница thanks.html.</w:t>
+              <w:br/>
+              <w:t>Ошибка проверки (A1, A2): записей не добавилось, посетитель остаётся на главной странице, введённые значения сохранены в полях.</w:t>
+            </w:r>
+          </w:p>
+        </w:tc>
+      </w:tr>
+      <w:tr>
+        <w:tc>
+          <w:tcPr>
+            <w:tcW w:type="dxa" w:w="2381"/>
+            <w:shd w:val="clear" w:fill="F2F2F2"/>
+          </w:tcPr>
+          <w:p>
+            <w:r>
+              <w:rPr>
+                <w:b/>
+                <w:sz w:val="24"/>
+              </w:rPr>
+              <w:t>Исключительные ситуации</w:t>
+            </w:r>
+          </w:p>
+        </w:tc>
+        <w:tc>
+          <w:tcPr>
+            <w:tcW w:type="dxa" w:w="7370"/>
+          </w:tcPr>
+          <w:p>
+            <w:r>
+              <w:rPr>
+                <w:sz w:val="24"/>
+              </w:rPr>
+              <w:t>E1. Браузер не позволяет записать в LocalStorage (хранилище переполнено или запрещено, шаг 10): система всё равно открывает страницу благодарности, заявка не сохраняется, сообщения об ошибке нет. Это известное ограничение текущей версии (дефект D-2 лабораторной работы №1).</w:t>
+              <w:br/>
+              <w:t>E2. Одно из полей имеет недопустимый тип данных (например, текст в поле «Размер команды»): обрабатывается как A1 для этого поля.</w:t>
+            </w:r>
+          </w:p>
+        </w:tc>
+      </w:tr>
+    </w:tbl>
+    <w:p/>
     <w:p>
       <w:r>
-        <w:t>Общие предусловия: проект запущен (npm start, http://localhost:5173), форма открыта, поля пусты. Общие постусловия: данные никуда не отправляются, состояние системы не меняется.</w:t>
+        <w:t>Трассировка: правило П1 проверяют TC-WL-002…007, П2 TC-WL-008…011, П3 TC-WL-018, П4 TC-WL-012…017, П5 TC-WL-019, 020, П6 TC-WL-021, поток A1 TC-WL-022. Подзадача UC-01.2 покрыта всеми кейсами, UC-01.3 кейсом TC-WL-022.</w:t>
       </w:r>
     </w:p>
     <w:p>

</xml_diff>

<commit_message>
docs(testing-course): concrete use case from code, linked tasks, screenshots list, links
</commit_message>
<xml_diff>
--- a/testing-course/documents/01-test-cases.docx
+++ b/testing-course/documents/01-test-cases.docx
@@ -55,7 +55,7 @@
               <w:rPr>
                 <w:sz w:val="24"/>
               </w:rPr>
-              <w:t>UC-01. Подать заявку в лист ожидания (форма «Записаться в бету», главная страница DSLKit)</w:t>
+              <w:t>UC-01. Подать заявку в лист ожидания (форма «Записаться в бету» на главной странице DSLKit)</w:t>
             </w:r>
           </w:p>
         </w:tc>
@@ -85,7 +85,7 @@
               <w:rPr>
                 <w:sz w:val="24"/>
               </w:rPr>
-              <w:t>UC-01, версия 1.0, приоритет High: единственный способ оставить контакты для беты.</w:t>
+              <w:t>UC-01, версия 1.0, приоритет High: единственный способ оставить контакты для получения приглашения в бету.</w:t>
             </w:r>
           </w:p>
         </w:tc>
@@ -115,7 +115,7 @@
               <w:rPr>
                 <w:sz w:val="24"/>
               </w:rPr>
-              <w:t>Посетитель оставляет контактные данные и сведения о проекте, чтобы команда DSLKit могла прислать ему приглашение в бету после запуска. Задача формы: принять только корректную заявку и сохранить её.</w:t>
+              <w:t>Посетитель оставляет имя, почту, нотацию диаграмм и размер команды, чтобы команда DSLKit прислала ему приглашение, когда откроется бета. Задача формы: принять только корректную заявку, сохранить её и показать страницу благодарности.</w:t>
             </w:r>
           </w:p>
         </w:tc>
@@ -132,7 +132,7 @@
                 <w:b/>
                 <w:sz w:val="24"/>
               </w:rPr>
-              <w:t>Связанные требования</w:t>
+              <w:t>Основной актор</w:t>
             </w:r>
           </w:p>
         </w:tc>
@@ -145,7 +145,7 @@
               <w:rPr>
                 <w:sz w:val="24"/>
               </w:rPr>
-              <w:t>R4 «Форма заявки и валидация» (лаб. 3, раздел 1). Реализация: site/index.html (форма #waitlist-form), site/js/components/waitlist-form.js, site/js/utils/validation.js, site/thanks.html и site/en/thanks.html.</w:t>
+              <w:t>Посетитель сайта (неавторизованный). Внешних систем и сервера в сценарии нет: заявка остаётся в браузере посетителя.</w:t>
             </w:r>
           </w:p>
         </w:tc>
@@ -162,7 +162,7 @@
                 <w:b/>
                 <w:sz w:val="24"/>
               </w:rPr>
-              <w:t>Подзадачи</w:t>
+              <w:t>Точки входа</w:t>
             </w:r>
           </w:p>
         </w:tc>
@@ -175,15 +175,7 @@
               <w:rPr>
                 <w:sz w:val="24"/>
               </w:rPr>
-              <w:t>UC-01.1 Показ формы и подсказок к полям (шаги 1–6).</w:t>
-              <w:br/>
-              <w:t>UC-01.2 Очистка и проверка значений по П1–П6 (шаги 8–9).</w:t>
-              <w:br/>
-              <w:t>UC-01.3 Показ ошибок, фокус и повторная проверка (A1, A2).</w:t>
-              <w:br/>
-              <w:t>UC-01.4 Сохранение заявки в LocalStorage (шаг 10, A4, E1).</w:t>
-              <w:br/>
-              <w:t>UC-01.5 Переход на страницу благодарности (шаг 11).</w:t>
+              <w:t>Кнопка «В бету» в шапке, кнопка «Записаться в бету» на первом экране и ссылки «Записаться в бету: UML», «Записаться в бету: BPMN» и т. п. на карточках нотаций. Все ведут к якорю #waitlist.</w:t>
             </w:r>
           </w:p>
         </w:tc>
@@ -200,7 +192,7 @@
                 <w:b/>
                 <w:sz w:val="24"/>
               </w:rPr>
-              <w:t>Связанные задачи и use case</w:t>
+              <w:t>Предусловия</w:t>
             </w:r>
           </w:p>
         </w:tc>
@@ -213,13 +205,11 @@
               <w:rPr>
                 <w:sz w:val="24"/>
               </w:rPr>
-              <w:t>UC-00 «Прочитать политику конфиденциальности»: ссылка в тексте согласия ведёт на privacy.html (шаг 6).</w:t>
+              <w:t>1. Открыта главная страница: русская (/) или английская (/en/).</w:t>
               <w:br/>
-              <w:t>Лаб. 2: тест-кейсы TC-WL-001…022.</w:t>
+              <w:t>2. Раздел «Записаться в бету» показан, форма пуста: список «Нотация» стоит на пункте «Выберите нотацию», в поле «Размер команды» значение 0, флажок согласия снят.</w:t>
               <w:br/>
-              <w:t>Лаб. 3: проверки SM-07, CP-35, CP-36.</w:t>
-              <w:br/>
-              <w:t>Дефекты реализации: D-1 (повторные заявки), D-2 (потеря заявки при сбое хранилища).</w:t>
+              <w:t>3. Скрипт site/js/script.js загружен (иначе форма не работает).</w:t>
             </w:r>
           </w:p>
         </w:tc>
@@ -236,7 +226,7 @@
                 <w:b/>
                 <w:sz w:val="24"/>
               </w:rPr>
-              <w:t>Соответствие STAR</w:t>
+              <w:t>Основной поток событий</w:t>
             </w:r>
           </w:p>
         </w:tc>
@@ -249,13 +239,27 @@
               <w:rPr>
                 <w:sz w:val="24"/>
               </w:rPr>
-              <w:t>Situation (ситуация): предусловия 1–2.</w:t>
+              <w:t>1. Посетитель нажимает «В бету» (или «Записаться в бету»); страница прокручивается к разделу #waitlist.</w:t>
               <w:br/>
-              <w:t>Task (задача): краткое описание цели и задачи.</w:t>
+              <w:t>2. Посетитель вводит имя в поле «Имя» (подсказка «От 2 до 60 букв. Допустимы пробел, дефис и апостроф.»).</w:t>
               <w:br/>
-              <w:t>Action (действия): основной поток, шаги 1–11, и альтернативные потоки A1–A4.</w:t>
+              <w:t>3. Посетитель вводит адрес в поле «Электронная почта» (подсказка «Адрес вида name@example.com. На него придёт приглашение.»).</w:t>
               <w:br/>
-              <w:t>Result (результат): постусловия и исключительные ситуации E1–E2.</w:t>
+              <w:t>4. Посетитель выбирает нотацию в списке: IDEF0, DFD, ERD, BPMN, UML или «Сети Петри».</w:t>
+              <w:br/>
+              <w:t>5. Посетитель вводит целое число в поле «Размер команды» (подсказка «Целое число от 0 до 500. Укажите 0, если работаете один.»).</w:t>
+              <w:br/>
+              <w:t>6. Посетитель при желании вводит текст в поле «Комментарий (по желанию)».</w:t>
+              <w:br/>
+              <w:t>7. Посетитель отмечает флажок «Согласен получать письма о запуске беты и с политикой конфиденциальности».</w:t>
+              <w:br/>
+              <w:t>8. Посетитель нажимает кнопку «Отправить».</w:t>
+              <w:br/>
+              <w:t>9. Система считывает шесть полей и проверяет каждое по правилам П1–П6 (функция validateWaitlist).</w:t>
+              <w:br/>
+              <w:t>10. Система формирует запись {name, email, notation, team, comment, createdAt}, где name, email и comment очищены от пробелов по краям, team приведён к числу, createdAt — время в формате ISO 8601; добавляет запись в массив LocalStorage по ключу dslkit.waitlist и пишет в консоль «DSLKit: заявка сохранена в LocalStorage» с названием нотации.</w:t>
+              <w:br/>
+              <w:t>11. Система открывает страницу благодарности thanks.html (для английской версии en/thanks.html) с заголовком «Спасибо, вы в списке беты».</w:t>
             </w:r>
           </w:p>
         </w:tc>
@@ -272,7 +276,7 @@
                 <w:b/>
                 <w:sz w:val="24"/>
               </w:rPr>
-              <w:t>Основной актор</w:t>
+              <w:t>Правила проверки полей</w:t>
             </w:r>
           </w:p>
         </w:tc>
@@ -285,7 +289,19 @@
               <w:rPr>
                 <w:sz w:val="24"/>
               </w:rPr>
-              <w:t>Посетитель сайта (неавторизованный пользователь). Внешних систем в сценарии нет.</w:t>
+              <w:t>П1. Имя (#name): 2–60 символов после обрезки пробелов, первый символ буква, далее буквы, пробел, апостроф, дефис. В разметке: minlength=2, maxlength=60.</w:t>
+              <w:br/>
+              <w:t>П2. Почта (#email): вид name@domain.zone без пробелов, зона не короче двух символов, не более 120 символов после обрезки. В разметке: type=email, maxlength=120.</w:t>
+              <w:br/>
+              <w:t>П3. Нотация (#notation): idef0, dfd, erd, bpmn, uml или petri; пункт «Выберите нотацию» недопустим.</w:t>
+              <w:br/>
+              <w:t>П4. Размер команды (#team): целое от 0 до 500; допускается строка из цифр; отрицательные, дробные и нечисловые значения недопустимы. В разметке: min=0, max=500, step=1.</w:t>
+              <w:br/>
+              <w:t>П5. Комментарий (#comment): не более 500 символов (длина считается без обрезки), поле необязательное. В разметке: maxlength=500, поэтому в браузере больше 500 символов ввести нельзя.</w:t>
+              <w:br/>
+              <w:t>П6. Согласие (#consent): флажок обязательно отмечен.</w:t>
+              <w:br/>
+              <w:t>Встроенная проверка браузера отключена (form.noValidate), показываются только собственные сообщения сайта.</w:t>
             </w:r>
           </w:p>
         </w:tc>
@@ -302,7 +318,7 @@
                 <w:b/>
                 <w:sz w:val="24"/>
               </w:rPr>
-              <w:t>Предусловия</w:t>
+              <w:t>Альтернативные потоки</w:t>
             </w:r>
           </w:p>
         </w:tc>
@@ -315,9 +331,15 @@
               <w:rPr>
                 <w:sz w:val="24"/>
               </w:rPr>
-              <w:t>1. Открыта главная страница сайта (русская или английская версия).</w:t>
+              <w:t>A1. Одно или несколько полей не прошли проверку (шаг 9): под каждым неверным полем показывается красное сообщение (role=alert, например «Имя не принято: поле пустое, короче двух символов или содержит цифры и знаки…»), поле получает aria-invalid=true, фокус переходит на первое неверное поле в порядке имя, почта, нотация, команда, комментарий, согласие. Заявка не сохраняется, страница не меняется. Поле с ошибкой перепроверяется при каждом вводе, остальные при выходе из поля. После исправления сообщение скрывается. Сценарий продолжается с шага 8.</w:t>
               <w:br/>
-              <w:t>2. Форма «Записаться в бету» отображается, все поля пусты, поле «Размер команды» содержит 0.</w:t>
+              <w:t>A2. Согласие не отмечено (шаг 9): применяется A1; сообщение «Без согласия мы не можем отправить приглашение. Поставьте галочку, чтобы продолжить.»</w:t>
+              <w:br/>
+              <w:t>A3. Посетитель закрывает страницу или уходит со страницы до шага 8: данные не сохраняются, состояние системы не меняется.</w:t>
+              <w:br/>
+              <w:t>A4. Повторная заявка с тем же адресом (шаг 10): принимается как новая отдельная запись, сообщения о дубликате нет (дефект D-1).</w:t>
+              <w:br/>
+              <w:t>A5. Повторное нажатие «Отправить» после успешной отправки (шаг 11): игнорируется, вторая запись не создаётся (флаг submitting).</w:t>
             </w:r>
           </w:p>
         </w:tc>
@@ -334,7 +356,7 @@
                 <w:b/>
                 <w:sz w:val="24"/>
               </w:rPr>
-              <w:t>Основной поток событий</w:t>
+              <w:t>Постусловия</w:t>
             </w:r>
           </w:p>
         </w:tc>
@@ -347,27 +369,9 @@
               <w:rPr>
                 <w:sz w:val="24"/>
               </w:rPr>
-              <w:t>1. Посетитель вводит имя в поле «Имя».</w:t>
+              <w:t>Успех: массив dslkit.waitlist в LocalStorage длиннее на одну запись, открыта страница thanks.html (en/thanks.html).</w:t>
               <w:br/>
-              <w:t>2. Посетитель вводит адрес в поле «Электронная почта».</w:t>
-              <w:br/>
-              <w:t>3. Посетитель выбирает значение в списке «Нотация».</w:t>
-              <w:br/>
-              <w:t>4. Посетитель вводит целое число в поле «Размер команды».</w:t>
-              <w:br/>
-              <w:t>5. Посетитель при желании вводит текст в поле «Комментарий».</w:t>
-              <w:br/>
-              <w:t>6. Посетитель отмечает флажок согласия.</w:t>
-              <w:br/>
-              <w:t>7. Посетитель нажимает кнопку «Отправить».</w:t>
-              <w:br/>
-              <w:t>8. Система удаляет пробелы по краям у имени, почты и комментария.</w:t>
-              <w:br/>
-              <w:t>9. Система проверяет все поля по правилам П1–П6 (ниже).</w:t>
-              <w:br/>
-              <w:t>10. Система сохраняет заявку в LocalStorage браузера под ключом dslkit.waitlist: имя, почта, нотация, размер команды, комментарий, время создания.</w:t>
-              <w:br/>
-              <w:t>11. Система открывает страницу благодарности thanks.html.</w:t>
+              <w:t>Ошибка проверки (A1, A2): записей не добавилось, посетитель остаётся на главной странице, введённые значения остаются в полях.</w:t>
             </w:r>
           </w:p>
         </w:tc>
@@ -384,7 +388,7 @@
                 <w:b/>
                 <w:sz w:val="24"/>
               </w:rPr>
-              <w:t>Правила проверки полей</w:t>
+              <w:t>Исключительные ситуации</w:t>
             </w:r>
           </w:p>
         </w:tc>
@@ -397,17 +401,9 @@
               <w:rPr>
                 <w:sz w:val="24"/>
               </w:rPr>
-              <w:t>П1. Имя: 2–60 символов, начинается с буквы, далее буквы, пробел, дефис, апостроф.</w:t>
+              <w:t>E1. Запись в LocalStorage не удалась (хранилище переполнено или запрещено, шаг 10): метод storage.set возвращает false, но система всё равно открывает страницу благодарности; сообщения об ошибке нет, заявка потеряна (дефект D-2).</w:t>
               <w:br/>
-              <w:t>П2. Почта: вид name@domain.zone, домен верхнего уровня не короче двух символов, длина не более 120.</w:t>
-              <w:br/>
-              <w:t>П3. Нотация: одно из значений idef0, dfd, erd, bpmn, uml, petri.</w:t>
-              <w:br/>
-              <w:t>П4. Размер команды: целое число от 0 до 500 включительно.</w:t>
-              <w:br/>
-              <w:t>П5. Комментарий: не более 500 символов, поле необязательное.</w:t>
-              <w:br/>
-              <w:t>П6. Согласие: флажок обязательно отмечен.</w:t>
+              <w:t>E2. LocalStorage недоступен совсем (getStorage использует временное хранилище в памяти): заявка живёт только до закрытия страницы, посетитель видит страницу благодарности.</w:t>
             </w:r>
           </w:p>
         </w:tc>
@@ -424,7 +420,7 @@
                 <w:b/>
                 <w:sz w:val="24"/>
               </w:rPr>
-              <w:t>Альтернативные потоки</w:t>
+              <w:t>Связанные требования</w:t>
             </w:r>
           </w:p>
         </w:tc>
@@ -437,13 +433,13 @@
               <w:rPr>
                 <w:sz w:val="24"/>
               </w:rPr>
-              <w:t>A1. Одно или несколько полей не прошли проверку (шаг 9): под каждым неверным полем появляется сообщение об ошибке, фокус переходит на первое неверное поле, заявка не сохраняется. После исправления поля и ухода из него сообщение исчезает. Сценарий продолжается с шага 7.</w:t>
+              <w:t>R4 — Форма заявки и валидация</w:t>
               <w:br/>
-              <w:t>A2. Согласие не отмечено (шаг 9): применяется A1 для поля согласия.</w:t>
+              <w:t>R1 — Доступность страниц (главная, thanks.html, privacy.html)</w:t>
               <w:br/>
-              <w:t>A3. Посетитель закрывает страницу или уходит со страницы до шага 7: данные не сохраняются, состояние системы не меняется.</w:t>
+              <w:t>R6 — Разметка и локализация (русская и английская версии)</w:t>
               <w:br/>
-              <w:t>A4. Повторная заявка с тем же адресом почты (шаг 10): заявка принимается как новая отдельная запись, сообщения о дубликате нет.</w:t>
+              <w:t>R9 — Локальное хранилище</w:t>
             </w:r>
           </w:p>
         </w:tc>
@@ -460,7 +456,7 @@
                 <w:b/>
                 <w:sz w:val="24"/>
               </w:rPr>
-              <w:t>Постусловия</w:t>
+              <w:t>Подзадачи</w:t>
             </w:r>
           </w:p>
         </w:tc>
@@ -473,9 +469,15 @@
               <w:rPr>
                 <w:sz w:val="24"/>
               </w:rPr>
-              <w:t>Успех: в LocalStorage на одну запись больше, открыта страница thanks.html.</w:t>
+              <w:t>UC-01.1 — Показ формы и подсказок к полям</w:t>
               <w:br/>
-              <w:t>Ошибка проверки (A1, A2): записей не добавилось, посетитель остаётся на главной странице, введённые значения сохранены в полях.</w:t>
+              <w:t>UC-01.2 — Чтение, очистка и проверка значений по П1–П6</w:t>
+              <w:br/>
+              <w:t>UC-01.3 — Показ ошибок, фокус и повторная проверка</w:t>
+              <w:br/>
+              <w:t>UC-01.4 — Сохранение заявки в LocalStorage</w:t>
+              <w:br/>
+              <w:t>UC-01.5 — Переход на страницу благодарности</w:t>
             </w:r>
           </w:p>
         </w:tc>
@@ -492,7 +494,7 @@
                 <w:b/>
                 <w:sz w:val="24"/>
               </w:rPr>
-              <w:t>Исключительные ситуации</w:t>
+              <w:t>Связанные задачи и use case</w:t>
             </w:r>
           </w:p>
         </w:tc>
@@ -505,9 +507,193 @@
               <w:rPr>
                 <w:sz w:val="24"/>
               </w:rPr>
-              <w:t>E1. Браузер не позволяет записать в LocalStorage (хранилище переполнено или запрещено, шаг 10): система всё равно открывает страницу благодарности, заявка не сохраняется, сообщения об ошибке нет. Это известное ограничение текущей версии (дефект D-2 лабораторной работы №1).</w:t>
+              <w:t>UC-00 — Прочитать политику конфиденциальности (ссылка в тексте согласия, privacy.html)</w:t>
               <w:br/>
-              <w:t>E2. Одно из полей имеет недопустимый тип данных (например, текст в поле «Размер команды»): обрабатывается как A1 для этого поля.</w:t>
+              <w:t>UC-02 — Выбрать нотацию на карточке и перейти к записи (ссылки «Записаться в бету: UML», «…: BPMN»)</w:t>
+              <w:br/>
+              <w:t>D-1 — Повторные заявки принимаются</w:t>
+              <w:br/>
+              <w:t>D-2 — Потеря заявки при сбое хранилища</w:t>
+            </w:r>
+          </w:p>
+        </w:tc>
+      </w:tr>
+      <w:tr>
+        <w:tc>
+          <w:tcPr>
+            <w:tcW w:type="dxa" w:w="2381"/>
+            <w:shd w:val="clear" w:fill="F2F2F2"/>
+          </w:tcPr>
+          <w:p>
+            <w:r>
+              <w:rPr>
+                <w:b/>
+                <w:sz w:val="24"/>
+              </w:rPr>
+              <w:t>Реализация</w:t>
+            </w:r>
+          </w:p>
+        </w:tc>
+        <w:tc>
+          <w:tcPr>
+            <w:tcW w:type="dxa" w:w="7370"/>
+          </w:tcPr>
+          <w:p>
+            <w:r>
+              <w:rPr>
+                <w:sz w:val="24"/>
+              </w:rPr>
+              <w:t>IMPL-01 — site/index.html: разметка формы #waitlist-form</w:t>
+              <w:br/>
+              <w:t>IMPL-02 — site/js/components/waitlist-form.js: initWaitlistForm, показ ошибок, отправка</w:t>
+              <w:br/>
+              <w:t>IMPL-03 — site/js/utils/validation.js: validateWaitlist и правила П1–П6</w:t>
+              <w:br/>
+              <w:t>IMPL-04 — site/js/utils/storage.js: createStorage, getStorage</w:t>
+              <w:br/>
+              <w:t>IMPL-05 — site/thanks.html и site/en/thanks.html: страница благодарности</w:t>
+            </w:r>
+          </w:p>
+        </w:tc>
+      </w:tr>
+      <w:tr>
+        <w:tc>
+          <w:tcPr>
+            <w:tcW w:type="dxa" w:w="2381"/>
+            <w:shd w:val="clear" w:fill="F2F2F2"/>
+          </w:tcPr>
+          <w:p>
+            <w:r>
+              <w:rPr>
+                <w:b/>
+                <w:sz w:val="24"/>
+              </w:rPr>
+              <w:t>Тест-кейсы и проверки</w:t>
+            </w:r>
+          </w:p>
+        </w:tc>
+        <w:tc>
+          <w:tcPr>
+            <w:tcW w:type="dxa" w:w="7370"/>
+          </w:tcPr>
+          <w:p>
+            <w:r>
+              <w:rPr>
+                <w:sz w:val="24"/>
+              </w:rPr>
+              <w:t>TC-WL-001 — Все поля корректны</w:t>
+              <w:br/>
+              <w:t>TC-WL-002…007 — Имя: границы и недопустимые символы (П1)</w:t>
+              <w:br/>
+              <w:t>TC-WL-008…011 — Почта: формат и длина (П2)</w:t>
+              <w:br/>
+              <w:t>TC-WL-012…017 — Размер команды: границы и тип (П4)</w:t>
+              <w:br/>
+              <w:t>TC-WL-018 — Нотация вне списка (П3)</w:t>
+              <w:br/>
+              <w:t>TC-WL-019, 020 — Комментарий: граница 500 (П5)</w:t>
+              <w:br/>
+              <w:t>TC-WL-021 — Согласие не дано (П6)</w:t>
+              <w:br/>
+              <w:t>TC-WL-022 — Пустая форма (A1)</w:t>
+              <w:br/>
+              <w:t>SM-07 — Форма заявки есть на главной</w:t>
+              <w:br/>
+              <w:t>CP-35 — Валидация корректной заявки</w:t>
+              <w:br/>
+              <w:t>CP-36 — У полей есть подписи и сообщения об ошибках</w:t>
+            </w:r>
+          </w:p>
+        </w:tc>
+      </w:tr>
+      <w:tr>
+        <w:tc>
+          <w:tcPr>
+            <w:tcW w:type="dxa" w:w="2381"/>
+            <w:shd w:val="clear" w:fill="F2F2F2"/>
+          </w:tcPr>
+          <w:p>
+            <w:r>
+              <w:rPr>
+                <w:b/>
+                <w:sz w:val="24"/>
+              </w:rPr>
+              <w:t>Скриншоты интерфейса</w:t>
+            </w:r>
+          </w:p>
+        </w:tc>
+        <w:tc>
+          <w:tcPr>
+            <w:tcW w:type="dxa" w:w="7370"/>
+          </w:tcPr>
+          <w:p>
+            <w:r>
+              <w:rPr>
+                <w:sz w:val="24"/>
+              </w:rPr>
+              <w:t>SCR-01 — Главная страница, русская версия (01-home.png)</w:t>
+              <w:br/>
+              <w:t>SCR-02 — Главная страница, английская версия (02-home-en.png)</w:t>
+              <w:br/>
+              <w:t>SCR-03 — Форма заявки: ошибки при пустой отправке (03-form-errors.png)</w:t>
+              <w:br/>
+              <w:t>SCR-04 — Форма заявки: заполнена корректными данными (04-form-filled.png)</w:t>
+              <w:br/>
+              <w:t>SCR-05 — Страница благодарности (05-form-submitted.png)</w:t>
+              <w:br/>
+              <w:t>SCR-06 — Запись заявки в LocalStorage (12-uc-storage-record.png)</w:t>
+              <w:br/>
+              <w:t>SCR-07 — Сбой записи: страница благодарности без ошибки (13-uc-storage-failure.png)</w:t>
+            </w:r>
+          </w:p>
+        </w:tc>
+      </w:tr>
+      <w:tr>
+        <w:tc>
+          <w:tcPr>
+            <w:tcW w:type="dxa" w:w="2381"/>
+            <w:shd w:val="clear" w:fill="F2F2F2"/>
+          </w:tcPr>
+          <w:p>
+            <w:r>
+              <w:rPr>
+                <w:b/>
+                <w:sz w:val="24"/>
+              </w:rPr>
+              <w:t>Ссылки</w:t>
+            </w:r>
+          </w:p>
+        </w:tc>
+        <w:tc>
+          <w:tcPr>
+            <w:tcW w:type="dxa" w:w="7370"/>
+          </w:tcPr>
+          <w:p>
+            <w:r>
+              <w:rPr>
+                <w:sz w:val="24"/>
+              </w:rPr>
+              <w:t>Страницы проекта (при запущенном npm start):</w:t>
+              <w:br/>
+              <w:t>http://localhost:5173/ — главная страница (русская версия)</w:t>
+              <w:br/>
+              <w:t>http://localhost:5173/#waitlist — раздел «Записаться в бету»</w:t>
+              <w:br/>
+              <w:t>http://localhost:5173/thanks.html — страница благодарности</w:t>
+              <w:br/>
+              <w:t>http://localhost:5173/privacy.html — политика конфиденциальности</w:t>
+              <w:br/>
+              <w:t>http://localhost:5173/en/ — главная страница (английская версия)</w:t>
+              <w:br/>
+              <w:t>http://localhost:5173/en/thanks.html — страница благодарности (английская версия)</w:t>
+              <w:br/>
+              <w:t>Репозиторий и источники:</w:t>
+              <w:br/>
+              <w:t>https://github.com/KsushaKhadzhinova/DSLKit-Project — репозиторий проекта</w:t>
+              <w:br/>
+              <w:t>https://svyatoslav.biz/software_testing_book/ — книга «Тестирование программного обеспечения. Базовый курс»</w:t>
+              <w:br/>
+              <w:t>https://github.com/KsushaKhadzhinova/report-gen — генератор отчётов</w:t>
             </w:r>
           </w:p>
         </w:tc>

</xml_diff>

<commit_message>
docs(testing-course): use case system/module, data types table, diagrams, emphasis
</commit_message>
<xml_diff>
--- a/testing-course/documents/01-test-cases.docx
+++ b/testing-course/documents/01-test-cases.docx
@@ -39,8 +39,12 @@
           <w:p>
             <w:r>
               <w:rPr>
+                <w:sz w:val="24"/>
+              </w:rPr>
+            </w:r>
+            <w:r>
+              <w:rPr>
                 <w:b/>
-                <w:sz w:val="24"/>
               </w:rPr>
               <w:t>Название</w:t>
             </w:r>
@@ -53,9 +57,29 @@
           <w:p>
             <w:r>
               <w:rPr>
-                <w:sz w:val="24"/>
-              </w:rPr>
-              <w:t>UC-01. Подать заявку в лист ожидания (форма «Записаться в бету» на главной странице DSLKit)</w:t>
+                <w:b/>
+                <w:sz w:val="24"/>
+              </w:rPr>
+              <w:t>UC-01.</w:t>
+            </w:r>
+            <w:r>
+              <w:rPr>
+                <w:sz w:val="24"/>
+              </w:rPr>
+              <w:t xml:space="preserve"> Подать заявку в лист ожидания (форма </w:t>
+            </w:r>
+            <w:r>
+              <w:rPr>
+                <w:b/>
+                <w:sz w:val="24"/>
+              </w:rPr>
+              <w:t>«Записаться в бету»</w:t>
+            </w:r>
+            <w:r>
+              <w:rPr>
+                <w:sz w:val="24"/>
+              </w:rPr>
+              <w:t xml:space="preserve"> на главной странице DSLKit)</w:t>
             </w:r>
           </w:p>
         </w:tc>
@@ -69,8 +93,12 @@
           <w:p>
             <w:r>
               <w:rPr>
+                <w:sz w:val="24"/>
+              </w:rPr>
+            </w:r>
+            <w:r>
+              <w:rPr>
                 <w:b/>
-                <w:sz w:val="24"/>
               </w:rPr>
               <w:t>Идентификатор, версия, приоритет</w:t>
             </w:r>
@@ -99,10 +127,14 @@
           <w:p>
             <w:r>
               <w:rPr>
+                <w:sz w:val="24"/>
+              </w:rPr>
+            </w:r>
+            <w:r>
+              <w:rPr>
                 <w:b/>
-                <w:sz w:val="24"/>
-              </w:rPr>
-              <w:t>Краткое описание цели и задачи</w:t>
+              </w:rPr>
+              <w:t>Система и модуль</w:t>
             </w:r>
           </w:p>
         </w:tc>
@@ -113,9 +145,142 @@
           <w:p>
             <w:r>
               <w:rPr>
-                <w:sz w:val="24"/>
-              </w:rPr>
-              <w:t>Посетитель оставляет имя, почту, нотацию диаграмм и размер команды, чтобы команда DSLKit прислала ему приглашение, когда откроется бета. Задача формы: принять только корректную заявку, сохранить её и показать страницу благодарности.</w:t>
+                <w:b/>
+                <w:sz w:val="24"/>
+              </w:rPr>
+              <w:t>Система:</w:t>
+            </w:r>
+            <w:r>
+              <w:rPr>
+                <w:sz w:val="24"/>
+              </w:rPr>
+              <w:t xml:space="preserve"> </w:t>
+            </w:r>
+            <w:r>
+              <w:rPr>
+                <w:i/>
+                <w:sz w:val="24"/>
+              </w:rPr>
+              <w:t>DSLKit</w:t>
+            </w:r>
+            <w:r>
+              <w:rPr>
+                <w:sz w:val="24"/>
+              </w:rPr>
+              <w:t xml:space="preserve"> — веб-приложение «Редактор диаграмм как кода: слева текст, справа диаграмма», статический сайт без серверной части (каталог </w:t>
+            </w:r>
+            <w:r>
+              <w:rPr>
+                <w:i/>
+                <w:sz w:val="24"/>
+              </w:rPr>
+              <w:t>site/</w:t>
+            </w:r>
+            <w:r>
+              <w:rPr>
+                <w:sz w:val="24"/>
+              </w:rPr>
+              <w:t>).</w:t>
+            </w:r>
+            <w:r>
+              <w:br/>
+            </w:r>
+            <w:r>
+              <w:rPr>
+                <w:b/>
+                <w:sz w:val="24"/>
+              </w:rPr>
+              <w:t>Модуль:</w:t>
+            </w:r>
+            <w:r>
+              <w:rPr>
+                <w:sz w:val="24"/>
+              </w:rPr>
+              <w:t xml:space="preserve"> «Лист ожидания беты» — форма заявки на главной странице (раздел «Записаться в бету»).</w:t>
+            </w:r>
+            <w:r>
+              <w:br/>
+            </w:r>
+            <w:r>
+              <w:rPr>
+                <w:b/>
+                <w:sz w:val="24"/>
+              </w:rPr>
+              <w:t>Ссылка на модуль:</w:t>
+            </w:r>
+            <w:r>
+              <w:rPr>
+                <w:sz w:val="24"/>
+              </w:rPr>
+              <w:t xml:space="preserve"> http://localhost:5173/#waitlist (запуск: </w:t>
+            </w:r>
+            <w:r>
+              <w:rPr>
+                <w:i/>
+                <w:sz w:val="24"/>
+              </w:rPr>
+              <w:t>npm start</w:t>
+            </w:r>
+            <w:r>
+              <w:rPr>
+                <w:sz w:val="24"/>
+              </w:rPr>
+              <w:t>).</w:t>
+            </w:r>
+            <w:r>
+              <w:br/>
+            </w:r>
+            <w:r>
+              <w:rPr>
+                <w:b/>
+                <w:sz w:val="24"/>
+              </w:rPr>
+              <w:t>Ссылка на исходный код:</w:t>
+            </w:r>
+            <w:r>
+              <w:rPr>
+                <w:sz w:val="24"/>
+              </w:rPr>
+              <w:t xml:space="preserve"> https://github.com/KsushaKhadzhinova/DSLKit-Project, файлы </w:t>
+            </w:r>
+            <w:r>
+              <w:rPr>
+                <w:i/>
+                <w:sz w:val="24"/>
+              </w:rPr>
+              <w:t>site/index.html</w:t>
+            </w:r>
+            <w:r>
+              <w:rPr>
+                <w:sz w:val="24"/>
+              </w:rPr>
+              <w:t xml:space="preserve"> (форма </w:t>
+            </w:r>
+            <w:r>
+              <w:rPr>
+                <w:i/>
+                <w:sz w:val="24"/>
+              </w:rPr>
+              <w:t>#waitlist-form</w:t>
+            </w:r>
+            <w:r>
+              <w:rPr>
+                <w:sz w:val="24"/>
+              </w:rPr>
+              <w:t xml:space="preserve">) и </w:t>
+            </w:r>
+            <w:r>
+              <w:rPr>
+                <w:i/>
+                <w:sz w:val="24"/>
+              </w:rPr>
+              <w:t>site/js/components/waitlist-form.js</w:t>
+            </w:r>
+            <w:r>
+              <w:rPr>
+                <w:sz w:val="24"/>
+              </w:rPr>
+              <w:t>.</w:t>
             </w:r>
           </w:p>
         </w:tc>
@@ -129,10 +294,14 @@
           <w:p>
             <w:r>
               <w:rPr>
+                <w:sz w:val="24"/>
+              </w:rPr>
+            </w:r>
+            <w:r>
+              <w:rPr>
                 <w:b/>
-                <w:sz w:val="24"/>
-              </w:rPr>
-              <w:t>Основной актор</w:t>
+              </w:rPr>
+              <w:t>Краткое описание цели и задачи</w:t>
             </w:r>
           </w:p>
         </w:tc>
@@ -145,7 +314,7 @@
               <w:rPr>
                 <w:sz w:val="24"/>
               </w:rPr>
-              <w:t>Посетитель сайта (неавторизованный). Внешних систем и сервера в сценарии нет: заявка остаётся в браузере посетителя.</w:t>
+              <w:t>Посетитель оставляет имя, почту, нотацию диаграмм и размер команды, чтобы команда DSLKit прислала ему приглашение, когда откроется бета. Задача формы: принять только корректную заявку, сохранить её и показать страницу благодарности.</w:t>
             </w:r>
           </w:p>
         </w:tc>
@@ -159,10 +328,14 @@
           <w:p>
             <w:r>
               <w:rPr>
+                <w:sz w:val="24"/>
+              </w:rPr>
+            </w:r>
+            <w:r>
+              <w:rPr>
                 <w:b/>
-                <w:sz w:val="24"/>
-              </w:rPr>
-              <w:t>Точки входа</w:t>
+              </w:rPr>
+              <w:t>Основной актор</w:t>
             </w:r>
           </w:p>
         </w:tc>
@@ -175,7 +348,7 @@
               <w:rPr>
                 <w:sz w:val="24"/>
               </w:rPr>
-              <w:t>Кнопка «В бету» в шапке, кнопка «Записаться в бету» на первом экране и ссылки «Записаться в бету: UML», «Записаться в бету: BPMN» и т. п. на карточках нотаций. Все ведут к якорю #waitlist.</w:t>
+              <w:t>Посетитель сайта (неавторизованный). Внешних систем и сервера в сценарии нет: заявка остаётся в браузере посетителя.</w:t>
             </w:r>
           </w:p>
         </w:tc>
@@ -189,10 +362,14 @@
           <w:p>
             <w:r>
               <w:rPr>
+                <w:sz w:val="24"/>
+              </w:rPr>
+            </w:r>
+            <w:r>
+              <w:rPr>
                 <w:b/>
-                <w:sz w:val="24"/>
-              </w:rPr>
-              <w:t>Предусловия</w:t>
+              </w:rPr>
+              <w:t>Точки входа</w:t>
             </w:r>
           </w:p>
         </w:tc>
@@ -205,11 +382,72 @@
               <w:rPr>
                 <w:sz w:val="24"/>
               </w:rPr>
-              <w:t>1. Открыта главная страница: русская (/) или английская (/en/).</w:t>
-              <w:br/>
-              <w:t>2. Раздел «Записаться в бету» показан, форма пуста: список «Нотация» стоит на пункте «Выберите нотацию», в поле «Размер команды» значение 0, флажок согласия снят.</w:t>
-              <w:br/>
-              <w:t>3. Скрипт site/js/script.js загружен (иначе форма не работает).</w:t>
+              <w:t xml:space="preserve">Кнопка </w:t>
+            </w:r>
+            <w:r>
+              <w:rPr>
+                <w:b/>
+                <w:sz w:val="24"/>
+              </w:rPr>
+              <w:t>«В бету»</w:t>
+            </w:r>
+            <w:r>
+              <w:rPr>
+                <w:sz w:val="24"/>
+              </w:rPr>
+              <w:t xml:space="preserve"> в шапке, кнопка </w:t>
+            </w:r>
+            <w:r>
+              <w:rPr>
+                <w:b/>
+                <w:sz w:val="24"/>
+              </w:rPr>
+              <w:t>«Записаться в бету»</w:t>
+            </w:r>
+            <w:r>
+              <w:rPr>
+                <w:sz w:val="24"/>
+              </w:rPr>
+              <w:t xml:space="preserve"> на первом экране и ссылки </w:t>
+            </w:r>
+            <w:r>
+              <w:rPr>
+                <w:b/>
+                <w:sz w:val="24"/>
+              </w:rPr>
+              <w:t>«Записаться в бету: UML»</w:t>
+            </w:r>
+            <w:r>
+              <w:rPr>
+                <w:sz w:val="24"/>
+              </w:rPr>
+              <w:t xml:space="preserve">, </w:t>
+            </w:r>
+            <w:r>
+              <w:rPr>
+                <w:b/>
+                <w:sz w:val="24"/>
+              </w:rPr>
+              <w:t>«Записаться в бету: BPMN»</w:t>
+            </w:r>
+            <w:r>
+              <w:rPr>
+                <w:sz w:val="24"/>
+              </w:rPr>
+              <w:t xml:space="preserve"> и т. п. на карточках нотаций. Все ведут к якорю </w:t>
+            </w:r>
+            <w:r>
+              <w:rPr>
+                <w:i/>
+                <w:sz w:val="24"/>
+              </w:rPr>
+              <w:t>#waitlist</w:t>
+            </w:r>
+            <w:r>
+              <w:rPr>
+                <w:sz w:val="24"/>
+              </w:rPr>
+              <w:t>.</w:t>
             </w:r>
           </w:p>
         </w:tc>
@@ -223,10 +461,14 @@
           <w:p>
             <w:r>
               <w:rPr>
+                <w:sz w:val="24"/>
+              </w:rPr>
+            </w:r>
+            <w:r>
+              <w:rPr>
                 <w:b/>
-                <w:sz w:val="24"/>
-              </w:rPr>
-              <w:t>Основной поток событий</w:t>
+              </w:rPr>
+              <w:t>Предусловия</w:t>
             </w:r>
           </w:p>
         </w:tc>
@@ -239,27 +481,90 @@
               <w:rPr>
                 <w:sz w:val="24"/>
               </w:rPr>
-              <w:t>1. Посетитель нажимает «В бету» (или «Записаться в бету»); страница прокручивается к разделу #waitlist.</w:t>
+              <w:t>1. Открыта главная страница: русская (/) или английская (/en/).</w:t>
+            </w:r>
+            <w:r>
               <w:br/>
-              <w:t>2. Посетитель вводит имя в поле «Имя» (подсказка «От 2 до 60 букв. Допустимы пробел, дефис и апостроф.»).</w:t>
+            </w:r>
+            <w:r>
+              <w:rPr>
+                <w:sz w:val="24"/>
+              </w:rPr>
+              <w:t xml:space="preserve">2. Раздел </w:t>
+            </w:r>
+            <w:r>
+              <w:rPr>
+                <w:b/>
+                <w:sz w:val="24"/>
+              </w:rPr>
+              <w:t>«Записаться в бету»</w:t>
+            </w:r>
+            <w:r>
+              <w:rPr>
+                <w:sz w:val="24"/>
+              </w:rPr>
+              <w:t xml:space="preserve"> показан, форма пуста: список </w:t>
+            </w:r>
+            <w:r>
+              <w:rPr>
+                <w:b/>
+                <w:sz w:val="24"/>
+              </w:rPr>
+              <w:t>«Нотация»</w:t>
+            </w:r>
+            <w:r>
+              <w:rPr>
+                <w:sz w:val="24"/>
+              </w:rPr>
+              <w:t xml:space="preserve"> стоит на пункте </w:t>
+            </w:r>
+            <w:r>
+              <w:rPr>
+                <w:b/>
+                <w:sz w:val="24"/>
+              </w:rPr>
+              <w:t>«Выберите нотацию»</w:t>
+            </w:r>
+            <w:r>
+              <w:rPr>
+                <w:sz w:val="24"/>
+              </w:rPr>
+              <w:t xml:space="preserve">, в поле </w:t>
+            </w:r>
+            <w:r>
+              <w:rPr>
+                <w:b/>
+                <w:sz w:val="24"/>
+              </w:rPr>
+              <w:t>«Размер команды»</w:t>
+            </w:r>
+            <w:r>
+              <w:rPr>
+                <w:sz w:val="24"/>
+              </w:rPr>
+              <w:t xml:space="preserve"> значение 0, флажок согласия снят.</w:t>
+            </w:r>
+            <w:r>
               <w:br/>
-              <w:t>3. Посетитель вводит адрес в поле «Электронная почта» (подсказка «Адрес вида name@example.com. На него придёт приглашение.»).</w:t>
-              <w:br/>
-              <w:t>4. Посетитель выбирает нотацию в списке: IDEF0, DFD, ERD, BPMN, UML или «Сети Петри».</w:t>
-              <w:br/>
-              <w:t>5. Посетитель вводит целое число в поле «Размер команды» (подсказка «Целое число от 0 до 500. Укажите 0, если работаете один.»).</w:t>
-              <w:br/>
-              <w:t>6. Посетитель при желании вводит текст в поле «Комментарий (по желанию)».</w:t>
-              <w:br/>
-              <w:t>7. Посетитель отмечает флажок «Согласен получать письма о запуске беты и с политикой конфиденциальности».</w:t>
-              <w:br/>
-              <w:t>8. Посетитель нажимает кнопку «Отправить».</w:t>
-              <w:br/>
-              <w:t>9. Система считывает шесть полей и проверяет каждое по правилам П1–П6 (функция validateWaitlist).</w:t>
-              <w:br/>
-              <w:t>10. Система формирует запись {name, email, notation, team, comment, createdAt}, где name, email и comment очищены от пробелов по краям, team приведён к числу, createdAt — время в формате ISO 8601; добавляет запись в массив LocalStorage по ключу dslkit.waitlist и пишет в консоль «DSLKit: заявка сохранена в LocalStorage» с названием нотации.</w:t>
-              <w:br/>
-              <w:t>11. Система открывает страницу благодарности thanks.html (для английской версии en/thanks.html) с заголовком «Спасибо, вы в списке беты».</w:t>
+            </w:r>
+            <w:r>
+              <w:rPr>
+                <w:sz w:val="24"/>
+              </w:rPr>
+              <w:t xml:space="preserve">3. Скрипт </w:t>
+            </w:r>
+            <w:r>
+              <w:rPr>
+                <w:i/>
+                <w:sz w:val="24"/>
+              </w:rPr>
+              <w:t>site/js/script.js</w:t>
+            </w:r>
+            <w:r>
+              <w:rPr>
+                <w:sz w:val="24"/>
+              </w:rPr>
+              <w:t xml:space="preserve"> загружен (иначе форма не работает).</w:t>
             </w:r>
           </w:p>
         </w:tc>
@@ -273,10 +578,14 @@
           <w:p>
             <w:r>
               <w:rPr>
+                <w:sz w:val="24"/>
+              </w:rPr>
+            </w:r>
+            <w:r>
+              <w:rPr>
                 <w:b/>
-                <w:sz w:val="24"/>
-              </w:rPr>
-              <w:t>Правила проверки полей</w:t>
+              </w:rPr>
+              <w:t>Основной поток событий</w:t>
             </w:r>
           </w:p>
         </w:tc>
@@ -289,19 +598,357 @@
               <w:rPr>
                 <w:sz w:val="24"/>
               </w:rPr>
-              <w:t>П1. Имя (#name): 2–60 символов после обрезки пробелов, первый символ буква, далее буквы, пробел, апостроф, дефис. В разметке: minlength=2, maxlength=60.</w:t>
+              <w:t xml:space="preserve">1. Посетитель нажимает </w:t>
+            </w:r>
+            <w:r>
+              <w:rPr>
+                <w:b/>
+                <w:sz w:val="24"/>
+              </w:rPr>
+              <w:t>«В бету»</w:t>
+            </w:r>
+            <w:r>
+              <w:rPr>
+                <w:sz w:val="24"/>
+              </w:rPr>
+              <w:t xml:space="preserve"> (или </w:t>
+            </w:r>
+            <w:r>
+              <w:rPr>
+                <w:b/>
+                <w:sz w:val="24"/>
+              </w:rPr>
+              <w:t>«Записаться в бету»</w:t>
+            </w:r>
+            <w:r>
+              <w:rPr>
+                <w:sz w:val="24"/>
+              </w:rPr>
+              <w:t xml:space="preserve">); страница прокручивается к разделу </w:t>
+            </w:r>
+            <w:r>
+              <w:rPr>
+                <w:i/>
+                <w:sz w:val="24"/>
+              </w:rPr>
+              <w:t>#waitlist</w:t>
+            </w:r>
+            <w:r>
+              <w:rPr>
+                <w:sz w:val="24"/>
+              </w:rPr>
+              <w:t>.</w:t>
+            </w:r>
+            <w:r>
               <w:br/>
-              <w:t>П2. Почта (#email): вид name@domain.zone без пробелов, зона не короче двух символов, не более 120 символов после обрезки. В разметке: type=email, maxlength=120.</w:t>
+            </w:r>
+            <w:r>
+              <w:rPr>
+                <w:sz w:val="24"/>
+              </w:rPr>
+              <w:t xml:space="preserve">2. Посетитель вводит имя в поле </w:t>
+            </w:r>
+            <w:r>
+              <w:rPr>
+                <w:b/>
+                <w:sz w:val="24"/>
+              </w:rPr>
+              <w:t>«Имя»</w:t>
+            </w:r>
+            <w:r>
+              <w:rPr>
+                <w:sz w:val="24"/>
+              </w:rPr>
+              <w:t xml:space="preserve"> (подсказка </w:t>
+            </w:r>
+            <w:r>
+              <w:rPr>
+                <w:b/>
+                <w:sz w:val="24"/>
+              </w:rPr>
+              <w:t>«От 2 до 60 букв. Допустимы пробел, дефис и апостроф.»</w:t>
+            </w:r>
+            <w:r>
+              <w:rPr>
+                <w:sz w:val="24"/>
+              </w:rPr>
+              <w:t>).</w:t>
+            </w:r>
+            <w:r>
               <w:br/>
-              <w:t>П3. Нотация (#notation): idef0, dfd, erd, bpmn, uml или petri; пункт «Выберите нотацию» недопустим.</w:t>
+            </w:r>
+            <w:r>
+              <w:rPr>
+                <w:sz w:val="24"/>
+              </w:rPr>
+              <w:t xml:space="preserve">3. Посетитель вводит адрес в поле </w:t>
+            </w:r>
+            <w:r>
+              <w:rPr>
+                <w:b/>
+                <w:sz w:val="24"/>
+              </w:rPr>
+              <w:t>«Электронная почта»</w:t>
+            </w:r>
+            <w:r>
+              <w:rPr>
+                <w:sz w:val="24"/>
+              </w:rPr>
+              <w:t xml:space="preserve"> (подсказка </w:t>
+            </w:r>
+            <w:r>
+              <w:rPr>
+                <w:b/>
+                <w:sz w:val="24"/>
+              </w:rPr>
+              <w:t>«Адрес вида name@example.com. На него придёт приглашение.»</w:t>
+            </w:r>
+            <w:r>
+              <w:rPr>
+                <w:sz w:val="24"/>
+              </w:rPr>
+              <w:t>).</w:t>
+            </w:r>
+            <w:r>
               <w:br/>
-              <w:t>П4. Размер команды (#team): целое от 0 до 500; допускается строка из цифр; отрицательные, дробные и нечисловые значения недопустимы. В разметке: min=0, max=500, step=1.</w:t>
+            </w:r>
+            <w:r>
+              <w:rPr>
+                <w:sz w:val="24"/>
+              </w:rPr>
+              <w:t xml:space="preserve">4. Посетитель выбирает нотацию в списке: IDEF0, DFD, ERD, BPMN, UML или </w:t>
+            </w:r>
+            <w:r>
+              <w:rPr>
+                <w:b/>
+                <w:sz w:val="24"/>
+              </w:rPr>
+              <w:t>«Сети Петри»</w:t>
+            </w:r>
+            <w:r>
+              <w:rPr>
+                <w:sz w:val="24"/>
+              </w:rPr>
+              <w:t>.</w:t>
+            </w:r>
+            <w:r>
               <w:br/>
-              <w:t>П5. Комментарий (#comment): не более 500 символов (длина считается без обрезки), поле необязательное. В разметке: maxlength=500, поэтому в браузере больше 500 символов ввести нельзя.</w:t>
+            </w:r>
+            <w:r>
+              <w:rPr>
+                <w:sz w:val="24"/>
+              </w:rPr>
+              <w:t xml:space="preserve">5. Посетитель вводит целое число в поле </w:t>
+            </w:r>
+            <w:r>
+              <w:rPr>
+                <w:b/>
+                <w:sz w:val="24"/>
+              </w:rPr>
+              <w:t>«Размер команды»</w:t>
+            </w:r>
+            <w:r>
+              <w:rPr>
+                <w:sz w:val="24"/>
+              </w:rPr>
+              <w:t xml:space="preserve"> (подсказка </w:t>
+            </w:r>
+            <w:r>
+              <w:rPr>
+                <w:b/>
+                <w:sz w:val="24"/>
+              </w:rPr>
+              <w:t>«Целое число от 0 до 500. Укажите 0, если работаете один.»</w:t>
+            </w:r>
+            <w:r>
+              <w:rPr>
+                <w:sz w:val="24"/>
+              </w:rPr>
+              <w:t>).</w:t>
+            </w:r>
+            <w:r>
               <w:br/>
-              <w:t>П6. Согласие (#consent): флажок обязательно отмечен.</w:t>
+            </w:r>
+            <w:r>
+              <w:rPr>
+                <w:sz w:val="24"/>
+              </w:rPr>
+              <w:t xml:space="preserve">6. Посетитель при желании вводит текст в поле </w:t>
+            </w:r>
+            <w:r>
+              <w:rPr>
+                <w:b/>
+                <w:sz w:val="24"/>
+              </w:rPr>
+              <w:t>«Комментарий (по желанию)»</w:t>
+            </w:r>
+            <w:r>
+              <w:rPr>
+                <w:sz w:val="24"/>
+              </w:rPr>
+              <w:t>.</w:t>
+            </w:r>
+            <w:r>
               <w:br/>
-              <w:t>Встроенная проверка браузера отключена (form.noValidate), показываются только собственные сообщения сайта.</w:t>
+            </w:r>
+            <w:r>
+              <w:rPr>
+                <w:sz w:val="24"/>
+              </w:rPr>
+              <w:t xml:space="preserve">7. Посетитель отмечает флажок </w:t>
+            </w:r>
+            <w:r>
+              <w:rPr>
+                <w:b/>
+                <w:sz w:val="24"/>
+              </w:rPr>
+              <w:t>«Согласен получать письма о запуске беты и с политикой конфиденциальности»</w:t>
+            </w:r>
+            <w:r>
+              <w:rPr>
+                <w:sz w:val="24"/>
+              </w:rPr>
+              <w:t>.</w:t>
+            </w:r>
+            <w:r>
+              <w:br/>
+            </w:r>
+            <w:r>
+              <w:rPr>
+                <w:sz w:val="24"/>
+              </w:rPr>
+              <w:t xml:space="preserve">8. Посетитель нажимает кнопку </w:t>
+            </w:r>
+            <w:r>
+              <w:rPr>
+                <w:b/>
+                <w:sz w:val="24"/>
+              </w:rPr>
+              <w:t>«Отправить»</w:t>
+            </w:r>
+            <w:r>
+              <w:rPr>
+                <w:sz w:val="24"/>
+              </w:rPr>
+              <w:t>.</w:t>
+            </w:r>
+            <w:r>
+              <w:br/>
+            </w:r>
+            <w:r>
+              <w:rPr>
+                <w:sz w:val="24"/>
+              </w:rPr>
+              <w:t xml:space="preserve">9. Система считывает шесть полей и проверяет каждое по правилам П1–П6 (функция </w:t>
+            </w:r>
+            <w:r>
+              <w:rPr>
+                <w:i/>
+                <w:sz w:val="24"/>
+              </w:rPr>
+              <w:t>validateWaitlist</w:t>
+            </w:r>
+            <w:r>
+              <w:rPr>
+                <w:sz w:val="24"/>
+              </w:rPr>
+              <w:t>).</w:t>
+            </w:r>
+            <w:r>
+              <w:br/>
+            </w:r>
+            <w:r>
+              <w:rPr>
+                <w:sz w:val="24"/>
+              </w:rPr>
+              <w:t xml:space="preserve">10. Система формирует запись {name, email, notation, team, comment, createdAt}, где name, email и comment очищены от пробелов по краям, team приведён к числу, createdAt — время в формате ISO 8601; добавляет запись в массив </w:t>
+            </w:r>
+            <w:r>
+              <w:rPr>
+                <w:i/>
+                <w:sz w:val="24"/>
+              </w:rPr>
+              <w:t>LocalStorage</w:t>
+            </w:r>
+            <w:r>
+              <w:rPr>
+                <w:sz w:val="24"/>
+              </w:rPr>
+              <w:t xml:space="preserve"> по ключу </w:t>
+            </w:r>
+            <w:r>
+              <w:rPr>
+                <w:i/>
+                <w:sz w:val="24"/>
+              </w:rPr>
+              <w:t>dslkit.waitlist</w:t>
+            </w:r>
+            <w:r>
+              <w:rPr>
+                <w:sz w:val="24"/>
+              </w:rPr>
+              <w:t xml:space="preserve"> и пишет в консоль </w:t>
+            </w:r>
+            <w:r>
+              <w:rPr>
+                <w:b/>
+                <w:sz w:val="24"/>
+              </w:rPr>
+              <w:t>«DSLKit: заявка сохранена в LocalStorage»</w:t>
+            </w:r>
+            <w:r>
+              <w:rPr>
+                <w:sz w:val="24"/>
+              </w:rPr>
+              <w:t xml:space="preserve"> с названием нотации.</w:t>
+            </w:r>
+            <w:r>
+              <w:br/>
+            </w:r>
+            <w:r>
+              <w:rPr>
+                <w:sz w:val="24"/>
+              </w:rPr>
+              <w:t xml:space="preserve">11. Система открывает страницу благодарности </w:t>
+            </w:r>
+            <w:r>
+              <w:rPr>
+                <w:i/>
+                <w:sz w:val="24"/>
+              </w:rPr>
+              <w:t>thanks.html</w:t>
+            </w:r>
+            <w:r>
+              <w:rPr>
+                <w:sz w:val="24"/>
+              </w:rPr>
+              <w:t xml:space="preserve"> (для английской версии en/</w:t>
+            </w:r>
+            <w:r>
+              <w:rPr>
+                <w:i/>
+                <w:sz w:val="24"/>
+              </w:rPr>
+              <w:t>thanks.html</w:t>
+            </w:r>
+            <w:r>
+              <w:rPr>
+                <w:sz w:val="24"/>
+              </w:rPr>
+              <w:t xml:space="preserve">) с заголовком </w:t>
+            </w:r>
+            <w:r>
+              <w:rPr>
+                <w:b/>
+                <w:sz w:val="24"/>
+              </w:rPr>
+              <w:t>«Спасибо, вы в списке беты»</w:t>
+            </w:r>
+            <w:r>
+              <w:rPr>
+                <w:sz w:val="24"/>
+              </w:rPr>
+              <w:t>.</w:t>
             </w:r>
           </w:p>
         </w:tc>
@@ -315,10 +962,14 @@
           <w:p>
             <w:r>
               <w:rPr>
+                <w:sz w:val="24"/>
+              </w:rPr>
+            </w:r>
+            <w:r>
+              <w:rPr>
                 <w:b/>
-                <w:sz w:val="24"/>
-              </w:rPr>
-              <w:t>Альтернативные потоки</w:t>
+              </w:rPr>
+              <w:t>Правила проверки полей</w:t>
             </w:r>
           </w:p>
         </w:tc>
@@ -329,17 +980,196 @@
           <w:p>
             <w:r>
               <w:rPr>
-                <w:sz w:val="24"/>
-              </w:rPr>
-              <w:t>A1. Одно или несколько полей не прошли проверку (шаг 9): под каждым неверным полем показывается красное сообщение (role=alert, например «Имя не принято: поле пустое, короче двух символов или содержит цифры и знаки…»), поле получает aria-invalid=true, фокус переходит на первое неверное поле в порядке имя, почта, нотация, команда, комментарий, согласие. Заявка не сохраняется, страница не меняется. Поле с ошибкой перепроверяется при каждом вводе, остальные при выходе из поля. После исправления сообщение скрывается. Сценарий продолжается с шага 8.</w:t>
+                <w:b/>
+                <w:sz w:val="24"/>
+              </w:rPr>
+              <w:t>П1</w:t>
+            </w:r>
+            <w:r>
+              <w:rPr>
+                <w:sz w:val="24"/>
+              </w:rPr>
+              <w:t>. Имя (</w:t>
+            </w:r>
+            <w:r>
+              <w:rPr>
+                <w:i/>
+                <w:sz w:val="24"/>
+              </w:rPr>
+              <w:t>#name</w:t>
+            </w:r>
+            <w:r>
+              <w:rPr>
+                <w:sz w:val="24"/>
+              </w:rPr>
+              <w:t>): 2–60 символов после обрезки пробелов, первый символ буква, далее буквы, пробел, апостроф, дефис. В разметке: minlength=2, maxlength=60.</w:t>
+            </w:r>
+            <w:r>
               <w:br/>
-              <w:t>A2. Согласие не отмечено (шаг 9): применяется A1; сообщение «Без согласия мы не можем отправить приглашение. Поставьте галочку, чтобы продолжить.»</w:t>
+            </w:r>
+            <w:r>
+              <w:rPr>
+                <w:b/>
+                <w:sz w:val="24"/>
+              </w:rPr>
+              <w:t>П2</w:t>
+            </w:r>
+            <w:r>
+              <w:rPr>
+                <w:sz w:val="24"/>
+              </w:rPr>
+              <w:t>. Почта (</w:t>
+            </w:r>
+            <w:r>
+              <w:rPr>
+                <w:i/>
+                <w:sz w:val="24"/>
+              </w:rPr>
+              <w:t>#email</w:t>
+            </w:r>
+            <w:r>
+              <w:rPr>
+                <w:sz w:val="24"/>
+              </w:rPr>
+              <w:t>): вид name@domain.zone без пробелов, зона не короче двух символов, не более 120 символов после обрезки. В разметке: type=email, maxlength=120.</w:t>
+            </w:r>
+            <w:r>
               <w:br/>
-              <w:t>A3. Посетитель закрывает страницу или уходит со страницы до шага 8: данные не сохраняются, состояние системы не меняется.</w:t>
+            </w:r>
+            <w:r>
+              <w:rPr>
+                <w:b/>
+                <w:sz w:val="24"/>
+              </w:rPr>
+              <w:t>П3</w:t>
+            </w:r>
+            <w:r>
+              <w:rPr>
+                <w:sz w:val="24"/>
+              </w:rPr>
+              <w:t>. Нотация (</w:t>
+            </w:r>
+            <w:r>
+              <w:rPr>
+                <w:i/>
+                <w:sz w:val="24"/>
+              </w:rPr>
+              <w:t>#notation</w:t>
+            </w:r>
+            <w:r>
+              <w:rPr>
+                <w:sz w:val="24"/>
+              </w:rPr>
+              <w:t xml:space="preserve">): idef0, dfd, erd, bpmn, uml или petri; пункт </w:t>
+            </w:r>
+            <w:r>
+              <w:rPr>
+                <w:b/>
+                <w:sz w:val="24"/>
+              </w:rPr>
+              <w:t>«Выберите нотацию»</w:t>
+            </w:r>
+            <w:r>
+              <w:rPr>
+                <w:sz w:val="24"/>
+              </w:rPr>
+              <w:t xml:space="preserve"> недопустим.</w:t>
+            </w:r>
+            <w:r>
               <w:br/>
-              <w:t>A4. Повторная заявка с тем же адресом (шаг 10): принимается как новая отдельная запись, сообщения о дубликате нет (дефект D-1).</w:t>
+            </w:r>
+            <w:r>
+              <w:rPr>
+                <w:b/>
+                <w:sz w:val="24"/>
+              </w:rPr>
+              <w:t>П4</w:t>
+            </w:r>
+            <w:r>
+              <w:rPr>
+                <w:sz w:val="24"/>
+              </w:rPr>
+              <w:t>. Размер команды (</w:t>
+            </w:r>
+            <w:r>
+              <w:rPr>
+                <w:i/>
+                <w:sz w:val="24"/>
+              </w:rPr>
+              <w:t>#team</w:t>
+            </w:r>
+            <w:r>
+              <w:rPr>
+                <w:sz w:val="24"/>
+              </w:rPr>
+              <w:t>): целое от 0 до 500; допускается строка из цифр; отрицательные, дробные и нечисловые значения недопустимы. В разметке: min=0, max=500, step=1.</w:t>
+            </w:r>
+            <w:r>
               <w:br/>
-              <w:t>A5. Повторное нажатие «Отправить» после успешной отправки (шаг 11): игнорируется, вторая запись не создаётся (флаг submitting).</w:t>
+            </w:r>
+            <w:r>
+              <w:rPr>
+                <w:b/>
+                <w:sz w:val="24"/>
+              </w:rPr>
+              <w:t>П5</w:t>
+            </w:r>
+            <w:r>
+              <w:rPr>
+                <w:sz w:val="24"/>
+              </w:rPr>
+              <w:t>. Комментарий (</w:t>
+            </w:r>
+            <w:r>
+              <w:rPr>
+                <w:i/>
+                <w:sz w:val="24"/>
+              </w:rPr>
+              <w:t>#comment</w:t>
+            </w:r>
+            <w:r>
+              <w:rPr>
+                <w:sz w:val="24"/>
+              </w:rPr>
+              <w:t>): не более 500 символов (длина считается без обрезки), поле необязательное. В разметке: maxlength=500, поэтому в браузере больше 500 символов ввести нельзя.</w:t>
+            </w:r>
+            <w:r>
+              <w:br/>
+            </w:r>
+            <w:r>
+              <w:rPr>
+                <w:b/>
+                <w:sz w:val="24"/>
+              </w:rPr>
+              <w:t>П6</w:t>
+            </w:r>
+            <w:r>
+              <w:rPr>
+                <w:sz w:val="24"/>
+              </w:rPr>
+              <w:t>. Согласие (</w:t>
+            </w:r>
+            <w:r>
+              <w:rPr>
+                <w:i/>
+                <w:sz w:val="24"/>
+              </w:rPr>
+              <w:t>#consent</w:t>
+            </w:r>
+            <w:r>
+              <w:rPr>
+                <w:sz w:val="24"/>
+              </w:rPr>
+              <w:t>): флажок обязательно отмечен.</w:t>
+            </w:r>
+            <w:r>
+              <w:br/>
+            </w:r>
+            <w:r>
+              <w:rPr>
+                <w:sz w:val="24"/>
+              </w:rPr>
+              <w:t>Встроенная проверка браузера отключена (form.noValidate), показываются только собственные сообщения сайта.</w:t>
             </w:r>
           </w:p>
         </w:tc>
@@ -353,10 +1183,14 @@
           <w:p>
             <w:r>
               <w:rPr>
+                <w:sz w:val="24"/>
+              </w:rPr>
+            </w:r>
+            <w:r>
+              <w:rPr>
                 <w:b/>
-                <w:sz w:val="24"/>
-              </w:rPr>
-              <w:t>Постусловия</w:t>
+              </w:rPr>
+              <w:t>Альтернативные потоки</w:t>
             </w:r>
           </w:p>
         </w:tc>
@@ -367,11 +1201,139 @@
           <w:p>
             <w:r>
               <w:rPr>
-                <w:sz w:val="24"/>
-              </w:rPr>
-              <w:t>Успех: массив dslkit.waitlist в LocalStorage длиннее на одну запись, открыта страница thanks.html (en/thanks.html).</w:t>
+                <w:b/>
+                <w:sz w:val="24"/>
+              </w:rPr>
+              <w:t>A1</w:t>
+            </w:r>
+            <w:r>
+              <w:rPr>
+                <w:sz w:val="24"/>
+              </w:rPr>
+              <w:t xml:space="preserve">. Одно или несколько полей не прошли проверку (шаг 9): под каждым неверным полем показывается красное сообщение (role=alert, например </w:t>
+            </w:r>
+            <w:r>
+              <w:rPr>
+                <w:b/>
+                <w:sz w:val="24"/>
+              </w:rPr>
+              <w:t>«Имя не принято: поле пустое, короче двух символов или содержит цифры и знаки…»</w:t>
+            </w:r>
+            <w:r>
+              <w:rPr>
+                <w:sz w:val="24"/>
+              </w:rPr>
+              <w:t xml:space="preserve">), поле получает aria-invalid=true, фокус переходит на первое неверное поле в порядке имя, почта, нотация, команда, комментарий, согласие. </w:t>
+            </w:r>
+            <w:r>
+              <w:rPr>
+                <w:b/>
+                <w:sz w:val="24"/>
+              </w:rPr>
+              <w:t>Заявка не сохраняется</w:t>
+            </w:r>
+            <w:r>
+              <w:rPr>
+                <w:sz w:val="24"/>
+              </w:rPr>
+              <w:t>, страница не меняется. Поле с ошибкой перепроверяется при каждом вводе, остальные при выходе из поля. После исправления сообщение скрывается. Сценарий продолжается с шага 8.</w:t>
+            </w:r>
+            <w:r>
               <w:br/>
-              <w:t>Ошибка проверки (A1, A2): записей не добавилось, посетитель остаётся на главной странице, введённые значения остаются в полях.</w:t>
+            </w:r>
+            <w:r>
+              <w:rPr>
+                <w:b/>
+                <w:sz w:val="24"/>
+              </w:rPr>
+              <w:t>A2</w:t>
+            </w:r>
+            <w:r>
+              <w:rPr>
+                <w:sz w:val="24"/>
+              </w:rPr>
+              <w:t xml:space="preserve">. Согласие не отмечено (шаг 9): применяется A1; сообщение </w:t>
+            </w:r>
+            <w:r>
+              <w:rPr>
+                <w:b/>
+                <w:sz w:val="24"/>
+              </w:rPr>
+              <w:t>«Без согласия мы не можем отправить приглашение. Поставьте галочку, чтобы продолжить.»</w:t>
+            </w:r>
+            <w:r>
+              <w:br/>
+            </w:r>
+            <w:r>
+              <w:rPr>
+                <w:b/>
+                <w:sz w:val="24"/>
+              </w:rPr>
+              <w:t>A3</w:t>
+            </w:r>
+            <w:r>
+              <w:rPr>
+                <w:sz w:val="24"/>
+              </w:rPr>
+              <w:t>. Посетитель закрывает страницу или уходит со страницы до шага 8: данные не сохраняются, состояние системы не меняется.</w:t>
+            </w:r>
+            <w:r>
+              <w:br/>
+            </w:r>
+            <w:r>
+              <w:rPr>
+                <w:b/>
+                <w:sz w:val="24"/>
+              </w:rPr>
+              <w:t>A4</w:t>
+            </w:r>
+            <w:r>
+              <w:rPr>
+                <w:sz w:val="24"/>
+              </w:rPr>
+              <w:t xml:space="preserve">. Повторная заявка с тем же адресом (шаг 10): </w:t>
+            </w:r>
+            <w:r>
+              <w:rPr>
+                <w:b/>
+                <w:sz w:val="24"/>
+              </w:rPr>
+              <w:t>принимается как новая отдельная запись</w:t>
+            </w:r>
+            <w:r>
+              <w:rPr>
+                <w:sz w:val="24"/>
+              </w:rPr>
+              <w:t>, сообщения о дубликате нет (дефект D-1).</w:t>
+            </w:r>
+            <w:r>
+              <w:br/>
+            </w:r>
+            <w:r>
+              <w:rPr>
+                <w:b/>
+                <w:sz w:val="24"/>
+              </w:rPr>
+              <w:t>A5</w:t>
+            </w:r>
+            <w:r>
+              <w:rPr>
+                <w:sz w:val="24"/>
+              </w:rPr>
+              <w:t xml:space="preserve">. Повторное нажатие </w:t>
+            </w:r>
+            <w:r>
+              <w:rPr>
+                <w:b/>
+                <w:sz w:val="24"/>
+              </w:rPr>
+              <w:t>«Отправить»</w:t>
+            </w:r>
+            <w:r>
+              <w:rPr>
+                <w:sz w:val="24"/>
+              </w:rPr>
+              <w:t xml:space="preserve"> после успешной отправки (шаг 11): игнорируется, вторая запись не создаётся (флаг submitting).</w:t>
             </w:r>
           </w:p>
         </w:tc>
@@ -385,10 +1347,14 @@
           <w:p>
             <w:r>
               <w:rPr>
+                <w:sz w:val="24"/>
+              </w:rPr>
+            </w:r>
+            <w:r>
+              <w:rPr>
                 <w:b/>
-                <w:sz w:val="24"/>
-              </w:rPr>
-              <w:t>Исключительные ситуации</w:t>
+              </w:rPr>
+              <w:t>Постусловия</w:t>
             </w:r>
           </w:p>
         </w:tc>
@@ -401,9 +1367,68 @@
               <w:rPr>
                 <w:sz w:val="24"/>
               </w:rPr>
-              <w:t>E1. Запись в LocalStorage не удалась (хранилище переполнено или запрещено, шаг 10): метод storage.set возвращает false, но система всё равно открывает страницу благодарности; сообщения об ошибке нет, заявка потеряна (дефект D-2).</w:t>
+              <w:t xml:space="preserve">Успех: массив </w:t>
+            </w:r>
+            <w:r>
+              <w:rPr>
+                <w:i/>
+                <w:sz w:val="24"/>
+              </w:rPr>
+              <w:t>dslkit.waitlist</w:t>
+            </w:r>
+            <w:r>
+              <w:rPr>
+                <w:sz w:val="24"/>
+              </w:rPr>
+              <w:t xml:space="preserve"> в </w:t>
+            </w:r>
+            <w:r>
+              <w:rPr>
+                <w:i/>
+                <w:sz w:val="24"/>
+              </w:rPr>
+              <w:t>LocalStorage</w:t>
+            </w:r>
+            <w:r>
+              <w:rPr>
+                <w:sz w:val="24"/>
+              </w:rPr>
+              <w:t xml:space="preserve"> длиннее на одну запись, открыта страница </w:t>
+            </w:r>
+            <w:r>
+              <w:rPr>
+                <w:i/>
+                <w:sz w:val="24"/>
+              </w:rPr>
+              <w:t>thanks.html</w:t>
+            </w:r>
+            <w:r>
+              <w:rPr>
+                <w:sz w:val="24"/>
+              </w:rPr>
+              <w:t xml:space="preserve"> (en/</w:t>
+            </w:r>
+            <w:r>
+              <w:rPr>
+                <w:i/>
+                <w:sz w:val="24"/>
+              </w:rPr>
+              <w:t>thanks.html</w:t>
+            </w:r>
+            <w:r>
+              <w:rPr>
+                <w:sz w:val="24"/>
+              </w:rPr>
+              <w:t>).</w:t>
+            </w:r>
+            <w:r>
               <w:br/>
-              <w:t>E2. LocalStorage недоступен совсем (getStorage использует временное хранилище в памяти): заявка живёт только до закрытия страницы, посетитель видит страницу благодарности.</w:t>
+            </w:r>
+            <w:r>
+              <w:rPr>
+                <w:sz w:val="24"/>
+              </w:rPr>
+              <w:t>Ошибка проверки (A1, A2): записей не добавилось, посетитель остаётся на главной странице, введённые значения остаются в полях.</w:t>
             </w:r>
           </w:p>
         </w:tc>
@@ -417,10 +1442,14 @@
           <w:p>
             <w:r>
               <w:rPr>
+                <w:sz w:val="24"/>
+              </w:rPr>
+            </w:r>
+            <w:r>
+              <w:rPr>
                 <w:b/>
-                <w:sz w:val="24"/>
-              </w:rPr>
-              <w:t>Связанные требования</w:t>
+              </w:rPr>
+              <w:t>Исключительные ситуации</w:t>
             </w:r>
           </w:p>
         </w:tc>
@@ -431,15 +1460,110 @@
           <w:p>
             <w:r>
               <w:rPr>
-                <w:sz w:val="24"/>
-              </w:rPr>
-              <w:t>R4 — Форма заявки и валидация</w:t>
+                <w:b/>
+                <w:sz w:val="24"/>
+              </w:rPr>
+              <w:t>E1</w:t>
+            </w:r>
+            <w:r>
+              <w:rPr>
+                <w:sz w:val="24"/>
+              </w:rPr>
+              <w:t xml:space="preserve">. Запись в </w:t>
+            </w:r>
+            <w:r>
+              <w:rPr>
+                <w:i/>
+                <w:sz w:val="24"/>
+              </w:rPr>
+              <w:t>LocalStorage</w:t>
+            </w:r>
+            <w:r>
+              <w:rPr>
+                <w:sz w:val="24"/>
+              </w:rPr>
+              <w:t xml:space="preserve"> не удалась (хранилище переполнено или запрещено, шаг 10): метод </w:t>
+            </w:r>
+            <w:r>
+              <w:rPr>
+                <w:i/>
+                <w:sz w:val="24"/>
+              </w:rPr>
+              <w:t>storage.set</w:t>
+            </w:r>
+            <w:r>
+              <w:rPr>
+                <w:sz w:val="24"/>
+              </w:rPr>
+              <w:t xml:space="preserve"> возвращает false, но система всё равно открывает страницу благодарности; </w:t>
+            </w:r>
+            <w:r>
+              <w:rPr>
+                <w:b/>
+                <w:sz w:val="24"/>
+              </w:rPr>
+              <w:t>сообщения об ошибке нет</w:t>
+            </w:r>
+            <w:r>
+              <w:rPr>
+                <w:sz w:val="24"/>
+              </w:rPr>
+              <w:t xml:space="preserve">, </w:t>
+            </w:r>
+            <w:r>
+              <w:rPr>
+                <w:b/>
+                <w:sz w:val="24"/>
+              </w:rPr>
+              <w:t>заявка потеряна</w:t>
+            </w:r>
+            <w:r>
+              <w:rPr>
+                <w:sz w:val="24"/>
+              </w:rPr>
+              <w:t xml:space="preserve"> (дефект D-2).</w:t>
+            </w:r>
+            <w:r>
               <w:br/>
-              <w:t>R1 — Доступность страниц (главная, thanks.html, privacy.html)</w:t>
-              <w:br/>
-              <w:t>R6 — Разметка и локализация (русская и английская версии)</w:t>
-              <w:br/>
-              <w:t>R9 — Локальное хранилище</w:t>
+            </w:r>
+            <w:r>
+              <w:rPr>
+                <w:b/>
+                <w:sz w:val="24"/>
+              </w:rPr>
+              <w:t>E2</w:t>
+            </w:r>
+            <w:r>
+              <w:rPr>
+                <w:sz w:val="24"/>
+              </w:rPr>
+              <w:t xml:space="preserve">. </w:t>
+            </w:r>
+            <w:r>
+              <w:rPr>
+                <w:i/>
+                <w:sz w:val="24"/>
+              </w:rPr>
+              <w:t>LocalStorage</w:t>
+            </w:r>
+            <w:r>
+              <w:rPr>
+                <w:sz w:val="24"/>
+              </w:rPr>
+              <w:t xml:space="preserve"> недоступен совсем (</w:t>
+            </w:r>
+            <w:r>
+              <w:rPr>
+                <w:i/>
+                <w:sz w:val="24"/>
+              </w:rPr>
+              <w:t>getStorage</w:t>
+            </w:r>
+            <w:r>
+              <w:rPr>
+                <w:sz w:val="24"/>
+              </w:rPr>
+              <w:t xml:space="preserve"> использует временное хранилище в памяти): заявка живёт только до закрытия страницы, посетитель видит страницу благодарности.</w:t>
             </w:r>
           </w:p>
         </w:tc>
@@ -453,10 +1577,14 @@
           <w:p>
             <w:r>
               <w:rPr>
+                <w:sz w:val="24"/>
+              </w:rPr>
+            </w:r>
+            <w:r>
+              <w:rPr>
                 <w:b/>
-                <w:sz w:val="24"/>
-              </w:rPr>
-              <w:t>Подзадачи</w:t>
+              </w:rPr>
+              <w:t>Связанные требования</w:t>
             </w:r>
           </w:p>
         </w:tc>
@@ -467,17 +1595,90 @@
           <w:p>
             <w:r>
               <w:rPr>
-                <w:sz w:val="24"/>
-              </w:rPr>
-              <w:t>UC-01.1 — Показ формы и подсказок к полям</w:t>
+                <w:b/>
+                <w:sz w:val="24"/>
+              </w:rPr>
+              <w:t>R4</w:t>
+            </w:r>
+            <w:r>
+              <w:rPr>
+                <w:sz w:val="24"/>
+              </w:rPr>
+              <w:t xml:space="preserve"> — Форма заявки и валидация</w:t>
+            </w:r>
+            <w:r>
               <w:br/>
-              <w:t>UC-01.2 — Чтение, очистка и проверка значений по П1–П6</w:t>
+            </w:r>
+            <w:r>
+              <w:rPr>
+                <w:b/>
+                <w:sz w:val="24"/>
+              </w:rPr>
+              <w:t>R1</w:t>
+            </w:r>
+            <w:r>
+              <w:rPr>
+                <w:sz w:val="24"/>
+              </w:rPr>
+              <w:t xml:space="preserve"> — Доступность страниц (главная, </w:t>
+            </w:r>
+            <w:r>
+              <w:rPr>
+                <w:i/>
+                <w:sz w:val="24"/>
+              </w:rPr>
+              <w:t>thanks.html</w:t>
+            </w:r>
+            <w:r>
+              <w:rPr>
+                <w:sz w:val="24"/>
+              </w:rPr>
+              <w:t xml:space="preserve">, </w:t>
+            </w:r>
+            <w:r>
+              <w:rPr>
+                <w:i/>
+                <w:sz w:val="24"/>
+              </w:rPr>
+              <w:t>privacy.html</w:t>
+            </w:r>
+            <w:r>
+              <w:rPr>
+                <w:sz w:val="24"/>
+              </w:rPr>
+              <w:t>)</w:t>
+            </w:r>
+            <w:r>
               <w:br/>
-              <w:t>UC-01.3 — Показ ошибок, фокус и повторная проверка</w:t>
+            </w:r>
+            <w:r>
+              <w:rPr>
+                <w:b/>
+                <w:sz w:val="24"/>
+              </w:rPr>
+              <w:t>R6</w:t>
+            </w:r>
+            <w:r>
+              <w:rPr>
+                <w:sz w:val="24"/>
+              </w:rPr>
+              <w:t xml:space="preserve"> — Разметка и локализация (русская и английская версии)</w:t>
+            </w:r>
+            <w:r>
               <w:br/>
-              <w:t>UC-01.4 — Сохранение заявки в LocalStorage</w:t>
-              <w:br/>
-              <w:t>UC-01.5 — Переход на страницу благодарности</w:t>
+            </w:r>
+            <w:r>
+              <w:rPr>
+                <w:b/>
+                <w:sz w:val="24"/>
+              </w:rPr>
+              <w:t>R9</w:t>
+            </w:r>
+            <w:r>
+              <w:rPr>
+                <w:sz w:val="24"/>
+              </w:rPr>
+              <w:t xml:space="preserve"> — Локальное хранилище</w:t>
             </w:r>
           </w:p>
         </w:tc>
@@ -491,10 +1692,14 @@
           <w:p>
             <w:r>
               <w:rPr>
+                <w:sz w:val="24"/>
+              </w:rPr>
+            </w:r>
+            <w:r>
+              <w:rPr>
                 <w:b/>
-                <w:sz w:val="24"/>
-              </w:rPr>
-              <w:t>Связанные задачи и use case</w:t>
+              </w:rPr>
+              <w:t>Подзадачи</w:t>
             </w:r>
           </w:p>
         </w:tc>
@@ -505,15 +1710,87 @@
           <w:p>
             <w:r>
               <w:rPr>
-                <w:sz w:val="24"/>
-              </w:rPr>
-              <w:t>UC-00 — Прочитать политику конфиденциальности (ссылка в тексте согласия, privacy.html)</w:t>
+                <w:b/>
+                <w:sz w:val="24"/>
+              </w:rPr>
+              <w:t>UC-01.1</w:t>
+            </w:r>
+            <w:r>
+              <w:rPr>
+                <w:sz w:val="24"/>
+              </w:rPr>
+              <w:t xml:space="preserve"> — Показ формы и подсказок к полям</w:t>
+            </w:r>
+            <w:r>
               <w:br/>
-              <w:t>UC-02 — Выбрать нотацию на карточке и перейти к записи (ссылки «Записаться в бету: UML», «…: BPMN»)</w:t>
+            </w:r>
+            <w:r>
+              <w:rPr>
+                <w:b/>
+                <w:sz w:val="24"/>
+              </w:rPr>
+              <w:t>UC-01.2</w:t>
+            </w:r>
+            <w:r>
+              <w:rPr>
+                <w:sz w:val="24"/>
+              </w:rPr>
+              <w:t xml:space="preserve"> — Чтение, очистка и проверка значений по П1–П6</w:t>
+            </w:r>
+            <w:r>
               <w:br/>
-              <w:t>D-1 — Повторные заявки принимаются</w:t>
+            </w:r>
+            <w:r>
+              <w:rPr>
+                <w:b/>
+                <w:sz w:val="24"/>
+              </w:rPr>
+              <w:t>UC-01.3</w:t>
+            </w:r>
+            <w:r>
+              <w:rPr>
+                <w:sz w:val="24"/>
+              </w:rPr>
+              <w:t xml:space="preserve"> — Показ ошибок, фокус и повторная проверка</w:t>
+            </w:r>
+            <w:r>
               <w:br/>
-              <w:t>D-2 — Потеря заявки при сбое хранилища</w:t>
+            </w:r>
+            <w:r>
+              <w:rPr>
+                <w:b/>
+                <w:sz w:val="24"/>
+              </w:rPr>
+              <w:t>UC-01.4</w:t>
+            </w:r>
+            <w:r>
+              <w:rPr>
+                <w:sz w:val="24"/>
+              </w:rPr>
+              <w:t xml:space="preserve"> — Сохранение заявки в </w:t>
+            </w:r>
+            <w:r>
+              <w:rPr>
+                <w:i/>
+                <w:sz w:val="24"/>
+              </w:rPr>
+              <w:t>LocalStorage</w:t>
+            </w:r>
+            <w:r>
+              <w:br/>
+            </w:r>
+            <w:r>
+              <w:rPr>
+                <w:b/>
+                <w:sz w:val="24"/>
+              </w:rPr>
+              <w:t>UC-01.5</w:t>
+            </w:r>
+            <w:r>
+              <w:rPr>
+                <w:sz w:val="24"/>
+              </w:rPr>
+              <w:t xml:space="preserve"> — Переход на страницу благодарности</w:t>
             </w:r>
           </w:p>
         </w:tc>
@@ -527,10 +1804,14 @@
           <w:p>
             <w:r>
               <w:rPr>
+                <w:sz w:val="24"/>
+              </w:rPr>
+            </w:r>
+            <w:r>
+              <w:rPr>
                 <w:b/>
-                <w:sz w:val="24"/>
-              </w:rPr>
-              <w:t>Реализация</w:t>
+              </w:rPr>
+              <w:t>Связанные задачи и use case</w:t>
             </w:r>
           </w:p>
         </w:tc>
@@ -541,17 +1822,103 @@
           <w:p>
             <w:r>
               <w:rPr>
-                <w:sz w:val="24"/>
-              </w:rPr>
-              <w:t>IMPL-01 — site/index.html: разметка формы #waitlist-form</w:t>
+                <w:b/>
+                <w:sz w:val="24"/>
+              </w:rPr>
+              <w:t>UC-00</w:t>
+            </w:r>
+            <w:r>
+              <w:rPr>
+                <w:sz w:val="24"/>
+              </w:rPr>
+              <w:t xml:space="preserve"> — Прочитать политику конфиденциальности (ссылка в тексте согласия, </w:t>
+            </w:r>
+            <w:r>
+              <w:rPr>
+                <w:i/>
+                <w:sz w:val="24"/>
+              </w:rPr>
+              <w:t>privacy.html</w:t>
+            </w:r>
+            <w:r>
+              <w:rPr>
+                <w:sz w:val="24"/>
+              </w:rPr>
+              <w:t>)</w:t>
+            </w:r>
+            <w:r>
               <w:br/>
-              <w:t>IMPL-02 — site/js/components/waitlist-form.js: initWaitlistForm, показ ошибок, отправка</w:t>
+            </w:r>
+            <w:r>
+              <w:rPr>
+                <w:b/>
+                <w:sz w:val="24"/>
+              </w:rPr>
+              <w:t>UC-02</w:t>
+            </w:r>
+            <w:r>
+              <w:rPr>
+                <w:sz w:val="24"/>
+              </w:rPr>
+              <w:t xml:space="preserve"> — Выбрать нотацию на карточке и перейти к записи (ссылки </w:t>
+            </w:r>
+            <w:r>
+              <w:rPr>
+                <w:b/>
+                <w:sz w:val="24"/>
+              </w:rPr>
+              <w:t>«Записаться в бету: UML»</w:t>
+            </w:r>
+            <w:r>
+              <w:rPr>
+                <w:sz w:val="24"/>
+              </w:rPr>
+              <w:t xml:space="preserve">, </w:t>
+            </w:r>
+            <w:r>
+              <w:rPr>
+                <w:b/>
+                <w:sz w:val="24"/>
+              </w:rPr>
+              <w:t>«…: BPMN»</w:t>
+            </w:r>
+            <w:r>
+              <w:rPr>
+                <w:sz w:val="24"/>
+              </w:rPr>
+              <w:t>)</w:t>
+            </w:r>
+            <w:r>
               <w:br/>
-              <w:t>IMPL-03 — site/js/utils/validation.js: validateWaitlist и правила П1–П6</w:t>
+            </w:r>
+            <w:r>
+              <w:rPr>
+                <w:b/>
+                <w:sz w:val="24"/>
+              </w:rPr>
+              <w:t>D-1</w:t>
+            </w:r>
+            <w:r>
+              <w:rPr>
+                <w:sz w:val="24"/>
+              </w:rPr>
+              <w:t xml:space="preserve"> — Повторные заявки принимаются</w:t>
+            </w:r>
+            <w:r>
               <w:br/>
-              <w:t>IMPL-04 — site/js/utils/storage.js: createStorage, getStorage</w:t>
-              <w:br/>
-              <w:t>IMPL-05 — site/thanks.html и site/en/thanks.html: страница благодарности</w:t>
+            </w:r>
+            <w:r>
+              <w:rPr>
+                <w:b/>
+                <w:sz w:val="24"/>
+              </w:rPr>
+              <w:t>D-2</w:t>
+            </w:r>
+            <w:r>
+              <w:rPr>
+                <w:sz w:val="24"/>
+              </w:rPr>
+              <w:t xml:space="preserve"> — Потеря заявки при сбое хранилища</w:t>
             </w:r>
           </w:p>
         </w:tc>
@@ -565,10 +1932,14 @@
           <w:p>
             <w:r>
               <w:rPr>
+                <w:sz w:val="24"/>
+              </w:rPr>
+            </w:r>
+            <w:r>
+              <w:rPr>
                 <w:b/>
-                <w:sz w:val="24"/>
-              </w:rPr>
-              <w:t>Тест-кейсы и проверки</w:t>
+              </w:rPr>
+              <w:t>Реализация</w:t>
             </w:r>
           </w:p>
         </w:tc>
@@ -579,29 +1950,198 @@
           <w:p>
             <w:r>
               <w:rPr>
-                <w:sz w:val="24"/>
-              </w:rPr>
-              <w:t>TC-WL-001 — Все поля корректны</w:t>
+                <w:b/>
+                <w:sz w:val="24"/>
+              </w:rPr>
+              <w:t>IMPL-01</w:t>
+            </w:r>
+            <w:r>
+              <w:rPr>
+                <w:sz w:val="24"/>
+              </w:rPr>
+              <w:t xml:space="preserve"> — </w:t>
+            </w:r>
+            <w:r>
+              <w:rPr>
+                <w:i/>
+                <w:sz w:val="24"/>
+              </w:rPr>
+              <w:t>site/index.html</w:t>
+            </w:r>
+            <w:r>
+              <w:rPr>
+                <w:sz w:val="24"/>
+              </w:rPr>
+              <w:t xml:space="preserve">: разметка формы </w:t>
+            </w:r>
+            <w:r>
+              <w:rPr>
+                <w:i/>
+                <w:sz w:val="24"/>
+              </w:rPr>
+              <w:t>#waitlist-form</w:t>
+            </w:r>
+            <w:r>
               <w:br/>
-              <w:t>TC-WL-002…007 — Имя: границы и недопустимые символы (П1)</w:t>
+            </w:r>
+            <w:r>
+              <w:rPr>
+                <w:b/>
+                <w:sz w:val="24"/>
+              </w:rPr>
+              <w:t>IMPL-02</w:t>
+            </w:r>
+            <w:r>
+              <w:rPr>
+                <w:sz w:val="24"/>
+              </w:rPr>
+              <w:t xml:space="preserve"> — </w:t>
+            </w:r>
+            <w:r>
+              <w:rPr>
+                <w:i/>
+                <w:sz w:val="24"/>
+              </w:rPr>
+              <w:t>site/js/components/waitlist-form.js</w:t>
+            </w:r>
+            <w:r>
+              <w:rPr>
+                <w:sz w:val="24"/>
+              </w:rPr>
+              <w:t xml:space="preserve">: </w:t>
+            </w:r>
+            <w:r>
+              <w:rPr>
+                <w:i/>
+                <w:sz w:val="24"/>
+              </w:rPr>
+              <w:t>initWaitlistForm</w:t>
+            </w:r>
+            <w:r>
+              <w:rPr>
+                <w:sz w:val="24"/>
+              </w:rPr>
+              <w:t>, показ ошибок, отправка</w:t>
+            </w:r>
+            <w:r>
               <w:br/>
-              <w:t>TC-WL-008…011 — Почта: формат и длина (П2)</w:t>
+            </w:r>
+            <w:r>
+              <w:rPr>
+                <w:b/>
+                <w:sz w:val="24"/>
+              </w:rPr>
+              <w:t>IMPL-03</w:t>
+            </w:r>
+            <w:r>
+              <w:rPr>
+                <w:sz w:val="24"/>
+              </w:rPr>
+              <w:t xml:space="preserve"> — </w:t>
+            </w:r>
+            <w:r>
+              <w:rPr>
+                <w:i/>
+                <w:sz w:val="24"/>
+              </w:rPr>
+              <w:t>site/js/utils/validation.js</w:t>
+            </w:r>
+            <w:r>
+              <w:rPr>
+                <w:sz w:val="24"/>
+              </w:rPr>
+              <w:t xml:space="preserve">: </w:t>
+            </w:r>
+            <w:r>
+              <w:rPr>
+                <w:i/>
+                <w:sz w:val="24"/>
+              </w:rPr>
+              <w:t>validateWaitlist</w:t>
+            </w:r>
+            <w:r>
+              <w:rPr>
+                <w:sz w:val="24"/>
+              </w:rPr>
+              <w:t xml:space="preserve"> и правила П1–П6</w:t>
+            </w:r>
+            <w:r>
               <w:br/>
-              <w:t>TC-WL-012…017 — Размер команды: границы и тип (П4)</w:t>
+            </w:r>
+            <w:r>
+              <w:rPr>
+                <w:b/>
+                <w:sz w:val="24"/>
+              </w:rPr>
+              <w:t>IMPL-04</w:t>
+            </w:r>
+            <w:r>
+              <w:rPr>
+                <w:sz w:val="24"/>
+              </w:rPr>
+              <w:t xml:space="preserve"> — </w:t>
+            </w:r>
+            <w:r>
+              <w:rPr>
+                <w:i/>
+                <w:sz w:val="24"/>
+              </w:rPr>
+              <w:t>site/js/utils/storage.js</w:t>
+            </w:r>
+            <w:r>
+              <w:rPr>
+                <w:sz w:val="24"/>
+              </w:rPr>
+              <w:t xml:space="preserve">: createStorage, </w:t>
+            </w:r>
+            <w:r>
+              <w:rPr>
+                <w:i/>
+                <w:sz w:val="24"/>
+              </w:rPr>
+              <w:t>getStorage</w:t>
+            </w:r>
+            <w:r>
               <w:br/>
-              <w:t>TC-WL-018 — Нотация вне списка (П3)</w:t>
-              <w:br/>
-              <w:t>TC-WL-019, 020 — Комментарий: граница 500 (П5)</w:t>
-              <w:br/>
-              <w:t>TC-WL-021 — Согласие не дано (П6)</w:t>
-              <w:br/>
-              <w:t>TC-WL-022 — Пустая форма (A1)</w:t>
-              <w:br/>
-              <w:t>SM-07 — Форма заявки есть на главной</w:t>
-              <w:br/>
-              <w:t>CP-35 — Валидация корректной заявки</w:t>
-              <w:br/>
-              <w:t>CP-36 — У полей есть подписи и сообщения об ошибках</w:t>
+            </w:r>
+            <w:r>
+              <w:rPr>
+                <w:b/>
+                <w:sz w:val="24"/>
+              </w:rPr>
+              <w:t>IMPL-05</w:t>
+            </w:r>
+            <w:r>
+              <w:rPr>
+                <w:sz w:val="24"/>
+              </w:rPr>
+              <w:t xml:space="preserve"> — </w:t>
+            </w:r>
+            <w:r>
+              <w:rPr>
+                <w:i/>
+                <w:sz w:val="24"/>
+              </w:rPr>
+              <w:t>site/thanks.html</w:t>
+            </w:r>
+            <w:r>
+              <w:rPr>
+                <w:sz w:val="24"/>
+              </w:rPr>
+              <w:t xml:space="preserve"> и </w:t>
+            </w:r>
+            <w:r>
+              <w:rPr>
+                <w:i/>
+                <w:sz w:val="24"/>
+              </w:rPr>
+              <w:t>site/en/thanks.html</w:t>
+            </w:r>
+            <w:r>
+              <w:rPr>
+                <w:sz w:val="24"/>
+              </w:rPr>
+              <w:t>: страница благодарности</w:t>
             </w:r>
           </w:p>
         </w:tc>
@@ -615,10 +2155,14 @@
           <w:p>
             <w:r>
               <w:rPr>
+                <w:sz w:val="24"/>
+              </w:rPr>
+            </w:r>
+            <w:r>
+              <w:rPr>
                 <w:b/>
-                <w:sz w:val="24"/>
-              </w:rPr>
-              <w:t>Скриншоты интерфейса</w:t>
+              </w:rPr>
+              <w:t>Тест-кейсы и проверки</w:t>
             </w:r>
           </w:p>
         </w:tc>
@@ -629,21 +2173,176 @@
           <w:p>
             <w:r>
               <w:rPr>
-                <w:sz w:val="24"/>
-              </w:rPr>
-              <w:t>SCR-01 — Главная страница, русская версия (01-home.png)</w:t>
+                <w:b/>
+                <w:sz w:val="24"/>
+              </w:rPr>
+              <w:t>TC-WL-001</w:t>
+            </w:r>
+            <w:r>
+              <w:rPr>
+                <w:sz w:val="24"/>
+              </w:rPr>
+              <w:t xml:space="preserve"> — Все поля корректны</w:t>
+            </w:r>
+            <w:r>
               <w:br/>
-              <w:t>SCR-02 — Главная страница, английская версия (02-home-en.png)</w:t>
+            </w:r>
+            <w:r>
+              <w:rPr>
+                <w:b/>
+                <w:sz w:val="24"/>
+              </w:rPr>
+              <w:t>TC-WL-002…007</w:t>
+            </w:r>
+            <w:r>
+              <w:rPr>
+                <w:sz w:val="24"/>
+              </w:rPr>
+              <w:t xml:space="preserve"> — Имя: границы и недопустимые символы (П1)</w:t>
+            </w:r>
+            <w:r>
               <w:br/>
-              <w:t>SCR-03 — Форма заявки: ошибки при пустой отправке (03-form-errors.png)</w:t>
+            </w:r>
+            <w:r>
+              <w:rPr>
+                <w:b/>
+                <w:sz w:val="24"/>
+              </w:rPr>
+              <w:t>TC-WL-008…011</w:t>
+            </w:r>
+            <w:r>
+              <w:rPr>
+                <w:sz w:val="24"/>
+              </w:rPr>
+              <w:t xml:space="preserve"> — Почта: формат и длина (П2)</w:t>
+            </w:r>
+            <w:r>
               <w:br/>
-              <w:t>SCR-04 — Форма заявки: заполнена корректными данными (04-form-filled.png)</w:t>
+            </w:r>
+            <w:r>
+              <w:rPr>
+                <w:b/>
+                <w:sz w:val="24"/>
+              </w:rPr>
+              <w:t>TC-WL-012…017</w:t>
+            </w:r>
+            <w:r>
+              <w:rPr>
+                <w:sz w:val="24"/>
+              </w:rPr>
+              <w:t xml:space="preserve"> — Размер команды: границы и тип (П4)</w:t>
+            </w:r>
+            <w:r>
               <w:br/>
-              <w:t>SCR-05 — Страница благодарности (05-form-submitted.png)</w:t>
+            </w:r>
+            <w:r>
+              <w:rPr>
+                <w:b/>
+                <w:sz w:val="24"/>
+              </w:rPr>
+              <w:t>TC-WL-018</w:t>
+            </w:r>
+            <w:r>
+              <w:rPr>
+                <w:sz w:val="24"/>
+              </w:rPr>
+              <w:t xml:space="preserve"> — Нотация вне списка (П3)</w:t>
+            </w:r>
+            <w:r>
               <w:br/>
-              <w:t>SCR-06 — Запись заявки в LocalStorage (12-uc-storage-record.png)</w:t>
+            </w:r>
+            <w:r>
+              <w:rPr>
+                <w:b/>
+                <w:sz w:val="24"/>
+              </w:rPr>
+              <w:t>TC-WL-019, 020</w:t>
+            </w:r>
+            <w:r>
+              <w:rPr>
+                <w:sz w:val="24"/>
+              </w:rPr>
+              <w:t xml:space="preserve"> — Комментарий: граница 500 (П5)</w:t>
+            </w:r>
+            <w:r>
               <w:br/>
-              <w:t>SCR-07 — Сбой записи: страница благодарности без ошибки (13-uc-storage-failure.png)</w:t>
+            </w:r>
+            <w:r>
+              <w:rPr>
+                <w:b/>
+                <w:sz w:val="24"/>
+              </w:rPr>
+              <w:t>TC-WL-021</w:t>
+            </w:r>
+            <w:r>
+              <w:rPr>
+                <w:sz w:val="24"/>
+              </w:rPr>
+              <w:t xml:space="preserve"> — Согласие не дано (П6)</w:t>
+            </w:r>
+            <w:r>
+              <w:br/>
+            </w:r>
+            <w:r>
+              <w:rPr>
+                <w:b/>
+                <w:sz w:val="24"/>
+              </w:rPr>
+              <w:t>TC-WL-022</w:t>
+            </w:r>
+            <w:r>
+              <w:rPr>
+                <w:sz w:val="24"/>
+              </w:rPr>
+              <w:t xml:space="preserve"> — Пустая форма (A1)</w:t>
+            </w:r>
+            <w:r>
+              <w:br/>
+            </w:r>
+            <w:r>
+              <w:rPr>
+                <w:b/>
+                <w:sz w:val="24"/>
+              </w:rPr>
+              <w:t>SM-07</w:t>
+            </w:r>
+            <w:r>
+              <w:rPr>
+                <w:sz w:val="24"/>
+              </w:rPr>
+              <w:t xml:space="preserve"> — Форма заявки есть на главной</w:t>
+            </w:r>
+            <w:r>
+              <w:br/>
+            </w:r>
+            <w:r>
+              <w:rPr>
+                <w:b/>
+                <w:sz w:val="24"/>
+              </w:rPr>
+              <w:t>CP-35</w:t>
+            </w:r>
+            <w:r>
+              <w:rPr>
+                <w:sz w:val="24"/>
+              </w:rPr>
+              <w:t xml:space="preserve"> — Валидация корректной заявки</w:t>
+            </w:r>
+            <w:r>
+              <w:br/>
+            </w:r>
+            <w:r>
+              <w:rPr>
+                <w:b/>
+                <w:sz w:val="24"/>
+              </w:rPr>
+              <w:t>CP-36</w:t>
+            </w:r>
+            <w:r>
+              <w:rPr>
+                <w:sz w:val="24"/>
+              </w:rPr>
+              <w:t xml:space="preserve"> — У полей есть подписи и сообщения об ошибках</w:t>
             </w:r>
           </w:p>
         </w:tc>
@@ -657,8 +2356,162 @@
           <w:p>
             <w:r>
               <w:rPr>
+                <w:sz w:val="24"/>
+              </w:rPr>
+            </w:r>
+            <w:r>
+              <w:rPr>
                 <w:b/>
-                <w:sz w:val="24"/>
+              </w:rPr>
+              <w:t>Скриншоты интерфейса</w:t>
+            </w:r>
+          </w:p>
+        </w:tc>
+        <w:tc>
+          <w:tcPr>
+            <w:tcW w:type="dxa" w:w="7370"/>
+          </w:tcPr>
+          <w:p>
+            <w:r>
+              <w:rPr>
+                <w:b/>
+                <w:sz w:val="24"/>
+              </w:rPr>
+              <w:t>SCR-01</w:t>
+            </w:r>
+            <w:r>
+              <w:rPr>
+                <w:sz w:val="24"/>
+              </w:rPr>
+              <w:t xml:space="preserve"> — Главная страница, русская версия (01-home.png)</w:t>
+            </w:r>
+            <w:r>
+              <w:br/>
+            </w:r>
+            <w:r>
+              <w:rPr>
+                <w:b/>
+                <w:sz w:val="24"/>
+              </w:rPr>
+              <w:t>SCR-02</w:t>
+            </w:r>
+            <w:r>
+              <w:rPr>
+                <w:sz w:val="24"/>
+              </w:rPr>
+              <w:t xml:space="preserve"> — Главная страница, английская версия (02-home-en.png)</w:t>
+            </w:r>
+            <w:r>
+              <w:br/>
+            </w:r>
+            <w:r>
+              <w:rPr>
+                <w:b/>
+                <w:sz w:val="24"/>
+              </w:rPr>
+              <w:t>SCR-03</w:t>
+            </w:r>
+            <w:r>
+              <w:rPr>
+                <w:sz w:val="24"/>
+              </w:rPr>
+              <w:t xml:space="preserve"> — Форма заявки: ошибки при пустой отправке (03-form-errors.png)</w:t>
+            </w:r>
+            <w:r>
+              <w:br/>
+            </w:r>
+            <w:r>
+              <w:rPr>
+                <w:b/>
+                <w:sz w:val="24"/>
+              </w:rPr>
+              <w:t>SCR-04</w:t>
+            </w:r>
+            <w:r>
+              <w:rPr>
+                <w:sz w:val="24"/>
+              </w:rPr>
+              <w:t xml:space="preserve"> — Форма заявки: заполнена корректными данными (04-form-filled.png)</w:t>
+            </w:r>
+            <w:r>
+              <w:br/>
+            </w:r>
+            <w:r>
+              <w:rPr>
+                <w:b/>
+                <w:sz w:val="24"/>
+              </w:rPr>
+              <w:t>SCR-05</w:t>
+            </w:r>
+            <w:r>
+              <w:rPr>
+                <w:sz w:val="24"/>
+              </w:rPr>
+              <w:t xml:space="preserve"> — Страница благодарности (05-form-submitted.png)</w:t>
+            </w:r>
+            <w:r>
+              <w:br/>
+            </w:r>
+            <w:r>
+              <w:rPr>
+                <w:b/>
+                <w:sz w:val="24"/>
+              </w:rPr>
+              <w:t>SCR-06</w:t>
+            </w:r>
+            <w:r>
+              <w:rPr>
+                <w:sz w:val="24"/>
+              </w:rPr>
+              <w:t xml:space="preserve"> — Запись заявки в </w:t>
+            </w:r>
+            <w:r>
+              <w:rPr>
+                <w:i/>
+                <w:sz w:val="24"/>
+              </w:rPr>
+              <w:t>LocalStorage</w:t>
+            </w:r>
+            <w:r>
+              <w:rPr>
+                <w:sz w:val="24"/>
+              </w:rPr>
+              <w:t xml:space="preserve"> (12-uc-storage-record.png)</w:t>
+            </w:r>
+            <w:r>
+              <w:br/>
+            </w:r>
+            <w:r>
+              <w:rPr>
+                <w:b/>
+                <w:sz w:val="24"/>
+              </w:rPr>
+              <w:t>SCR-07</w:t>
+            </w:r>
+            <w:r>
+              <w:rPr>
+                <w:sz w:val="24"/>
+              </w:rPr>
+              <w:t xml:space="preserve"> — Сбой записи: страница благодарности без ошибки (13-uc-storage-failure.png)</w:t>
+            </w:r>
+          </w:p>
+        </w:tc>
+      </w:tr>
+      <w:tr>
+        <w:tc>
+          <w:tcPr>
+            <w:tcW w:type="dxa" w:w="2381"/>
+            <w:shd w:val="clear" w:fill="F2F2F2"/>
+          </w:tcPr>
+          <w:p>
+            <w:r>
+              <w:rPr>
+                <w:sz w:val="24"/>
+              </w:rPr>
+            </w:r>
+            <w:r>
+              <w:rPr>
+                <w:b/>
               </w:rPr>
               <w:t>Ссылки</w:t>
             </w:r>
@@ -674,25 +2527,95 @@
                 <w:sz w:val="24"/>
               </w:rPr>
               <w:t>Страницы проекта (при запущенном npm start):</w:t>
+            </w:r>
+            <w:r>
               <w:br/>
+            </w:r>
+            <w:r>
+              <w:rPr>
+                <w:sz w:val="24"/>
+              </w:rPr>
               <w:t>http://localhost:5173/ — главная страница (русская версия)</w:t>
+            </w:r>
+            <w:r>
               <w:br/>
+            </w:r>
+            <w:r>
+              <w:rPr>
+                <w:sz w:val="24"/>
+              </w:rPr>
               <w:t>http://localhost:5173/#waitlist — раздел «Записаться в бету»</w:t>
+            </w:r>
+            <w:r>
               <w:br/>
+            </w:r>
+            <w:r>
+              <w:rPr>
+                <w:sz w:val="24"/>
+              </w:rPr>
               <w:t>http://localhost:5173/thanks.html — страница благодарности</w:t>
+            </w:r>
+            <w:r>
               <w:br/>
+            </w:r>
+            <w:r>
+              <w:rPr>
+                <w:sz w:val="24"/>
+              </w:rPr>
               <w:t>http://localhost:5173/privacy.html — политика конфиденциальности</w:t>
+            </w:r>
+            <w:r>
               <w:br/>
+            </w:r>
+            <w:r>
+              <w:rPr>
+                <w:sz w:val="24"/>
+              </w:rPr>
               <w:t>http://localhost:5173/en/ — главная страница (английская версия)</w:t>
+            </w:r>
+            <w:r>
               <w:br/>
+            </w:r>
+            <w:r>
+              <w:rPr>
+                <w:sz w:val="24"/>
+              </w:rPr>
               <w:t>http://localhost:5173/en/thanks.html — страница благодарности (английская версия)</w:t>
+            </w:r>
+            <w:r>
               <w:br/>
+            </w:r>
+            <w:r>
+              <w:rPr>
+                <w:sz w:val="24"/>
+              </w:rPr>
               <w:t>Репозиторий и источники:</w:t>
+            </w:r>
+            <w:r>
               <w:br/>
+            </w:r>
+            <w:r>
+              <w:rPr>
+                <w:sz w:val="24"/>
+              </w:rPr>
               <w:t>https://github.com/KsushaKhadzhinova/DSLKit-Project — репозиторий проекта</w:t>
+            </w:r>
+            <w:r>
               <w:br/>
+            </w:r>
+            <w:r>
+              <w:rPr>
+                <w:sz w:val="24"/>
+              </w:rPr>
               <w:t>https://svyatoslav.biz/software_testing_book/ — книга «Тестирование программного обеспечения. Базовый курс»</w:t>
+            </w:r>
+            <w:r>
               <w:br/>
+            </w:r>
+            <w:r>
+              <w:rPr>
+                <w:sz w:val="24"/>
+              </w:rPr>
               <w:t>https://github.com/KsushaKhadzhinova/report-gen — генератор отчётов</w:t>
             </w:r>
           </w:p>
@@ -700,6 +2623,870 @@
       </w:tr>
     </w:tbl>
     <w:p/>
+    <w:p>
+      <w:pPr>
+        <w:pStyle w:val="Heading2"/>
+      </w:pPr>
+      <w:r>
+        <w:t>Данные формы: типы и допустимые значения</w:t>
+      </w:r>
+    </w:p>
+    <w:tbl>
+      <w:tblPr>
+        <w:tblStyle w:val="TableGrid"/>
+        <w:tblW w:type="auto" w:w="0"/>
+        <w:tblLook w:firstColumn="1" w:firstRow="1" w:lastColumn="0" w:lastRow="0" w:noHBand="0" w:noVBand="1" w:val="04A0"/>
+      </w:tblPr>
+      <w:tblGrid>
+        <w:gridCol w:w="1700"/>
+        <w:gridCol w:w="1700"/>
+        <w:gridCol w:w="1700"/>
+        <w:gridCol w:w="1700"/>
+        <w:gridCol w:w="1700"/>
+        <w:gridCol w:w="1700"/>
+      </w:tblGrid>
+      <w:tr>
+        <w:tc>
+          <w:tcPr>
+            <w:tcW w:type="dxa" w:w="1474"/>
+            <w:shd w:val="clear" w:fill="D9E2F3"/>
+          </w:tcPr>
+          <w:p>
+            <w:r>
+              <w:rPr>
+                <w:sz w:val="24"/>
+              </w:rPr>
+            </w:r>
+            <w:r>
+              <w:rPr>
+                <w:b/>
+                <w:sz w:val="24"/>
+              </w:rPr>
+              <w:t>Поле</w:t>
+            </w:r>
+          </w:p>
+        </w:tc>
+        <w:tc>
+          <w:tcPr>
+            <w:tcW w:type="dxa" w:w="1474"/>
+            <w:shd w:val="clear" w:fill="D9E2F3"/>
+          </w:tcPr>
+          <w:p>
+            <w:r>
+              <w:rPr>
+                <w:sz w:val="24"/>
+              </w:rPr>
+            </w:r>
+            <w:r>
+              <w:rPr>
+                <w:b/>
+                <w:sz w:val="24"/>
+              </w:rPr>
+              <w:t>Тип данных</w:t>
+            </w:r>
+          </w:p>
+        </w:tc>
+        <w:tc>
+          <w:tcPr>
+            <w:tcW w:type="dxa" w:w="1020"/>
+            <w:shd w:val="clear" w:fill="D9E2F3"/>
+          </w:tcPr>
+          <w:p>
+            <w:r>
+              <w:rPr>
+                <w:sz w:val="24"/>
+              </w:rPr>
+            </w:r>
+            <w:r>
+              <w:rPr>
+                <w:b/>
+                <w:sz w:val="24"/>
+              </w:rPr>
+              <w:t>Обяза-тельно</w:t>
+            </w:r>
+          </w:p>
+        </w:tc>
+        <w:tc>
+          <w:tcPr>
+            <w:tcW w:type="dxa" w:w="1134"/>
+            <w:shd w:val="clear" w:fill="D9E2F3"/>
+          </w:tcPr>
+          <w:p>
+            <w:r>
+              <w:rPr>
+                <w:sz w:val="24"/>
+              </w:rPr>
+            </w:r>
+            <w:r>
+              <w:rPr>
+                <w:b/>
+                <w:sz w:val="24"/>
+              </w:rPr>
+              <w:t>По умолчанию</w:t>
+            </w:r>
+          </w:p>
+        </w:tc>
+        <w:tc>
+          <w:tcPr>
+            <w:tcW w:type="dxa" w:w="2381"/>
+            <w:shd w:val="clear" w:fill="D9E2F3"/>
+          </w:tcPr>
+          <w:p>
+            <w:r>
+              <w:rPr>
+                <w:sz w:val="24"/>
+              </w:rPr>
+            </w:r>
+            <w:r>
+              <w:rPr>
+                <w:b/>
+                <w:sz w:val="24"/>
+              </w:rPr>
+              <w:t>Допустимые значения</w:t>
+            </w:r>
+          </w:p>
+        </w:tc>
+        <w:tc>
+          <w:tcPr>
+            <w:tcW w:type="dxa" w:w="2381"/>
+            <w:shd w:val="clear" w:fill="D9E2F3"/>
+          </w:tcPr>
+          <w:p>
+            <w:r>
+              <w:rPr>
+                <w:sz w:val="24"/>
+              </w:rPr>
+            </w:r>
+            <w:r>
+              <w:rPr>
+                <w:b/>
+                <w:sz w:val="24"/>
+              </w:rPr>
+              <w:t>Недопустимые значения</w:t>
+            </w:r>
+          </w:p>
+        </w:tc>
+      </w:tr>
+      <w:tr>
+        <w:tc>
+          <w:tcPr>
+            <w:tcW w:type="dxa" w:w="1474"/>
+          </w:tcPr>
+          <w:p>
+            <w:r>
+              <w:rPr>
+                <w:sz w:val="24"/>
+              </w:rPr>
+              <w:t>name (#name)</w:t>
+            </w:r>
+          </w:p>
+        </w:tc>
+        <w:tc>
+          <w:tcPr>
+            <w:tcW w:type="dxa" w:w="1474"/>
+          </w:tcPr>
+          <w:p>
+            <w:r>
+              <w:rPr>
+                <w:sz w:val="24"/>
+              </w:rPr>
+              <w:t>string; input type=text</w:t>
+            </w:r>
+          </w:p>
+        </w:tc>
+        <w:tc>
+          <w:tcPr>
+            <w:tcW w:type="dxa" w:w="1020"/>
+          </w:tcPr>
+          <w:p>
+            <w:r>
+              <w:rPr>
+                <w:sz w:val="24"/>
+              </w:rPr>
+              <w:t>Да</w:t>
+            </w:r>
+          </w:p>
+        </w:tc>
+        <w:tc>
+          <w:tcPr>
+            <w:tcW w:type="dxa" w:w="1134"/>
+          </w:tcPr>
+          <w:p>
+            <w:r>
+              <w:rPr>
+                <w:sz w:val="24"/>
+              </w:rPr>
+              <w:t>пусто</w:t>
+            </w:r>
+          </w:p>
+        </w:tc>
+        <w:tc>
+          <w:tcPr>
+            <w:tcW w:type="dxa" w:w="2381"/>
+          </w:tcPr>
+          <w:p>
+            <w:r>
+              <w:rPr>
+                <w:sz w:val="24"/>
+              </w:rPr>
+              <w:t>От 2 до 60 символов; первая буква, далее буквы любого алфавита, пробел, апостроф, дефис; пробелы по краям игнорируются. Примеры: «Анна Иванова», «Ян», «O'Neil-Smith»</w:t>
+            </w:r>
+          </w:p>
+        </w:tc>
+        <w:tc>
+          <w:tcPr>
+            <w:tcW w:type="dxa" w:w="2381"/>
+          </w:tcPr>
+          <w:p>
+            <w:r>
+              <w:rPr>
+                <w:sz w:val="24"/>
+              </w:rPr>
+              <w:t>Пусто; 1 символ; 61 и более; цифры («Anna1»); знаки («Анна!»); первый символ не буква («-Анна»)</w:t>
+            </w:r>
+          </w:p>
+        </w:tc>
+      </w:tr>
+      <w:tr>
+        <w:tc>
+          <w:tcPr>
+            <w:tcW w:type="dxa" w:w="1474"/>
+          </w:tcPr>
+          <w:p>
+            <w:r>
+              <w:rPr>
+                <w:sz w:val="24"/>
+              </w:rPr>
+              <w:t>email (#email)</w:t>
+            </w:r>
+          </w:p>
+        </w:tc>
+        <w:tc>
+          <w:tcPr>
+            <w:tcW w:type="dxa" w:w="1474"/>
+          </w:tcPr>
+          <w:p>
+            <w:r>
+              <w:rPr>
+                <w:sz w:val="24"/>
+              </w:rPr>
+              <w:t>string; input type=email</w:t>
+            </w:r>
+          </w:p>
+        </w:tc>
+        <w:tc>
+          <w:tcPr>
+            <w:tcW w:type="dxa" w:w="1020"/>
+          </w:tcPr>
+          <w:p>
+            <w:r>
+              <w:rPr>
+                <w:sz w:val="24"/>
+              </w:rPr>
+              <w:t>Да</w:t>
+            </w:r>
+          </w:p>
+        </w:tc>
+        <w:tc>
+          <w:tcPr>
+            <w:tcW w:type="dxa" w:w="1134"/>
+          </w:tcPr>
+          <w:p>
+            <w:r>
+              <w:rPr>
+                <w:sz w:val="24"/>
+              </w:rPr>
+              <w:t>пусто</w:t>
+            </w:r>
+          </w:p>
+        </w:tc>
+        <w:tc>
+          <w:tcPr>
+            <w:tcW w:type="dxa" w:w="2381"/>
+          </w:tcPr>
+          <w:p>
+            <w:r>
+              <w:rPr>
+                <w:sz w:val="24"/>
+              </w:rPr>
+              <w:t>Вид name@domain.zone, зона не короче 2 символов, до 120 символов. Пример: anna@example.com</w:t>
+            </w:r>
+          </w:p>
+        </w:tc>
+        <w:tc>
+          <w:tcPr>
+            <w:tcW w:type="dxa" w:w="2381"/>
+          </w:tcPr>
+          <w:p>
+            <w:r>
+              <w:rPr>
+                <w:sz w:val="24"/>
+              </w:rPr>
+              <w:t>Пусто; без @; без зоны («anna@example»); пробелы внутри; 121 символ и более</w:t>
+            </w:r>
+          </w:p>
+        </w:tc>
+      </w:tr>
+      <w:tr>
+        <w:tc>
+          <w:tcPr>
+            <w:tcW w:type="dxa" w:w="1474"/>
+          </w:tcPr>
+          <w:p>
+            <w:r>
+              <w:rPr>
+                <w:sz w:val="24"/>
+              </w:rPr>
+              <w:t>notation (#notation)</w:t>
+            </w:r>
+          </w:p>
+        </w:tc>
+        <w:tc>
+          <w:tcPr>
+            <w:tcW w:type="dxa" w:w="1474"/>
+          </w:tcPr>
+          <w:p>
+            <w:r>
+              <w:rPr>
+                <w:sz w:val="24"/>
+              </w:rPr>
+              <w:t>enum; select, значение string</w:t>
+            </w:r>
+          </w:p>
+        </w:tc>
+        <w:tc>
+          <w:tcPr>
+            <w:tcW w:type="dxa" w:w="1020"/>
+          </w:tcPr>
+          <w:p>
+            <w:r>
+              <w:rPr>
+                <w:sz w:val="24"/>
+              </w:rPr>
+              <w:t>Да</w:t>
+            </w:r>
+          </w:p>
+        </w:tc>
+        <w:tc>
+          <w:tcPr>
+            <w:tcW w:type="dxa" w:w="1134"/>
+          </w:tcPr>
+          <w:p>
+            <w:r>
+              <w:rPr>
+                <w:sz w:val="24"/>
+              </w:rPr>
+              <w:t>не выбрано</w:t>
+            </w:r>
+          </w:p>
+        </w:tc>
+        <w:tc>
+          <w:tcPr>
+            <w:tcW w:type="dxa" w:w="2381"/>
+          </w:tcPr>
+          <w:p>
+            <w:r>
+              <w:rPr>
+                <w:sz w:val="24"/>
+              </w:rPr>
+              <w:t>Ровно одно из: idef0, dfd, erd, bpmn, uml, petri</w:t>
+            </w:r>
+          </w:p>
+        </w:tc>
+        <w:tc>
+          <w:tcPr>
+            <w:tcW w:type="dxa" w:w="2381"/>
+          </w:tcPr>
+          <w:p>
+            <w:r>
+              <w:rPr>
+                <w:sz w:val="24"/>
+              </w:rPr>
+              <w:t>Пусто (пункт «Выберите нотацию»); любое другое значение («xyz»); заглавные буквы («IDEF0»)</w:t>
+            </w:r>
+          </w:p>
+        </w:tc>
+      </w:tr>
+      <w:tr>
+        <w:tc>
+          <w:tcPr>
+            <w:tcW w:type="dxa" w:w="1474"/>
+          </w:tcPr>
+          <w:p>
+            <w:r>
+              <w:rPr>
+                <w:sz w:val="24"/>
+              </w:rPr>
+              <w:t>team (#team)</w:t>
+            </w:r>
+          </w:p>
+        </w:tc>
+        <w:tc>
+          <w:tcPr>
+            <w:tcW w:type="dxa" w:w="1474"/>
+          </w:tcPr>
+          <w:p>
+            <w:r>
+              <w:rPr>
+                <w:sz w:val="24"/>
+              </w:rPr>
+              <w:t>integer; input type=number (в коде допускается и строка из цифр)</w:t>
+            </w:r>
+          </w:p>
+        </w:tc>
+        <w:tc>
+          <w:tcPr>
+            <w:tcW w:type="dxa" w:w="1020"/>
+          </w:tcPr>
+          <w:p>
+            <w:r>
+              <w:rPr>
+                <w:sz w:val="24"/>
+              </w:rPr>
+              <w:t>Да</w:t>
+            </w:r>
+          </w:p>
+        </w:tc>
+        <w:tc>
+          <w:tcPr>
+            <w:tcW w:type="dxa" w:w="1134"/>
+          </w:tcPr>
+          <w:p>
+            <w:r>
+              <w:rPr>
+                <w:sz w:val="24"/>
+              </w:rPr>
+              <w:t>0</w:t>
+            </w:r>
+          </w:p>
+        </w:tc>
+        <w:tc>
+          <w:tcPr>
+            <w:tcW w:type="dxa" w:w="2381"/>
+          </w:tcPr>
+          <w:p>
+            <w:r>
+              <w:rPr>
+                <w:sz w:val="24"/>
+              </w:rPr>
+              <w:t>Целое от 0 до 500 включительно. Примеры: 0, 5, 500, «12»</w:t>
+            </w:r>
+          </w:p>
+        </w:tc>
+        <w:tc>
+          <w:tcPr>
+            <w:tcW w:type="dxa" w:w="2381"/>
+          </w:tcPr>
+          <w:p>
+            <w:r>
+              <w:rPr>
+                <w:sz w:val="24"/>
+              </w:rPr>
+              <w:t>Меньше 0 («-1»); больше 500 («501»); дробное («2.5»); не число («abc»); пусто</w:t>
+            </w:r>
+          </w:p>
+        </w:tc>
+      </w:tr>
+      <w:tr>
+        <w:tc>
+          <w:tcPr>
+            <w:tcW w:type="dxa" w:w="1474"/>
+          </w:tcPr>
+          <w:p>
+            <w:r>
+              <w:rPr>
+                <w:sz w:val="24"/>
+              </w:rPr>
+              <w:t>comment (#comment)</w:t>
+            </w:r>
+          </w:p>
+        </w:tc>
+        <w:tc>
+          <w:tcPr>
+            <w:tcW w:type="dxa" w:w="1474"/>
+          </w:tcPr>
+          <w:p>
+            <w:r>
+              <w:rPr>
+                <w:sz w:val="24"/>
+              </w:rPr>
+              <w:t>string; textarea</w:t>
+            </w:r>
+          </w:p>
+        </w:tc>
+        <w:tc>
+          <w:tcPr>
+            <w:tcW w:type="dxa" w:w="1020"/>
+          </w:tcPr>
+          <w:p>
+            <w:r>
+              <w:rPr>
+                <w:sz w:val="24"/>
+              </w:rPr>
+              <w:t>Нет</w:t>
+            </w:r>
+          </w:p>
+        </w:tc>
+        <w:tc>
+          <w:tcPr>
+            <w:tcW w:type="dxa" w:w="1134"/>
+          </w:tcPr>
+          <w:p>
+            <w:r>
+              <w:rPr>
+                <w:sz w:val="24"/>
+              </w:rPr>
+              <w:t>пусто</w:t>
+            </w:r>
+          </w:p>
+        </w:tc>
+        <w:tc>
+          <w:tcPr>
+            <w:tcW w:type="dxa" w:w="2381"/>
+          </w:tcPr>
+          <w:p>
+            <w:r>
+              <w:rPr>
+                <w:sz w:val="24"/>
+              </w:rPr>
+              <w:t>От 0 до 500 символов (пусто допустимо)</w:t>
+            </w:r>
+          </w:p>
+        </w:tc>
+        <w:tc>
+          <w:tcPr>
+            <w:tcW w:type="dxa" w:w="2381"/>
+          </w:tcPr>
+          <w:p>
+            <w:r>
+              <w:rPr>
+                <w:sz w:val="24"/>
+              </w:rPr>
+              <w:t>501 символ и более (в браузере ввод ограничен maxlength=500)</w:t>
+            </w:r>
+          </w:p>
+        </w:tc>
+      </w:tr>
+      <w:tr>
+        <w:tc>
+          <w:tcPr>
+            <w:tcW w:type="dxa" w:w="1474"/>
+          </w:tcPr>
+          <w:p>
+            <w:r>
+              <w:rPr>
+                <w:sz w:val="24"/>
+              </w:rPr>
+              <w:t>consent (#consent)</w:t>
+            </w:r>
+          </w:p>
+        </w:tc>
+        <w:tc>
+          <w:tcPr>
+            <w:tcW w:type="dxa" w:w="1474"/>
+          </w:tcPr>
+          <w:p>
+            <w:r>
+              <w:rPr>
+                <w:sz w:val="24"/>
+              </w:rPr>
+              <w:t>boolean; checkbox</w:t>
+            </w:r>
+          </w:p>
+        </w:tc>
+        <w:tc>
+          <w:tcPr>
+            <w:tcW w:type="dxa" w:w="1020"/>
+          </w:tcPr>
+          <w:p>
+            <w:r>
+              <w:rPr>
+                <w:sz w:val="24"/>
+              </w:rPr>
+              <w:t>Да</w:t>
+            </w:r>
+          </w:p>
+        </w:tc>
+        <w:tc>
+          <w:tcPr>
+            <w:tcW w:type="dxa" w:w="1134"/>
+          </w:tcPr>
+          <w:p>
+            <w:r>
+              <w:rPr>
+                <w:sz w:val="24"/>
+              </w:rPr>
+              <w:t>false (снят)</w:t>
+            </w:r>
+          </w:p>
+        </w:tc>
+        <w:tc>
+          <w:tcPr>
+            <w:tcW w:type="dxa" w:w="2381"/>
+          </w:tcPr>
+          <w:p>
+            <w:r>
+              <w:rPr>
+                <w:sz w:val="24"/>
+              </w:rPr>
+              <w:t>true (флажок отмечен)</w:t>
+            </w:r>
+          </w:p>
+        </w:tc>
+        <w:tc>
+          <w:tcPr>
+            <w:tcW w:type="dxa" w:w="2381"/>
+          </w:tcPr>
+          <w:p>
+            <w:r>
+              <w:rPr>
+                <w:sz w:val="24"/>
+              </w:rPr>
+              <w:t>false (флажок снят)</w:t>
+            </w:r>
+          </w:p>
+        </w:tc>
+      </w:tr>
+      <w:tr>
+        <w:tc>
+          <w:tcPr>
+            <w:tcW w:type="dxa" w:w="1474"/>
+          </w:tcPr>
+          <w:p>
+            <w:r>
+              <w:rPr>
+                <w:sz w:val="24"/>
+              </w:rPr>
+              <w:t>createdAt (формирует система)</w:t>
+            </w:r>
+          </w:p>
+        </w:tc>
+        <w:tc>
+          <w:tcPr>
+            <w:tcW w:type="dxa" w:w="1474"/>
+          </w:tcPr>
+          <w:p>
+            <w:r>
+              <w:rPr>
+                <w:sz w:val="24"/>
+              </w:rPr>
+              <w:t>string; время ISO 8601 (UTC)</w:t>
+            </w:r>
+          </w:p>
+        </w:tc>
+        <w:tc>
+          <w:tcPr>
+            <w:tcW w:type="dxa" w:w="1020"/>
+          </w:tcPr>
+          <w:p>
+            <w:r>
+              <w:rPr>
+                <w:sz w:val="24"/>
+              </w:rPr>
+              <w:t>Нет (не вводится)</w:t>
+            </w:r>
+          </w:p>
+        </w:tc>
+        <w:tc>
+          <w:tcPr>
+            <w:tcW w:type="dxa" w:w="1134"/>
+          </w:tcPr>
+          <w:p>
+            <w:r>
+              <w:rPr>
+                <w:sz w:val="24"/>
+              </w:rPr>
+              <w:t>текущее время в момент отправки</w:t>
+            </w:r>
+          </w:p>
+        </w:tc>
+        <w:tc>
+          <w:tcPr>
+            <w:tcW w:type="dxa" w:w="2381"/>
+          </w:tcPr>
+          <w:p>
+            <w:r>
+              <w:rPr>
+                <w:sz w:val="24"/>
+              </w:rPr>
+              <w:t>Строка вида 2026-10-25T12:00:00.000Z</w:t>
+            </w:r>
+          </w:p>
+        </w:tc>
+        <w:tc>
+          <w:tcPr>
+            <w:tcW w:type="dxa" w:w="2381"/>
+          </w:tcPr>
+          <w:p>
+            <w:r>
+              <w:rPr>
+                <w:sz w:val="24"/>
+              </w:rPr>
+              <w:t>Не вводится посетителем</w:t>
+            </w:r>
+          </w:p>
+        </w:tc>
+      </w:tr>
+    </w:tbl>
+    <w:p/>
+    <w:p>
+      <w:pPr>
+        <w:pStyle w:val="Heading2"/>
+      </w:pPr>
+      <w:r>
+        <w:t>Диаграммы процесса</w:t>
+      </w:r>
+    </w:p>
+    <w:p>
+      <w:pPr>
+        <w:jc w:val="center"/>
+      </w:pPr>
+      <w:r>
+        <w:drawing>
+          <wp:inline xmlns:a="http://schemas.openxmlformats.org/drawingml/2006/main" xmlns:pic="http://schemas.openxmlformats.org/drawingml/2006/picture">
+            <wp:extent cx="3600000" cy="6557983"/>
+            <wp:docPr id="1" name="Picture 1"/>
+            <wp:cNvGraphicFramePr>
+              <a:graphicFrameLocks noChangeAspect="1"/>
+            </wp:cNvGraphicFramePr>
+            <a:graphic>
+              <a:graphicData uri="http://schemas.openxmlformats.org/drawingml/2006/picture">
+                <pic:pic>
+                  <pic:nvPicPr>
+                    <pic:cNvPr id="0" name="flow.png"/>
+                    <pic:cNvPicPr/>
+                  </pic:nvPicPr>
+                  <pic:blipFill>
+                    <a:blip r:embed="rId9"/>
+                    <a:stretch>
+                      <a:fillRect/>
+                    </a:stretch>
+                  </pic:blipFill>
+                  <pic:spPr>
+                    <a:xfrm>
+                      <a:off x="0" y="0"/>
+                      <a:ext cx="3600000" cy="6557983"/>
+                    </a:xfrm>
+                    <a:prstGeom prst="rect"/>
+                  </pic:spPr>
+                </pic:pic>
+              </a:graphicData>
+            </a:graphic>
+          </wp:inline>
+        </w:drawing>
+      </w:r>
+    </w:p>
+    <w:p>
+      <w:pPr>
+        <w:jc w:val="center"/>
+      </w:pPr>
+      <w:r>
+        <w:rPr>
+          <w:i/>
+        </w:rPr>
+        <w:t>Рис. A. Блок-схема сценария UC-01: основной поток и альтернативные потоки</w:t>
+      </w:r>
+    </w:p>
+    <w:p>
+      <w:pPr>
+        <w:jc w:val="center"/>
+      </w:pPr>
+      <w:r>
+        <w:drawing>
+          <wp:inline xmlns:a="http://schemas.openxmlformats.org/drawingml/2006/main" xmlns:pic="http://schemas.openxmlformats.org/drawingml/2006/picture">
+            <wp:extent cx="5760000" cy="1457075"/>
+            <wp:docPr id="2" name="Picture 2"/>
+            <wp:cNvGraphicFramePr>
+              <a:graphicFrameLocks noChangeAspect="1"/>
+            </wp:cNvGraphicFramePr>
+            <a:graphic>
+              <a:graphicData uri="http://schemas.openxmlformats.org/drawingml/2006/picture">
+                <pic:pic>
+                  <pic:nvPicPr>
+                    <pic:cNvPr id="0" name="states.png"/>
+                    <pic:cNvPicPr/>
+                  </pic:nvPicPr>
+                  <pic:blipFill>
+                    <a:blip r:embed="rId10"/>
+                    <a:stretch>
+                      <a:fillRect/>
+                    </a:stretch>
+                  </pic:blipFill>
+                  <pic:spPr>
+                    <a:xfrm>
+                      <a:off x="0" y="0"/>
+                      <a:ext cx="5760000" cy="1457075"/>
+                    </a:xfrm>
+                    <a:prstGeom prst="rect"/>
+                  </pic:spPr>
+                </pic:pic>
+              </a:graphicData>
+            </a:graphic>
+          </wp:inline>
+        </w:drawing>
+      </w:r>
+    </w:p>
+    <w:p>
+      <w:pPr>
+        <w:jc w:val="center"/>
+      </w:pPr>
+      <w:r>
+        <w:rPr>
+          <w:i/>
+        </w:rPr>
+        <w:t>Рис. B. Состояния поля формы при проверке</w:t>
+      </w:r>
+    </w:p>
+    <w:p>
+      <w:pPr>
+        <w:jc w:val="center"/>
+      </w:pPr>
+      <w:r>
+        <w:drawing>
+          <wp:inline xmlns:a="http://schemas.openxmlformats.org/drawingml/2006/main" xmlns:pic="http://schemas.openxmlformats.org/drawingml/2006/picture">
+            <wp:extent cx="5760000" cy="981548"/>
+            <wp:docPr id="3" name="Picture 3"/>
+            <wp:cNvGraphicFramePr>
+              <a:graphicFrameLocks noChangeAspect="1"/>
+            </wp:cNvGraphicFramePr>
+            <a:graphic>
+              <a:graphicData uri="http://schemas.openxmlformats.org/drawingml/2006/picture">
+                <pic:pic>
+                  <pic:nvPicPr>
+                    <pic:cNvPr id="0" name="components.png"/>
+                    <pic:cNvPicPr/>
+                  </pic:nvPicPr>
+                  <pic:blipFill>
+                    <a:blip r:embed="rId11"/>
+                    <a:stretch>
+                      <a:fillRect/>
+                    </a:stretch>
+                  </pic:blipFill>
+                  <pic:spPr>
+                    <a:xfrm>
+                      <a:off x="0" y="0"/>
+                      <a:ext cx="5760000" cy="981548"/>
+                    </a:xfrm>
+                    <a:prstGeom prst="rect"/>
+                  </pic:spPr>
+                </pic:pic>
+              </a:graphicData>
+            </a:graphic>
+          </wp:inline>
+        </w:drawing>
+      </w:r>
+    </w:p>
+    <w:p>
+      <w:pPr>
+        <w:jc w:val="center"/>
+      </w:pPr>
+      <w:r>
+        <w:rPr>
+          <w:i/>
+        </w:rPr>
+        <w:t>Рис. C. Компоненты и обмен данными при отправке заявки</w:t>
+      </w:r>
+    </w:p>
     <w:p>
       <w:r>
         <w:t>Трассировка: правило П1 проверяют TC-WL-002…007, П2 TC-WL-008…011, П3 TC-WL-018, П4 TC-WL-012…017, П5 TC-WL-019, 020, П6 TC-WL-021, поток A1 TC-WL-022. Подзадача UC-01.2 покрыта всеми кейсами, UC-01.3 кейсом TC-WL-022.</w:t>
@@ -7481,7 +10268,7 @@
         <w:drawing>
           <wp:inline xmlns:a="http://schemas.openxmlformats.org/drawingml/2006/main" xmlns:pic="http://schemas.openxmlformats.org/drawingml/2006/picture">
             <wp:extent cx="3240000" cy="4203900"/>
-            <wp:docPr id="1" name="Picture 1"/>
+            <wp:docPr id="4" name="Picture 4"/>
             <wp:cNvGraphicFramePr>
               <a:graphicFrameLocks noChangeAspect="1"/>
             </wp:cNvGraphicFramePr>
@@ -7493,7 +10280,7 @@
                     <pic:cNvPicPr/>
                   </pic:nvPicPr>
                   <pic:blipFill>
-                    <a:blip r:embed="rId9"/>
+                    <a:blip r:embed="rId12"/>
                     <a:stretch>
                       <a:fillRect/>
                     </a:stretch>
@@ -7531,7 +10318,7 @@
         <w:drawing>
           <wp:inline xmlns:a="http://schemas.openxmlformats.org/drawingml/2006/main" xmlns:pic="http://schemas.openxmlformats.org/drawingml/2006/picture">
             <wp:extent cx="3240000" cy="3674700"/>
-            <wp:docPr id="2" name="Picture 2"/>
+            <wp:docPr id="5" name="Picture 5"/>
             <wp:cNvGraphicFramePr>
               <a:graphicFrameLocks noChangeAspect="1"/>
             </wp:cNvGraphicFramePr>
@@ -7543,7 +10330,7 @@
                     <pic:cNvPicPr/>
                   </pic:nvPicPr>
                   <pic:blipFill>
-                    <a:blip r:embed="rId10"/>
+                    <a:blip r:embed="rId13"/>
                     <a:stretch>
                       <a:fillRect/>
                     </a:stretch>
@@ -7581,7 +10368,7 @@
         <w:drawing>
           <wp:inline xmlns:a="http://schemas.openxmlformats.org/drawingml/2006/main" xmlns:pic="http://schemas.openxmlformats.org/drawingml/2006/picture">
             <wp:extent cx="5040000" cy="3150000"/>
-            <wp:docPr id="3" name="Picture 3"/>
+            <wp:docPr id="6" name="Picture 6"/>
             <wp:cNvGraphicFramePr>
               <a:graphicFrameLocks noChangeAspect="1"/>
             </wp:cNvGraphicFramePr>
@@ -7593,7 +10380,7 @@
                     <pic:cNvPicPr/>
                   </pic:nvPicPr>
                   <pic:blipFill>
-                    <a:blip r:embed="rId11"/>
+                    <a:blip r:embed="rId14"/>
                     <a:stretch>
                       <a:fillRect/>
                     </a:stretch>
@@ -7631,7 +10418,7 @@
         <w:drawing>
           <wp:inline xmlns:a="http://schemas.openxmlformats.org/drawingml/2006/main" xmlns:pic="http://schemas.openxmlformats.org/drawingml/2006/picture">
             <wp:extent cx="5760000" cy="3755077"/>
-            <wp:docPr id="4" name="Picture 4"/>
+            <wp:docPr id="7" name="Picture 7"/>
             <wp:cNvGraphicFramePr>
               <a:graphicFrameLocks noChangeAspect="1"/>
             </wp:cNvGraphicFramePr>
@@ -7643,7 +10430,7 @@
                     <pic:cNvPicPr/>
                   </pic:nvPicPr>
                   <pic:blipFill>
-                    <a:blip r:embed="rId12"/>
+                    <a:blip r:embed="rId15"/>
                     <a:stretch>
                       <a:fillRect/>
                     </a:stretch>

</xml_diff>

<commit_message>
docs(testing-course): entry points, related tasks, DB-style data structure table, required-field marks
</commit_message>
<xml_diff>
--- a/testing-course/documents/01-test-cases.docx
+++ b/testing-course/documents/01-test-cases.docx
@@ -369,7 +369,7 @@
               <w:rPr>
                 <w:b/>
               </w:rPr>
-              <w:t>Точки входа</w:t>
+              <w:t>Как перейти к форме</w:t>
             </w:r>
           </w:p>
         </w:tc>
@@ -382,72 +382,288 @@
               <w:rPr>
                 <w:sz w:val="24"/>
               </w:rPr>
-              <w:t xml:space="preserve">Кнопка </w:t>
+              <w:t xml:space="preserve">Форма находится на главной странице сайта в разделе </w:t>
             </w:r>
             <w:r>
               <w:rPr>
                 <w:b/>
                 <w:sz w:val="24"/>
               </w:rPr>
+              <w:t>«Записаться в бету»</w:t>
+            </w:r>
+            <w:r>
+              <w:rPr>
+                <w:sz w:val="24"/>
+              </w:rPr>
+              <w:t xml:space="preserve"> (якорь </w:t>
+            </w:r>
+            <w:r>
+              <w:rPr>
+                <w:i/>
+                <w:sz w:val="24"/>
+              </w:rPr>
+              <w:t>#waitlist</w:t>
+            </w:r>
+            <w:r>
+              <w:rPr>
+                <w:sz w:val="24"/>
+              </w:rPr>
+              <w:t xml:space="preserve">), доступна всем посетителям </w:t>
+            </w:r>
+            <w:r>
+              <w:rPr>
+                <w:b/>
+                <w:sz w:val="24"/>
+              </w:rPr>
+              <w:t>без регистрации и авторизации</w:t>
+            </w:r>
+            <w:r>
+              <w:rPr>
+                <w:sz w:val="24"/>
+              </w:rPr>
+              <w:t>. Перейти к ней можно так:</w:t>
+            </w:r>
+            <w:r>
+              <w:br/>
+            </w:r>
+            <w:r>
+              <w:rPr>
+                <w:b/>
+                <w:sz w:val="24"/>
+              </w:rPr>
+              <w:t>1.</w:t>
+            </w:r>
+            <w:r>
+              <w:rPr>
+                <w:sz w:val="24"/>
+              </w:rPr>
+              <w:t xml:space="preserve"> Шапка главной страницы, кнопка </w:t>
+            </w:r>
+            <w:r>
+              <w:rPr>
+                <w:b/>
+                <w:sz w:val="24"/>
+              </w:rPr>
               <w:t>«В бету»</w:t>
             </w:r>
             <w:r>
               <w:rPr>
                 <w:sz w:val="24"/>
               </w:rPr>
-              <w:t xml:space="preserve"> в шапке, кнопка </w:t>
+              <w:t xml:space="preserve"> (en: «Join the beta»), </w:t>
+            </w:r>
+            <w:r>
+              <w:rPr>
+                <w:i/>
+                <w:sz w:val="24"/>
+              </w:rPr>
+              <w:t>site/index.html</w:t>
+            </w:r>
+            <w:r>
+              <w:rPr>
+                <w:sz w:val="24"/>
+              </w:rPr>
+              <w:t>, строка 67.</w:t>
+            </w:r>
+            <w:r>
+              <w:br/>
             </w:r>
             <w:r>
               <w:rPr>
                 <w:b/>
                 <w:sz w:val="24"/>
               </w:rPr>
+              <w:t>2.</w:t>
+            </w:r>
+            <w:r>
+              <w:rPr>
+                <w:sz w:val="24"/>
+              </w:rPr>
+              <w:t xml:space="preserve"> Первый экран, кнопка </w:t>
+            </w:r>
+            <w:r>
+              <w:rPr>
+                <w:b/>
+                <w:sz w:val="24"/>
+              </w:rPr>
               <w:t>«Записаться в бету»</w:t>
             </w:r>
             <w:r>
               <w:rPr>
                 <w:sz w:val="24"/>
               </w:rPr>
-              <w:t xml:space="preserve"> на первом экране и ссылки </w:t>
+              <w:t>, строка 88.</w:t>
+            </w:r>
+            <w:r>
+              <w:br/>
             </w:r>
             <w:r>
               <w:rPr>
                 <w:b/>
                 <w:sz w:val="24"/>
               </w:rPr>
-              <w:t>«Записаться в бету: UML»</w:t>
-            </w:r>
-            <w:r>
-              <w:rPr>
-                <w:sz w:val="24"/>
-              </w:rPr>
-              <w:t xml:space="preserve">, </w:t>
+              <w:t>3.</w:t>
+            </w:r>
+            <w:r>
+              <w:rPr>
+                <w:sz w:val="24"/>
+              </w:rPr>
+              <w:t xml:space="preserve"> Раздел «Нотации»: шесть ссылок </w:t>
             </w:r>
             <w:r>
               <w:rPr>
                 <w:b/>
                 <w:sz w:val="24"/>
               </w:rPr>
-              <w:t>«Записаться в бету: BPMN»</w:t>
-            </w:r>
-            <w:r>
-              <w:rPr>
-                <w:sz w:val="24"/>
-              </w:rPr>
-              <w:t xml:space="preserve"> и т. п. на карточках нотаций. Все ведут к якорю </w:t>
+              <w:t>«Записаться в бету: UML / BPMN / ERD / DFD / IDEF0 / сети Петри»</w:t>
+            </w:r>
+            <w:r>
+              <w:rPr>
+                <w:sz w:val="24"/>
+              </w:rPr>
+              <w:t>, строки 127–172.</w:t>
+            </w:r>
+            <w:r>
+              <w:br/>
+            </w:r>
+            <w:r>
+              <w:rPr>
+                <w:b/>
+                <w:sz w:val="24"/>
+              </w:rPr>
+              <w:t>4.</w:t>
+            </w:r>
+            <w:r>
+              <w:rPr>
+                <w:sz w:val="24"/>
+              </w:rPr>
+              <w:t xml:space="preserve"> Страницы </w:t>
             </w:r>
             <w:r>
               <w:rPr>
                 <w:i/>
                 <w:sz w:val="24"/>
               </w:rPr>
-              <w:t>#waitlist</w:t>
+              <w:t>privacy.html</w:t>
+            </w:r>
+            <w:r>
+              <w:rPr>
+                <w:sz w:val="24"/>
+              </w:rPr>
+              <w:t xml:space="preserve"> и </w:t>
+            </w:r>
+            <w:r>
+              <w:rPr>
+                <w:i/>
+                <w:sz w:val="24"/>
+              </w:rPr>
+              <w:t>thanks.html</w:t>
+            </w:r>
+            <w:r>
+              <w:rPr>
+                <w:sz w:val="24"/>
+              </w:rPr>
+              <w:t xml:space="preserve">: кнопка </w:t>
+            </w:r>
+            <w:r>
+              <w:rPr>
+                <w:b/>
+                <w:sz w:val="24"/>
+              </w:rPr>
+              <w:t>«В бету»</w:t>
+            </w:r>
+            <w:r>
+              <w:rPr>
+                <w:sz w:val="24"/>
+              </w:rPr>
+              <w:t xml:space="preserve"> в шапке ведёт на </w:t>
+            </w:r>
+            <w:r>
+              <w:rPr>
+                <w:i/>
+                <w:sz w:val="24"/>
+              </w:rPr>
+              <w:t>./#waitlist</w:t>
             </w:r>
             <w:r>
               <w:rPr>
                 <w:sz w:val="24"/>
               </w:rPr>
               <w:t>.</w:t>
+            </w:r>
+            <w:r>
+              <w:br/>
+            </w:r>
+            <w:r>
+              <w:rPr>
+                <w:b/>
+                <w:sz w:val="24"/>
+              </w:rPr>
+              <w:t>5.</w:t>
+            </w:r>
+            <w:r>
+              <w:rPr>
+                <w:sz w:val="24"/>
+              </w:rPr>
+              <w:t xml:space="preserve"> Прямой адрес: http://localhost:5173/#waitlist (русская версия), http://localhost:5173/en/#waitlist (английская).</w:t>
+            </w:r>
+            <w:r>
+              <w:br/>
+            </w:r>
+            <w:r>
+              <w:rPr>
+                <w:b/>
+                <w:sz w:val="24"/>
+              </w:rPr>
+              <w:t>6.</w:t>
+            </w:r>
+            <w:r>
+              <w:rPr>
+                <w:sz w:val="24"/>
+              </w:rPr>
+              <w:t xml:space="preserve"> Клавиатура: Tab до кнопки или ссылки и Enter; ссылка-якорь прокручивает страницу к форме.</w:t>
+            </w:r>
+            <w:r>
+              <w:br/>
+            </w:r>
+            <w:r>
+              <w:rPr>
+                <w:b/>
+                <w:sz w:val="24"/>
+              </w:rPr>
+              <w:t>7.</w:t>
+            </w:r>
+            <w:r>
+              <w:rPr>
+                <w:sz w:val="24"/>
+              </w:rPr>
+              <w:t xml:space="preserve"> React-приложение (</w:t>
+            </w:r>
+            <w:r>
+              <w:rPr>
+                <w:i/>
+                <w:sz w:val="24"/>
+              </w:rPr>
+              <w:t>react-app</w:t>
+            </w:r>
+            <w:r>
+              <w:rPr>
+                <w:sz w:val="24"/>
+              </w:rPr>
+              <w:t xml:space="preserve">): кнопка </w:t>
+            </w:r>
+            <w:r>
+              <w:rPr>
+                <w:b/>
+                <w:sz w:val="24"/>
+              </w:rPr>
+              <w:t>«Записаться в бету»</w:t>
+            </w:r>
+            <w:r>
+              <w:rPr>
+                <w:sz w:val="24"/>
+              </w:rPr>
+              <w:t xml:space="preserve"> в шапке (UC-04, только сообщение, заявка не сохраняется).</w:t>
             </w:r>
           </w:p>
         </w:tc>
@@ -598,7 +814,7 @@
               <w:rPr>
                 <w:sz w:val="24"/>
               </w:rPr>
-              <w:t xml:space="preserve">1. Посетитель нажимает </w:t>
+              <w:t xml:space="preserve">1. Посетитель переходит к форме одним из способов раздела «Как перейти к форме», например нажимает </w:t>
             </w:r>
             <w:r>
               <w:rPr>
@@ -653,7 +869,7 @@
                 <w:b/>
                 <w:sz w:val="24"/>
               </w:rPr>
-              <w:t>«Имя»</w:t>
+              <w:t>«Имя*»</w:t>
             </w:r>
             <w:r>
               <w:rPr>
@@ -688,7 +904,7 @@
                 <w:b/>
                 <w:sz w:val="24"/>
               </w:rPr>
-              <w:t>«Электронная почта»</w:t>
+              <w:t>«Электронная почта*»</w:t>
             </w:r>
             <w:r>
               <w:rPr>
@@ -716,7 +932,7 @@
               <w:rPr>
                 <w:sz w:val="24"/>
               </w:rPr>
-              <w:t xml:space="preserve">4. Посетитель выбирает нотацию в списке: IDEF0, DFD, ERD, BPMN, UML или </w:t>
+              <w:t xml:space="preserve">4. Посетитель выбирает нотацию в списке «Нотация*»: IDEF0, DFD, ERD, BPMN, UML или </w:t>
             </w:r>
             <w:r>
               <w:rPr>
@@ -745,7 +961,7 @@
                 <w:b/>
                 <w:sz w:val="24"/>
               </w:rPr>
-              <w:t>«Размер команды»</w:t>
+              <w:t>«Размер команды*»</w:t>
             </w:r>
             <w:r>
               <w:rPr>
@@ -802,7 +1018,7 @@
                 <w:b/>
                 <w:sz w:val="24"/>
               </w:rPr>
-              <w:t>«Согласен получать письма о запуске беты и с политикой конфиденциальности»</w:t>
+              <w:t>«Согласен получать письма о запуске беты и с политикой конфиденциальности*»</w:t>
             </w:r>
             <w:r>
               <w:rPr>
@@ -839,7 +1055,7 @@
               <w:rPr>
                 <w:sz w:val="24"/>
               </w:rPr>
-              <w:t xml:space="preserve">9. Система считывает шесть полей и проверяет каждое по правилам П1–П6 (функция </w:t>
+              <w:t xml:space="preserve">9. Система считывает шесть полей и проверяет каждое по правилам П1–П6 из таблицы «Структура данных» (функция </w:t>
             </w:r>
             <w:r>
               <w:rPr>
@@ -949,6 +1165,15 @@
                 <w:sz w:val="24"/>
               </w:rPr>
               <w:t>.</w:t>
+            </w:r>
+            <w:r>
+              <w:br/>
+            </w:r>
+            <w:r>
+              <w:rPr>
+                <w:sz w:val="24"/>
+              </w:rPr>
+              <w:t>* — обязательное поле. В интерфейсе сайта звёздочек нет, обязательность указана фразой «Все поля, кроме комментария, обязательны».</w:t>
             </w:r>
           </w:p>
         </w:tc>
@@ -969,7 +1194,7 @@
               <w:rPr>
                 <w:b/>
               </w:rPr>
-              <w:t>Правила проверки полей</w:t>
+              <w:t>Альтернативные потоки</w:t>
             </w:r>
           </w:p>
         </w:tc>
@@ -983,26 +1208,39 @@
                 <w:b/>
                 <w:sz w:val="24"/>
               </w:rPr>
-              <w:t>П1</w:t>
-            </w:r>
-            <w:r>
-              <w:rPr>
-                <w:sz w:val="24"/>
-              </w:rPr>
-              <w:t>. Имя (</w:t>
-            </w:r>
-            <w:r>
-              <w:rPr>
-                <w:i/>
-                <w:sz w:val="24"/>
-              </w:rPr>
-              <w:t>#name</w:t>
-            </w:r>
-            <w:r>
-              <w:rPr>
-                <w:sz w:val="24"/>
-              </w:rPr>
-              <w:t>): 2–60 символов после обрезки пробелов, первый символ буква, далее буквы, пробел, апостроф, дефис. В разметке: minlength=2, maxlength=60.</w:t>
+              <w:t>A1</w:t>
+            </w:r>
+            <w:r>
+              <w:rPr>
+                <w:sz w:val="24"/>
+              </w:rPr>
+              <w:t xml:space="preserve">. Одно или несколько полей не прошли проверку (шаг 9): под каждым неверным полем показывается красное сообщение (role=alert, например </w:t>
+            </w:r>
+            <w:r>
+              <w:rPr>
+                <w:b/>
+                <w:sz w:val="24"/>
+              </w:rPr>
+              <w:t>«Имя не принято: поле пустое, короче двух символов или содержит цифры и знаки…»</w:t>
+            </w:r>
+            <w:r>
+              <w:rPr>
+                <w:sz w:val="24"/>
+              </w:rPr>
+              <w:t xml:space="preserve">), поле получает aria-invalid=true, фокус переходит на первое неверное поле в порядке имя, почта, нотация, команда, комментарий, согласие. </w:t>
+            </w:r>
+            <w:r>
+              <w:rPr>
+                <w:b/>
+                <w:sz w:val="24"/>
+              </w:rPr>
+              <w:t>Заявка не сохраняется</w:t>
+            </w:r>
+            <w:r>
+              <w:rPr>
+                <w:sz w:val="24"/>
+              </w:rPr>
+              <w:t>, страница не меняется. Поле с ошибкой перепроверяется при каждом вводе, остальные при выходе из поля. После исправления сообщение скрывается. Сценарий продолжается с шага 8.</w:t>
             </w:r>
             <w:r>
               <w:br/>
@@ -1012,26 +1250,20 @@
                 <w:b/>
                 <w:sz w:val="24"/>
               </w:rPr>
-              <w:t>П2</w:t>
-            </w:r>
-            <w:r>
-              <w:rPr>
-                <w:sz w:val="24"/>
-              </w:rPr>
-              <w:t>. Почта (</w:t>
-            </w:r>
-            <w:r>
-              <w:rPr>
-                <w:i/>
-                <w:sz w:val="24"/>
-              </w:rPr>
-              <w:t>#email</w:t>
-            </w:r>
-            <w:r>
-              <w:rPr>
-                <w:sz w:val="24"/>
-              </w:rPr>
-              <w:t>): вид name@domain.zone без пробелов, зона не короче двух символов, не более 120 символов после обрезки. В разметке: type=email, maxlength=120.</w:t>
+              <w:t>A2</w:t>
+            </w:r>
+            <w:r>
+              <w:rPr>
+                <w:sz w:val="24"/>
+              </w:rPr>
+              <w:t xml:space="preserve">. Согласие не отмечено (шаг 9): применяется A1; сообщение </w:t>
+            </w:r>
+            <w:r>
+              <w:rPr>
+                <w:b/>
+                <w:sz w:val="24"/>
+              </w:rPr>
+              <w:t>«Без согласия мы не можем отправить приглашение. Поставьте галочку, чтобы продолжить.»</w:t>
             </w:r>
             <w:r>
               <w:br/>
@@ -1041,39 +1273,42 @@
                 <w:b/>
                 <w:sz w:val="24"/>
               </w:rPr>
-              <w:t>П3</w:t>
-            </w:r>
-            <w:r>
-              <w:rPr>
-                <w:sz w:val="24"/>
-              </w:rPr>
-              <w:t>. Нотация (</w:t>
-            </w:r>
-            <w:r>
-              <w:rPr>
-                <w:i/>
-                <w:sz w:val="24"/>
-              </w:rPr>
-              <w:t>#notation</w:t>
-            </w:r>
-            <w:r>
-              <w:rPr>
-                <w:sz w:val="24"/>
-              </w:rPr>
-              <w:t xml:space="preserve">): idef0, dfd, erd, bpmn, uml или petri; пункт </w:t>
+              <w:t>A3</w:t>
+            </w:r>
+            <w:r>
+              <w:rPr>
+                <w:sz w:val="24"/>
+              </w:rPr>
+              <w:t>. Посетитель закрывает страницу или уходит со страницы до шага 8: данные не сохраняются, состояние системы не меняется.</w:t>
+            </w:r>
+            <w:r>
+              <w:br/>
             </w:r>
             <w:r>
               <w:rPr>
                 <w:b/>
                 <w:sz w:val="24"/>
               </w:rPr>
-              <w:t>«Выберите нотацию»</w:t>
-            </w:r>
-            <w:r>
-              <w:rPr>
-                <w:sz w:val="24"/>
-              </w:rPr>
-              <w:t xml:space="preserve"> недопустим.</w:t>
+              <w:t>A4</w:t>
+            </w:r>
+            <w:r>
+              <w:rPr>
+                <w:sz w:val="24"/>
+              </w:rPr>
+              <w:t xml:space="preserve">. Повторная заявка с тем же адресом (шаг 10): </w:t>
+            </w:r>
+            <w:r>
+              <w:rPr>
+                <w:b/>
+                <w:sz w:val="24"/>
+              </w:rPr>
+              <w:t>принимается как новая отдельная запись</w:t>
+            </w:r>
+            <w:r>
+              <w:rPr>
+                <w:sz w:val="24"/>
+              </w:rPr>
+              <w:t>, сообщения о дубликате нет (дефект D-1).</w:t>
             </w:r>
             <w:r>
               <w:br/>
@@ -1083,93 +1318,26 @@
                 <w:b/>
                 <w:sz w:val="24"/>
               </w:rPr>
-              <w:t>П4</w:t>
-            </w:r>
-            <w:r>
-              <w:rPr>
-                <w:sz w:val="24"/>
-              </w:rPr>
-              <w:t>. Размер команды (</w:t>
-            </w:r>
-            <w:r>
-              <w:rPr>
-                <w:i/>
-                <w:sz w:val="24"/>
-              </w:rPr>
-              <w:t>#team</w:t>
-            </w:r>
-            <w:r>
-              <w:rPr>
-                <w:sz w:val="24"/>
-              </w:rPr>
-              <w:t>): целое от 0 до 500; допускается строка из цифр; отрицательные, дробные и нечисловые значения недопустимы. В разметке: min=0, max=500, step=1.</w:t>
-            </w:r>
-            <w:r>
-              <w:br/>
+              <w:t>A5</w:t>
+            </w:r>
+            <w:r>
+              <w:rPr>
+                <w:sz w:val="24"/>
+              </w:rPr>
+              <w:t xml:space="preserve">. Повторное нажатие </w:t>
             </w:r>
             <w:r>
               <w:rPr>
                 <w:b/>
                 <w:sz w:val="24"/>
               </w:rPr>
-              <w:t>П5</w:t>
-            </w:r>
-            <w:r>
-              <w:rPr>
-                <w:sz w:val="24"/>
-              </w:rPr>
-              <w:t>. Комментарий (</w:t>
-            </w:r>
-            <w:r>
-              <w:rPr>
-                <w:i/>
-                <w:sz w:val="24"/>
-              </w:rPr>
-              <w:t>#comment</w:t>
-            </w:r>
-            <w:r>
-              <w:rPr>
-                <w:sz w:val="24"/>
-              </w:rPr>
-              <w:t>): не более 500 символов (длина считается без обрезки), поле необязательное. В разметке: maxlength=500, поэтому в браузере больше 500 символов ввести нельзя.</w:t>
-            </w:r>
-            <w:r>
-              <w:br/>
-            </w:r>
-            <w:r>
-              <w:rPr>
-                <w:b/>
-                <w:sz w:val="24"/>
-              </w:rPr>
-              <w:t>П6</w:t>
-            </w:r>
-            <w:r>
-              <w:rPr>
-                <w:sz w:val="24"/>
-              </w:rPr>
-              <w:t>. Согласие (</w:t>
-            </w:r>
-            <w:r>
-              <w:rPr>
-                <w:i/>
-                <w:sz w:val="24"/>
-              </w:rPr>
-              <w:t>#consent</w:t>
-            </w:r>
-            <w:r>
-              <w:rPr>
-                <w:sz w:val="24"/>
-              </w:rPr>
-              <w:t>): флажок обязательно отмечен.</w:t>
-            </w:r>
-            <w:r>
-              <w:br/>
-            </w:r>
-            <w:r>
-              <w:rPr>
-                <w:sz w:val="24"/>
-              </w:rPr>
-              <w:t>Встроенная проверка браузера отключена (form.noValidate), показываются только собственные сообщения сайта.</w:t>
+              <w:t>«Отправить»</w:t>
+            </w:r>
+            <w:r>
+              <w:rPr>
+                <w:sz w:val="24"/>
+              </w:rPr>
+              <w:t xml:space="preserve"> после успешной отправки (шаг 11): игнорируется, вторая запись не создаётся (флаг submitting).</w:t>
             </w:r>
           </w:p>
         </w:tc>
@@ -1190,7 +1358,7 @@
               <w:rPr>
                 <w:b/>
               </w:rPr>
-              <w:t>Альтернативные потоки</w:t>
+              <w:t>Постусловия</w:t>
             </w:r>
           </w:p>
         </w:tc>
@@ -1201,139 +1369,70 @@
           <w:p>
             <w:r>
               <w:rPr>
-                <w:b/>
-                <w:sz w:val="24"/>
-              </w:rPr>
-              <w:t>A1</w:t>
-            </w:r>
-            <w:r>
-              <w:rPr>
-                <w:sz w:val="24"/>
-              </w:rPr>
-              <w:t xml:space="preserve">. Одно или несколько полей не прошли проверку (шаг 9): под каждым неверным полем показывается красное сообщение (role=alert, например </w:t>
-            </w:r>
-            <w:r>
-              <w:rPr>
-                <w:b/>
-                <w:sz w:val="24"/>
-              </w:rPr>
-              <w:t>«Имя не принято: поле пустое, короче двух символов или содержит цифры и знаки…»</w:t>
-            </w:r>
-            <w:r>
-              <w:rPr>
-                <w:sz w:val="24"/>
-              </w:rPr>
-              <w:t xml:space="preserve">), поле получает aria-invalid=true, фокус переходит на первое неверное поле в порядке имя, почта, нотация, команда, комментарий, согласие. </w:t>
-            </w:r>
-            <w:r>
-              <w:rPr>
-                <w:b/>
-                <w:sz w:val="24"/>
-              </w:rPr>
-              <w:t>Заявка не сохраняется</w:t>
-            </w:r>
-            <w:r>
-              <w:rPr>
-                <w:sz w:val="24"/>
-              </w:rPr>
-              <w:t>, страница не меняется. Поле с ошибкой перепроверяется при каждом вводе, остальные при выходе из поля. После исправления сообщение скрывается. Сценарий продолжается с шага 8.</w:t>
+                <w:sz w:val="24"/>
+              </w:rPr>
+              <w:t xml:space="preserve">Успех: массив </w:t>
+            </w:r>
+            <w:r>
+              <w:rPr>
+                <w:i/>
+                <w:sz w:val="24"/>
+              </w:rPr>
+              <w:t>dslkit.waitlist</w:t>
+            </w:r>
+            <w:r>
+              <w:rPr>
+                <w:sz w:val="24"/>
+              </w:rPr>
+              <w:t xml:space="preserve"> в </w:t>
+            </w:r>
+            <w:r>
+              <w:rPr>
+                <w:i/>
+                <w:sz w:val="24"/>
+              </w:rPr>
+              <w:t>LocalStorage</w:t>
+            </w:r>
+            <w:r>
+              <w:rPr>
+                <w:sz w:val="24"/>
+              </w:rPr>
+              <w:t xml:space="preserve"> длиннее на одну запись, открыта страница </w:t>
+            </w:r>
+            <w:r>
+              <w:rPr>
+                <w:i/>
+                <w:sz w:val="24"/>
+              </w:rPr>
+              <w:t>thanks.html</w:t>
+            </w:r>
+            <w:r>
+              <w:rPr>
+                <w:sz w:val="24"/>
+              </w:rPr>
+              <w:t xml:space="preserve"> (en/</w:t>
+            </w:r>
+            <w:r>
+              <w:rPr>
+                <w:i/>
+                <w:sz w:val="24"/>
+              </w:rPr>
+              <w:t>thanks.html</w:t>
+            </w:r>
+            <w:r>
+              <w:rPr>
+                <w:sz w:val="24"/>
+              </w:rPr>
+              <w:t>).</w:t>
             </w:r>
             <w:r>
               <w:br/>
             </w:r>
             <w:r>
               <w:rPr>
-                <w:b/>
-                <w:sz w:val="24"/>
-              </w:rPr>
-              <w:t>A2</w:t>
-            </w:r>
-            <w:r>
-              <w:rPr>
-                <w:sz w:val="24"/>
-              </w:rPr>
-              <w:t xml:space="preserve">. Согласие не отмечено (шаг 9): применяется A1; сообщение </w:t>
-            </w:r>
-            <w:r>
-              <w:rPr>
-                <w:b/>
-                <w:sz w:val="24"/>
-              </w:rPr>
-              <w:t>«Без согласия мы не можем отправить приглашение. Поставьте галочку, чтобы продолжить.»</w:t>
-            </w:r>
-            <w:r>
-              <w:br/>
-            </w:r>
-            <w:r>
-              <w:rPr>
-                <w:b/>
-                <w:sz w:val="24"/>
-              </w:rPr>
-              <w:t>A3</w:t>
-            </w:r>
-            <w:r>
-              <w:rPr>
-                <w:sz w:val="24"/>
-              </w:rPr>
-              <w:t>. Посетитель закрывает страницу или уходит со страницы до шага 8: данные не сохраняются, состояние системы не меняется.</w:t>
-            </w:r>
-            <w:r>
-              <w:br/>
-            </w:r>
-            <w:r>
-              <w:rPr>
-                <w:b/>
-                <w:sz w:val="24"/>
-              </w:rPr>
-              <w:t>A4</w:t>
-            </w:r>
-            <w:r>
-              <w:rPr>
-                <w:sz w:val="24"/>
-              </w:rPr>
-              <w:t xml:space="preserve">. Повторная заявка с тем же адресом (шаг 10): </w:t>
-            </w:r>
-            <w:r>
-              <w:rPr>
-                <w:b/>
-                <w:sz w:val="24"/>
-              </w:rPr>
-              <w:t>принимается как новая отдельная запись</w:t>
-            </w:r>
-            <w:r>
-              <w:rPr>
-                <w:sz w:val="24"/>
-              </w:rPr>
-              <w:t>, сообщения о дубликате нет (дефект D-1).</w:t>
-            </w:r>
-            <w:r>
-              <w:br/>
-            </w:r>
-            <w:r>
-              <w:rPr>
-                <w:b/>
-                <w:sz w:val="24"/>
-              </w:rPr>
-              <w:t>A5</w:t>
-            </w:r>
-            <w:r>
-              <w:rPr>
-                <w:sz w:val="24"/>
-              </w:rPr>
-              <w:t xml:space="preserve">. Повторное нажатие </w:t>
-            </w:r>
-            <w:r>
-              <w:rPr>
-                <w:b/>
-                <w:sz w:val="24"/>
-              </w:rPr>
-              <w:t>«Отправить»</w:t>
-            </w:r>
-            <w:r>
-              <w:rPr>
-                <w:sz w:val="24"/>
-              </w:rPr>
-              <w:t xml:space="preserve"> после успешной отправки (шаг 11): игнорируется, вторая запись не создаётся (флаг submitting).</w:t>
+                <w:sz w:val="24"/>
+              </w:rPr>
+              <w:t>Ошибка проверки (A1, A2): записей не добавилось, посетитель остаётся на главной странице, введённые значения остаются в полях.</w:t>
             </w:r>
           </w:p>
         </w:tc>
@@ -1354,7 +1453,7 @@
               <w:rPr>
                 <w:b/>
               </w:rPr>
-              <w:t>Постусловия</w:t>
+              <w:t>Исключительные ситуации</w:t>
             </w:r>
           </w:p>
         </w:tc>
@@ -1365,70 +1464,110 @@
           <w:p>
             <w:r>
               <w:rPr>
-                <w:sz w:val="24"/>
-              </w:rPr>
-              <w:t xml:space="preserve">Успех: массив </w:t>
+                <w:b/>
+                <w:sz w:val="24"/>
+              </w:rPr>
+              <w:t>E1</w:t>
+            </w:r>
+            <w:r>
+              <w:rPr>
+                <w:sz w:val="24"/>
+              </w:rPr>
+              <w:t xml:space="preserve">. Запись в </w:t>
             </w:r>
             <w:r>
               <w:rPr>
                 <w:i/>
                 <w:sz w:val="24"/>
               </w:rPr>
-              <w:t>dslkit.waitlist</w:t>
-            </w:r>
-            <w:r>
-              <w:rPr>
-                <w:sz w:val="24"/>
-              </w:rPr>
-              <w:t xml:space="preserve"> в </w:t>
+              <w:t>LocalStorage</w:t>
+            </w:r>
+            <w:r>
+              <w:rPr>
+                <w:sz w:val="24"/>
+              </w:rPr>
+              <w:t xml:space="preserve"> не удалась (хранилище переполнено или запрещено, шаг 10): метод </w:t>
             </w:r>
             <w:r>
               <w:rPr>
                 <w:i/>
                 <w:sz w:val="24"/>
               </w:rPr>
+              <w:t>storage.set</w:t>
+            </w:r>
+            <w:r>
+              <w:rPr>
+                <w:sz w:val="24"/>
+              </w:rPr>
+              <w:t xml:space="preserve"> возвращает false, но система всё равно открывает страницу благодарности; </w:t>
+            </w:r>
+            <w:r>
+              <w:rPr>
+                <w:b/>
+                <w:sz w:val="24"/>
+              </w:rPr>
+              <w:t>сообщения об ошибке нет</w:t>
+            </w:r>
+            <w:r>
+              <w:rPr>
+                <w:sz w:val="24"/>
+              </w:rPr>
+              <w:t xml:space="preserve">, </w:t>
+            </w:r>
+            <w:r>
+              <w:rPr>
+                <w:b/>
+                <w:sz w:val="24"/>
+              </w:rPr>
+              <w:t>заявка потеряна</w:t>
+            </w:r>
+            <w:r>
+              <w:rPr>
+                <w:sz w:val="24"/>
+              </w:rPr>
+              <w:t xml:space="preserve"> (дефект D-2).</w:t>
+            </w:r>
+            <w:r>
+              <w:br/>
+            </w:r>
+            <w:r>
+              <w:rPr>
+                <w:b/>
+                <w:sz w:val="24"/>
+              </w:rPr>
+              <w:t>E2</w:t>
+            </w:r>
+            <w:r>
+              <w:rPr>
+                <w:sz w:val="24"/>
+              </w:rPr>
+              <w:t xml:space="preserve">. </w:t>
+            </w:r>
+            <w:r>
+              <w:rPr>
+                <w:i/>
+                <w:sz w:val="24"/>
+              </w:rPr>
               <w:t>LocalStorage</w:t>
             </w:r>
             <w:r>
               <w:rPr>
                 <w:sz w:val="24"/>
               </w:rPr>
-              <w:t xml:space="preserve"> длиннее на одну запись, открыта страница </w:t>
+              <w:t xml:space="preserve"> недоступен совсем (</w:t>
             </w:r>
             <w:r>
               <w:rPr>
                 <w:i/>
                 <w:sz w:val="24"/>
               </w:rPr>
-              <w:t>thanks.html</w:t>
-            </w:r>
-            <w:r>
-              <w:rPr>
-                <w:sz w:val="24"/>
-              </w:rPr>
-              <w:t xml:space="preserve"> (en/</w:t>
-            </w:r>
-            <w:r>
-              <w:rPr>
-                <w:i/>
-                <w:sz w:val="24"/>
-              </w:rPr>
-              <w:t>thanks.html</w:t>
-            </w:r>
-            <w:r>
-              <w:rPr>
-                <w:sz w:val="24"/>
-              </w:rPr>
-              <w:t>).</w:t>
-            </w:r>
-            <w:r>
-              <w:br/>
-            </w:r>
-            <w:r>
-              <w:rPr>
-                <w:sz w:val="24"/>
-              </w:rPr>
-              <w:t>Ошибка проверки (A1, A2): записей не добавилось, посетитель остаётся на главной странице, введённые значения остаются в полях.</w:t>
+              <w:t>getStorage</w:t>
+            </w:r>
+            <w:r>
+              <w:rPr>
+                <w:sz w:val="24"/>
+              </w:rPr>
+              <w:t xml:space="preserve"> использует временное хранилище в памяти): заявка живёт только до закрытия страницы, посетитель видит страницу благодарности.</w:t>
             </w:r>
           </w:p>
         </w:tc>
@@ -1449,7 +1588,7 @@
               <w:rPr>
                 <w:b/>
               </w:rPr>
-              <w:t>Исключительные ситуации</w:t>
+              <w:t>Связанные требования</w:t>
             </w:r>
           </w:p>
         </w:tc>
@@ -1463,107 +1602,87 @@
                 <w:b/>
                 <w:sz w:val="24"/>
               </w:rPr>
-              <w:t>E1</w:t>
-            </w:r>
-            <w:r>
-              <w:rPr>
-                <w:sz w:val="24"/>
-              </w:rPr>
-              <w:t xml:space="preserve">. Запись в </w:t>
+              <w:t>R4</w:t>
+            </w:r>
+            <w:r>
+              <w:rPr>
+                <w:sz w:val="24"/>
+              </w:rPr>
+              <w:t xml:space="preserve"> — Форма заявки и валидация</w:t>
+            </w:r>
+            <w:r>
+              <w:br/>
+            </w:r>
+            <w:r>
+              <w:rPr>
+                <w:b/>
+                <w:sz w:val="24"/>
+              </w:rPr>
+              <w:t>R1</w:t>
+            </w:r>
+            <w:r>
+              <w:rPr>
+                <w:sz w:val="24"/>
+              </w:rPr>
+              <w:t xml:space="preserve"> — Доступность страниц (главная, </w:t>
             </w:r>
             <w:r>
               <w:rPr>
                 <w:i/>
                 <w:sz w:val="24"/>
               </w:rPr>
-              <w:t>LocalStorage</w:t>
-            </w:r>
-            <w:r>
-              <w:rPr>
-                <w:sz w:val="24"/>
-              </w:rPr>
-              <w:t xml:space="preserve"> не удалась (хранилище переполнено или запрещено, шаг 10): метод </w:t>
+              <w:t>thanks.html</w:t>
+            </w:r>
+            <w:r>
+              <w:rPr>
+                <w:sz w:val="24"/>
+              </w:rPr>
+              <w:t xml:space="preserve">, </w:t>
             </w:r>
             <w:r>
               <w:rPr>
                 <w:i/>
                 <w:sz w:val="24"/>
               </w:rPr>
-              <w:t>storage.set</w:t>
-            </w:r>
-            <w:r>
-              <w:rPr>
-                <w:sz w:val="24"/>
-              </w:rPr>
-              <w:t xml:space="preserve"> возвращает false, но система всё равно открывает страницу благодарности; </w:t>
+              <w:t>privacy.html</w:t>
+            </w:r>
+            <w:r>
+              <w:rPr>
+                <w:sz w:val="24"/>
+              </w:rPr>
+              <w:t>)</w:t>
+            </w:r>
+            <w:r>
+              <w:br/>
             </w:r>
             <w:r>
               <w:rPr>
                 <w:b/>
                 <w:sz w:val="24"/>
               </w:rPr>
-              <w:t>сообщения об ошибке нет</w:t>
-            </w:r>
-            <w:r>
-              <w:rPr>
-                <w:sz w:val="24"/>
-              </w:rPr>
-              <w:t xml:space="preserve">, </w:t>
+              <w:t>R6</w:t>
+            </w:r>
+            <w:r>
+              <w:rPr>
+                <w:sz w:val="24"/>
+              </w:rPr>
+              <w:t xml:space="preserve"> — Разметка и локализация (русская и английская версии)</w:t>
+            </w:r>
+            <w:r>
+              <w:br/>
             </w:r>
             <w:r>
               <w:rPr>
                 <w:b/>
                 <w:sz w:val="24"/>
               </w:rPr>
-              <w:t>заявка потеряна</w:t>
-            </w:r>
-            <w:r>
-              <w:rPr>
-                <w:sz w:val="24"/>
-              </w:rPr>
-              <w:t xml:space="preserve"> (дефект D-2).</w:t>
-            </w:r>
-            <w:r>
-              <w:br/>
-            </w:r>
-            <w:r>
-              <w:rPr>
-                <w:b/>
-                <w:sz w:val="24"/>
-              </w:rPr>
-              <w:t>E2</w:t>
-            </w:r>
-            <w:r>
-              <w:rPr>
-                <w:sz w:val="24"/>
-              </w:rPr>
-              <w:t xml:space="preserve">. </w:t>
-            </w:r>
-            <w:r>
-              <w:rPr>
-                <w:i/>
-                <w:sz w:val="24"/>
-              </w:rPr>
-              <w:t>LocalStorage</w:t>
-            </w:r>
-            <w:r>
-              <w:rPr>
-                <w:sz w:val="24"/>
-              </w:rPr>
-              <w:t xml:space="preserve"> недоступен совсем (</w:t>
-            </w:r>
-            <w:r>
-              <w:rPr>
-                <w:i/>
-                <w:sz w:val="24"/>
-              </w:rPr>
-              <w:t>getStorage</w:t>
-            </w:r>
-            <w:r>
-              <w:rPr>
-                <w:sz w:val="24"/>
-              </w:rPr>
-              <w:t xml:space="preserve"> использует временное хранилище в памяти): заявка живёт только до закрытия страницы, посетитель видит страницу благодарности.</w:t>
+              <w:t>R9</w:t>
+            </w:r>
+            <w:r>
+              <w:rPr>
+                <w:sz w:val="24"/>
+              </w:rPr>
+              <w:t xml:space="preserve"> — Локальное хранилище</w:t>
             </w:r>
           </w:p>
         </w:tc>
@@ -1584,7 +1703,7 @@
               <w:rPr>
                 <w:b/>
               </w:rPr>
-              <w:t>Связанные требования</w:t>
+              <w:t>Подзадачи</w:t>
             </w:r>
           </w:p>
         </w:tc>
@@ -1598,13 +1717,13 @@
                 <w:b/>
                 <w:sz w:val="24"/>
               </w:rPr>
-              <w:t>R4</w:t>
-            </w:r>
-            <w:r>
-              <w:rPr>
-                <w:sz w:val="24"/>
-              </w:rPr>
-              <w:t xml:space="preserve"> — Форма заявки и валидация</w:t>
+              <w:t>UC-01.1</w:t>
+            </w:r>
+            <w:r>
+              <w:rPr>
+                <w:sz w:val="24"/>
+              </w:rPr>
+              <w:t xml:space="preserve"> — Показ формы и подсказок к полям</w:t>
             </w:r>
             <w:r>
               <w:br/>
@@ -1614,39 +1733,52 @@
                 <w:b/>
                 <w:sz w:val="24"/>
               </w:rPr>
-              <w:t>R1</w:t>
-            </w:r>
-            <w:r>
-              <w:rPr>
-                <w:sz w:val="24"/>
-              </w:rPr>
-              <w:t xml:space="preserve"> — Доступность страниц (главная, </w:t>
+              <w:t>UC-01.2</w:t>
+            </w:r>
+            <w:r>
+              <w:rPr>
+                <w:sz w:val="24"/>
+              </w:rPr>
+              <w:t xml:space="preserve"> — Чтение, очистка и проверка значений по П1–П6</w:t>
+            </w:r>
+            <w:r>
+              <w:br/>
+            </w:r>
+            <w:r>
+              <w:rPr>
+                <w:b/>
+                <w:sz w:val="24"/>
+              </w:rPr>
+              <w:t>UC-01.3</w:t>
+            </w:r>
+            <w:r>
+              <w:rPr>
+                <w:sz w:val="24"/>
+              </w:rPr>
+              <w:t xml:space="preserve"> — Показ ошибок, фокус и повторная проверка</w:t>
+            </w:r>
+            <w:r>
+              <w:br/>
+            </w:r>
+            <w:r>
+              <w:rPr>
+                <w:b/>
+                <w:sz w:val="24"/>
+              </w:rPr>
+              <w:t>UC-01.4</w:t>
+            </w:r>
+            <w:r>
+              <w:rPr>
+                <w:sz w:val="24"/>
+              </w:rPr>
+              <w:t xml:space="preserve"> — Сохранение заявки в </w:t>
             </w:r>
             <w:r>
               <w:rPr>
                 <w:i/>
                 <w:sz w:val="24"/>
               </w:rPr>
-              <w:t>thanks.html</w:t>
-            </w:r>
-            <w:r>
-              <w:rPr>
-                <w:sz w:val="24"/>
-              </w:rPr>
-              <w:t xml:space="preserve">, </w:t>
-            </w:r>
-            <w:r>
-              <w:rPr>
-                <w:i/>
-                <w:sz w:val="24"/>
-              </w:rPr>
-              <w:t>privacy.html</w:t>
-            </w:r>
-            <w:r>
-              <w:rPr>
-                <w:sz w:val="24"/>
-              </w:rPr>
-              <w:t>)</w:t>
+              <w:t>LocalStorage</w:t>
             </w:r>
             <w:r>
               <w:br/>
@@ -1656,29 +1788,13 @@
                 <w:b/>
                 <w:sz w:val="24"/>
               </w:rPr>
-              <w:t>R6</w:t>
-            </w:r>
-            <w:r>
-              <w:rPr>
-                <w:sz w:val="24"/>
-              </w:rPr>
-              <w:t xml:space="preserve"> — Разметка и локализация (русская и английская версии)</w:t>
-            </w:r>
-            <w:r>
-              <w:br/>
-            </w:r>
-            <w:r>
-              <w:rPr>
-                <w:b/>
-                <w:sz w:val="24"/>
-              </w:rPr>
-              <w:t>R9</w:t>
-            </w:r>
-            <w:r>
-              <w:rPr>
-                <w:sz w:val="24"/>
-              </w:rPr>
-              <w:t xml:space="preserve"> — Локальное хранилище</w:t>
+              <w:t>UC-01.5</w:t>
+            </w:r>
+            <w:r>
+              <w:rPr>
+                <w:sz w:val="24"/>
+              </w:rPr>
+              <w:t xml:space="preserve"> — Переход на страницу благодарности</w:t>
             </w:r>
           </w:p>
         </w:tc>
@@ -1699,7 +1815,7 @@
               <w:rPr>
                 <w:b/>
               </w:rPr>
-              <w:t>Подзадачи</w:t>
+              <w:t>Связанные задачи и use case</w:t>
             </w:r>
           </w:p>
         </w:tc>
@@ -1713,13 +1829,26 @@
                 <w:b/>
                 <w:sz w:val="24"/>
               </w:rPr>
-              <w:t>UC-01.1</w:t>
-            </w:r>
-            <w:r>
-              <w:rPr>
-                <w:sz w:val="24"/>
-              </w:rPr>
-              <w:t xml:space="preserve"> — Показ формы и подсказок к полям</w:t>
+              <w:t>UC-00</w:t>
+            </w:r>
+            <w:r>
+              <w:rPr>
+                <w:sz w:val="24"/>
+              </w:rPr>
+              <w:t xml:space="preserve"> — Прочитать политику конфиденциальности (ссылка в тексте согласия, </w:t>
+            </w:r>
+            <w:r>
+              <w:rPr>
+                <w:i/>
+                <w:sz w:val="24"/>
+              </w:rPr>
+              <w:t>privacy.html</w:t>
+            </w:r>
+            <w:r>
+              <w:rPr>
+                <w:sz w:val="24"/>
+              </w:rPr>
+              <w:t>)</w:t>
             </w:r>
             <w:r>
               <w:br/>
@@ -1729,13 +1858,39 @@
                 <w:b/>
                 <w:sz w:val="24"/>
               </w:rPr>
-              <w:t>UC-01.2</w:t>
-            </w:r>
-            <w:r>
-              <w:rPr>
-                <w:sz w:val="24"/>
-              </w:rPr>
-              <w:t xml:space="preserve"> — Чтение, очистка и проверка значений по П1–П6</w:t>
+              <w:t>UC-02</w:t>
+            </w:r>
+            <w:r>
+              <w:rPr>
+                <w:sz w:val="24"/>
+              </w:rPr>
+              <w:t xml:space="preserve"> — Выбрать нотацию на карточке и перейти к записи (ссылки </w:t>
+            </w:r>
+            <w:r>
+              <w:rPr>
+                <w:b/>
+                <w:sz w:val="24"/>
+              </w:rPr>
+              <w:t>«Записаться в бету: UML»</w:t>
+            </w:r>
+            <w:r>
+              <w:rPr>
+                <w:sz w:val="24"/>
+              </w:rPr>
+              <w:t xml:space="preserve">, </w:t>
+            </w:r>
+            <w:r>
+              <w:rPr>
+                <w:b/>
+                <w:sz w:val="24"/>
+              </w:rPr>
+              <w:t>«…: BPMN»</w:t>
+            </w:r>
+            <w:r>
+              <w:rPr>
+                <w:sz w:val="24"/>
+              </w:rPr>
+              <w:t>)</w:t>
             </w:r>
             <w:r>
               <w:br/>
@@ -1745,13 +1900,39 @@
                 <w:b/>
                 <w:sz w:val="24"/>
               </w:rPr>
-              <w:t>UC-01.3</w:t>
-            </w:r>
-            <w:r>
-              <w:rPr>
-                <w:sz w:val="24"/>
-              </w:rPr>
-              <w:t xml:space="preserve"> — Показ ошибок, фокус и повторная проверка</w:t>
+              <w:t>UC-03</w:t>
+            </w:r>
+            <w:r>
+              <w:rPr>
+                <w:sz w:val="24"/>
+              </w:rPr>
+              <w:t xml:space="preserve"> — Авторизация и вход в приложение: в текущей версии </w:t>
+            </w:r>
+            <w:r>
+              <w:rPr>
+                <w:i/>
+                <w:sz w:val="24"/>
+              </w:rPr>
+              <w:t>не реализована</w:t>
+            </w:r>
+            <w:r>
+              <w:rPr>
+                <w:sz w:val="24"/>
+              </w:rPr>
+              <w:t>, форма и приложение (</w:t>
+            </w:r>
+            <w:r>
+              <w:rPr>
+                <w:i/>
+                <w:sz w:val="24"/>
+              </w:rPr>
+              <w:t>site/app/</w:t>
+            </w:r>
+            <w:r>
+              <w:rPr>
+                <w:sz w:val="24"/>
+              </w:rPr>
+              <w:t>) работают без входа; задача на будущее, после появления серверной части</w:t>
             </w:r>
             <w:r>
               <w:br/>
@@ -1761,132 +1942,26 @@
                 <w:b/>
                 <w:sz w:val="24"/>
               </w:rPr>
-              <w:t>UC-01.4</w:t>
-            </w:r>
-            <w:r>
-              <w:rPr>
-                <w:sz w:val="24"/>
-              </w:rPr>
-              <w:t xml:space="preserve"> — Сохранение заявки в </w:t>
+              <w:t>UC-04</w:t>
+            </w:r>
+            <w:r>
+              <w:rPr>
+                <w:sz w:val="24"/>
+              </w:rPr>
+              <w:t xml:space="preserve"> — Запись в бету из React-приложения (</w:t>
             </w:r>
             <w:r>
               <w:rPr>
                 <w:i/>
                 <w:sz w:val="24"/>
               </w:rPr>
-              <w:t>LocalStorage</w:t>
-            </w:r>
-            <w:r>
-              <w:br/>
-            </w:r>
-            <w:r>
-              <w:rPr>
-                <w:b/>
-                <w:sz w:val="24"/>
-              </w:rPr>
-              <w:t>UC-01.5</w:t>
-            </w:r>
-            <w:r>
-              <w:rPr>
-                <w:sz w:val="24"/>
-              </w:rPr>
-              <w:t xml:space="preserve"> — Переход на страницу благодарности</w:t>
-            </w:r>
-          </w:p>
-        </w:tc>
-      </w:tr>
-      <w:tr>
-        <w:tc>
-          <w:tcPr>
-            <w:tcW w:type="dxa" w:w="2381"/>
-            <w:shd w:val="clear" w:fill="F2F2F2"/>
-          </w:tcPr>
-          <w:p>
-            <w:r>
-              <w:rPr>
-                <w:sz w:val="24"/>
-              </w:rPr>
-            </w:r>
-            <w:r>
-              <w:rPr>
-                <w:b/>
-              </w:rPr>
-              <w:t>Связанные задачи и use case</w:t>
-            </w:r>
-          </w:p>
-        </w:tc>
-        <w:tc>
-          <w:tcPr>
-            <w:tcW w:type="dxa" w:w="7370"/>
-          </w:tcPr>
-          <w:p>
-            <w:r>
-              <w:rPr>
-                <w:b/>
-                <w:sz w:val="24"/>
-              </w:rPr>
-              <w:t>UC-00</w:t>
-            </w:r>
-            <w:r>
-              <w:rPr>
-                <w:sz w:val="24"/>
-              </w:rPr>
-              <w:t xml:space="preserve"> — Прочитать политику конфиденциальности (ссылка в тексте согласия, </w:t>
-            </w:r>
-            <w:r>
-              <w:rPr>
-                <w:i/>
-                <w:sz w:val="24"/>
-              </w:rPr>
-              <w:t>privacy.html</w:t>
-            </w:r>
-            <w:r>
-              <w:rPr>
-                <w:sz w:val="24"/>
-              </w:rPr>
-              <w:t>)</w:t>
-            </w:r>
-            <w:r>
-              <w:br/>
-            </w:r>
-            <w:r>
-              <w:rPr>
-                <w:b/>
-                <w:sz w:val="24"/>
-              </w:rPr>
-              <w:t>UC-02</w:t>
-            </w:r>
-            <w:r>
-              <w:rPr>
-                <w:sz w:val="24"/>
-              </w:rPr>
-              <w:t xml:space="preserve"> — Выбрать нотацию на карточке и перейти к записи (ссылки </w:t>
-            </w:r>
-            <w:r>
-              <w:rPr>
-                <w:b/>
-                <w:sz w:val="24"/>
-              </w:rPr>
-              <w:t>«Записаться в бету: UML»</w:t>
-            </w:r>
-            <w:r>
-              <w:rPr>
-                <w:sz w:val="24"/>
-              </w:rPr>
-              <w:t xml:space="preserve">, </w:t>
-            </w:r>
-            <w:r>
-              <w:rPr>
-                <w:b/>
-                <w:sz w:val="24"/>
-              </w:rPr>
-              <w:t>«…: BPMN»</w:t>
-            </w:r>
-            <w:r>
-              <w:rPr>
-                <w:sz w:val="24"/>
-              </w:rPr>
-              <w:t>)</w:t>
+              <w:t>react-app/src/App.jsx</w:t>
+            </w:r>
+            <w:r>
+              <w:rPr>
+                <w:sz w:val="24"/>
+              </w:rPr>
+              <w:t>, лаб. 7)</w:t>
             </w:r>
             <w:r>
               <w:br/>
@@ -2623,6 +2698,829 @@
       </w:tr>
     </w:tbl>
     <w:p/>
+    <w:p>
+      <w:pPr>
+        <w:pStyle w:val="Heading2"/>
+      </w:pPr>
+      <w:r>
+        <w:t>Структура данных заявки (сущность WaitlistEntry)</w:t>
+      </w:r>
+    </w:p>
+    <w:tbl>
+      <w:tblPr>
+        <w:tblStyle w:val="TableGrid"/>
+        <w:tblW w:type="auto" w:w="0"/>
+        <w:tblLook w:firstColumn="1" w:firstRow="1" w:lastColumn="0" w:lastRow="0" w:noHBand="0" w:noVBand="1" w:val="04A0"/>
+      </w:tblPr>
+      <w:tblGrid>
+        <w:gridCol w:w="1457"/>
+        <w:gridCol w:w="1457"/>
+        <w:gridCol w:w="1457"/>
+        <w:gridCol w:w="1457"/>
+        <w:gridCol w:w="1457"/>
+        <w:gridCol w:w="1457"/>
+        <w:gridCol w:w="1457"/>
+      </w:tblGrid>
+      <w:tr>
+        <w:tc>
+          <w:tcPr>
+            <w:tcW w:type="dxa" w:w="1077"/>
+            <w:shd w:val="clear" w:fill="D9E2F3"/>
+          </w:tcPr>
+          <w:p>
+            <w:r>
+              <w:rPr>
+                <w:sz w:val="24"/>
+              </w:rPr>
+            </w:r>
+            <w:r>
+              <w:rPr>
+                <w:b/>
+                <w:sz w:val="24"/>
+              </w:rPr>
+              <w:t>Поле</w:t>
+            </w:r>
+          </w:p>
+        </w:tc>
+        <w:tc>
+          <w:tcPr>
+            <w:tcW w:type="dxa" w:w="1361"/>
+            <w:shd w:val="clear" w:fill="D9E2F3"/>
+          </w:tcPr>
+          <w:p>
+            <w:r>
+              <w:rPr>
+                <w:sz w:val="24"/>
+              </w:rPr>
+            </w:r>
+            <w:r>
+              <w:rPr>
+                <w:b/>
+                <w:sz w:val="24"/>
+              </w:rPr>
+              <w:t>Тип и длина</w:t>
+            </w:r>
+          </w:p>
+        </w:tc>
+        <w:tc>
+          <w:tcPr>
+            <w:tcW w:type="dxa" w:w="1871"/>
+            <w:shd w:val="clear" w:fill="D9E2F3"/>
+          </w:tcPr>
+          <w:p>
+            <w:r>
+              <w:rPr>
+                <w:sz w:val="24"/>
+              </w:rPr>
+            </w:r>
+            <w:r>
+              <w:rPr>
+                <w:b/>
+                <w:sz w:val="24"/>
+              </w:rPr>
+              <w:t>Обязательность, уникальность</w:t>
+            </w:r>
+          </w:p>
+        </w:tc>
+        <w:tc>
+          <w:tcPr>
+            <w:tcW w:type="dxa" w:w="2041"/>
+            <w:shd w:val="clear" w:fill="D9E2F3"/>
+          </w:tcPr>
+          <w:p>
+            <w:r>
+              <w:rPr>
+                <w:sz w:val="24"/>
+              </w:rPr>
+            </w:r>
+            <w:r>
+              <w:rPr>
+                <w:b/>
+                <w:sz w:val="24"/>
+              </w:rPr>
+              <w:t>Маска, формат</w:t>
+            </w:r>
+          </w:p>
+        </w:tc>
+        <w:tc>
+          <w:tcPr>
+            <w:tcW w:type="dxa" w:w="850"/>
+            <w:shd w:val="clear" w:fill="D9E2F3"/>
+          </w:tcPr>
+          <w:p>
+            <w:r>
+              <w:rPr>
+                <w:sz w:val="24"/>
+              </w:rPr>
+            </w:r>
+            <w:r>
+              <w:rPr>
+                <w:b/>
+                <w:sz w:val="24"/>
+              </w:rPr>
+              <w:t>По умолч.</w:t>
+            </w:r>
+          </w:p>
+        </w:tc>
+        <w:tc>
+          <w:tcPr>
+            <w:tcW w:type="dxa" w:w="1701"/>
+            <w:shd w:val="clear" w:fill="D9E2F3"/>
+          </w:tcPr>
+          <w:p>
+            <w:r>
+              <w:rPr>
+                <w:sz w:val="24"/>
+              </w:rPr>
+            </w:r>
+            <w:r>
+              <w:rPr>
+                <w:b/>
+                <w:sz w:val="24"/>
+              </w:rPr>
+              <w:t>Связь</w:t>
+            </w:r>
+          </w:p>
+        </w:tc>
+        <w:tc>
+          <w:tcPr>
+            <w:tcW w:type="dxa" w:w="737"/>
+            <w:shd w:val="clear" w:fill="D9E2F3"/>
+          </w:tcPr>
+          <w:p>
+            <w:r>
+              <w:rPr>
+                <w:sz w:val="24"/>
+              </w:rPr>
+            </w:r>
+            <w:r>
+              <w:rPr>
+                <w:b/>
+                <w:sz w:val="24"/>
+              </w:rPr>
+              <w:t>Правило</w:t>
+            </w:r>
+          </w:p>
+        </w:tc>
+      </w:tr>
+      <w:tr>
+        <w:tc>
+          <w:tcPr>
+            <w:tcW w:type="dxa" w:w="1077"/>
+          </w:tcPr>
+          <w:p>
+            <w:r>
+              <w:rPr>
+                <w:sz w:val="24"/>
+              </w:rPr>
+              <w:t>name*</w:t>
+            </w:r>
+          </w:p>
+        </w:tc>
+        <w:tc>
+          <w:tcPr>
+            <w:tcW w:type="dxa" w:w="1361"/>
+          </w:tcPr>
+          <w:p>
+            <w:r>
+              <w:rPr>
+                <w:sz w:val="24"/>
+              </w:rPr>
+              <w:t>string (VARCHAR), длина 2–60</w:t>
+            </w:r>
+          </w:p>
+        </w:tc>
+        <w:tc>
+          <w:tcPr>
+            <w:tcW w:type="dxa" w:w="1871"/>
+          </w:tcPr>
+          <w:p>
+            <w:r>
+              <w:rPr>
+                <w:sz w:val="24"/>
+              </w:rPr>
+              <w:t>Да (NOT NULL); уникальность: Нет</w:t>
+            </w:r>
+          </w:p>
+        </w:tc>
+        <w:tc>
+          <w:tcPr>
+            <w:tcW w:type="dxa" w:w="2041"/>
+          </w:tcPr>
+          <w:p>
+            <w:r>
+              <w:rPr>
+                <w:sz w:val="24"/>
+              </w:rPr>
+              <w:t>^\p{L}[\p{L}' ’-]{1,59}$ (флаг u), перед проверкой пробелы по краям убираются</w:t>
+            </w:r>
+          </w:p>
+        </w:tc>
+        <w:tc>
+          <w:tcPr>
+            <w:tcW w:type="dxa" w:w="850"/>
+          </w:tcPr>
+          <w:p>
+            <w:r>
+              <w:rPr>
+                <w:sz w:val="24"/>
+              </w:rPr>
+              <w:t>—</w:t>
+            </w:r>
+          </w:p>
+        </w:tc>
+        <w:tc>
+          <w:tcPr>
+            <w:tcW w:type="dxa" w:w="1701"/>
+          </w:tcPr>
+          <w:p>
+            <w:r>
+              <w:rPr>
+                <w:sz w:val="24"/>
+              </w:rPr>
+              <w:t>Связей нет</w:t>
+            </w:r>
+          </w:p>
+        </w:tc>
+        <w:tc>
+          <w:tcPr>
+            <w:tcW w:type="dxa" w:w="737"/>
+          </w:tcPr>
+          <w:p>
+            <w:r>
+              <w:rPr>
+                <w:sz w:val="24"/>
+              </w:rPr>
+              <w:t>П1</w:t>
+            </w:r>
+          </w:p>
+        </w:tc>
+      </w:tr>
+      <w:tr>
+        <w:tc>
+          <w:tcPr>
+            <w:tcW w:type="dxa" w:w="1077"/>
+          </w:tcPr>
+          <w:p>
+            <w:r>
+              <w:rPr>
+                <w:sz w:val="24"/>
+              </w:rPr>
+              <w:t>email*</w:t>
+            </w:r>
+          </w:p>
+        </w:tc>
+        <w:tc>
+          <w:tcPr>
+            <w:tcW w:type="dxa" w:w="1361"/>
+          </w:tcPr>
+          <w:p>
+            <w:r>
+              <w:rPr>
+                <w:sz w:val="24"/>
+              </w:rPr>
+              <w:t>string (VARCHAR), длина 6–120</w:t>
+            </w:r>
+          </w:p>
+        </w:tc>
+        <w:tc>
+          <w:tcPr>
+            <w:tcW w:type="dxa" w:w="1871"/>
+          </w:tcPr>
+          <w:p>
+            <w:r>
+              <w:rPr>
+                <w:sz w:val="24"/>
+              </w:rPr>
+              <w:t>Да (NOT NULL); уникальность: Нет (дубликаты принимаются, D-1); рекомендуется уникальность без учёта регистра</w:t>
+            </w:r>
+          </w:p>
+        </w:tc>
+        <w:tc>
+          <w:tcPr>
+            <w:tcW w:type="dxa" w:w="2041"/>
+          </w:tcPr>
+          <w:p>
+            <w:r>
+              <w:rPr>
+                <w:sz w:val="24"/>
+              </w:rPr>
+              <w:t>^[^\s@]+@[^\s@.]+(?:\.[^\s@.]+)*\.[^\s@.]{2,}$, пробелы по краям убираются</w:t>
+            </w:r>
+          </w:p>
+        </w:tc>
+        <w:tc>
+          <w:tcPr>
+            <w:tcW w:type="dxa" w:w="850"/>
+          </w:tcPr>
+          <w:p>
+            <w:r>
+              <w:rPr>
+                <w:sz w:val="24"/>
+              </w:rPr>
+              <w:t>—</w:t>
+            </w:r>
+          </w:p>
+        </w:tc>
+        <w:tc>
+          <w:tcPr>
+            <w:tcW w:type="dxa" w:w="1701"/>
+          </w:tcPr>
+          <w:p>
+            <w:r>
+              <w:rPr>
+                <w:sz w:val="24"/>
+              </w:rPr>
+              <w:t>Адрес получателя приглашения; связи с таблицами нет</w:t>
+            </w:r>
+          </w:p>
+        </w:tc>
+        <w:tc>
+          <w:tcPr>
+            <w:tcW w:type="dxa" w:w="737"/>
+          </w:tcPr>
+          <w:p>
+            <w:r>
+              <w:rPr>
+                <w:sz w:val="24"/>
+              </w:rPr>
+              <w:t>П2</w:t>
+            </w:r>
+          </w:p>
+        </w:tc>
+      </w:tr>
+      <w:tr>
+        <w:tc>
+          <w:tcPr>
+            <w:tcW w:type="dxa" w:w="1077"/>
+          </w:tcPr>
+          <w:p>
+            <w:r>
+              <w:rPr>
+                <w:sz w:val="24"/>
+              </w:rPr>
+              <w:t>notation*</w:t>
+            </w:r>
+          </w:p>
+        </w:tc>
+        <w:tc>
+          <w:tcPr>
+            <w:tcW w:type="dxa" w:w="1361"/>
+          </w:tcPr>
+          <w:p>
+            <w:r>
+              <w:rPr>
+                <w:sz w:val="24"/>
+              </w:rPr>
+              <w:t>enum (6 значений), длина 3–5</w:t>
+            </w:r>
+          </w:p>
+        </w:tc>
+        <w:tc>
+          <w:tcPr>
+            <w:tcW w:type="dxa" w:w="1871"/>
+          </w:tcPr>
+          <w:p>
+            <w:r>
+              <w:rPr>
+                <w:sz w:val="24"/>
+              </w:rPr>
+              <w:t>Да (NOT NULL); уникальность: Нет</w:t>
+            </w:r>
+          </w:p>
+        </w:tc>
+        <w:tc>
+          <w:tcPr>
+            <w:tcW w:type="dxa" w:w="2041"/>
+          </w:tcPr>
+          <w:p>
+            <w:r>
+              <w:rPr>
+                <w:sz w:val="24"/>
+              </w:rPr>
+              <w:t>Точное совпадение с одним из: idef0, dfd, erd, bpmn, uml, petri (строчные)</w:t>
+            </w:r>
+          </w:p>
+        </w:tc>
+        <w:tc>
+          <w:tcPr>
+            <w:tcW w:type="dxa" w:w="850"/>
+          </w:tcPr>
+          <w:p>
+            <w:r>
+              <w:rPr>
+                <w:sz w:val="24"/>
+              </w:rPr>
+              <w:t>не выбрано</w:t>
+            </w:r>
+          </w:p>
+        </w:tc>
+        <w:tc>
+          <w:tcPr>
+            <w:tcW w:type="dxa" w:w="1701"/>
+          </w:tcPr>
+          <w:p>
+            <w:r>
+              <w:rPr>
+                <w:sz w:val="24"/>
+              </w:rPr>
+              <w:t>FK → Notation.id (N:1), справочник NOTATIONS в validation.js</w:t>
+            </w:r>
+          </w:p>
+        </w:tc>
+        <w:tc>
+          <w:tcPr>
+            <w:tcW w:type="dxa" w:w="737"/>
+          </w:tcPr>
+          <w:p>
+            <w:r>
+              <w:rPr>
+                <w:sz w:val="24"/>
+              </w:rPr>
+              <w:t>П3</w:t>
+            </w:r>
+          </w:p>
+        </w:tc>
+      </w:tr>
+      <w:tr>
+        <w:tc>
+          <w:tcPr>
+            <w:tcW w:type="dxa" w:w="1077"/>
+          </w:tcPr>
+          <w:p>
+            <w:r>
+              <w:rPr>
+                <w:sz w:val="24"/>
+              </w:rPr>
+              <w:t>team*</w:t>
+            </w:r>
+          </w:p>
+        </w:tc>
+        <w:tc>
+          <w:tcPr>
+            <w:tcW w:type="dxa" w:w="1361"/>
+          </w:tcPr>
+          <w:p>
+            <w:r>
+              <w:rPr>
+                <w:sz w:val="24"/>
+              </w:rPr>
+              <w:t>integer, длина 0–500 (до 3 цифр)</w:t>
+            </w:r>
+          </w:p>
+        </w:tc>
+        <w:tc>
+          <w:tcPr>
+            <w:tcW w:type="dxa" w:w="1871"/>
+          </w:tcPr>
+          <w:p>
+            <w:r>
+              <w:rPr>
+                <w:sz w:val="24"/>
+              </w:rPr>
+              <w:t>Да (NOT NULL); уникальность: Нет</w:t>
+            </w:r>
+          </w:p>
+        </w:tc>
+        <w:tc>
+          <w:tcPr>
+            <w:tcW w:type="dxa" w:w="2041"/>
+          </w:tcPr>
+          <w:p>
+            <w:r>
+              <w:rPr>
+                <w:sz w:val="24"/>
+              </w:rPr>
+              <w:t>Целое число; строка допустима при маске ^\d+$</w:t>
+            </w:r>
+          </w:p>
+        </w:tc>
+        <w:tc>
+          <w:tcPr>
+            <w:tcW w:type="dxa" w:w="850"/>
+          </w:tcPr>
+          <w:p>
+            <w:r>
+              <w:rPr>
+                <w:sz w:val="24"/>
+              </w:rPr>
+              <w:t>0</w:t>
+            </w:r>
+          </w:p>
+        </w:tc>
+        <w:tc>
+          <w:tcPr>
+            <w:tcW w:type="dxa" w:w="1701"/>
+          </w:tcPr>
+          <w:p>
+            <w:r>
+              <w:rPr>
+                <w:sz w:val="24"/>
+              </w:rPr>
+              <w:t>Связей нет</w:t>
+            </w:r>
+          </w:p>
+        </w:tc>
+        <w:tc>
+          <w:tcPr>
+            <w:tcW w:type="dxa" w:w="737"/>
+          </w:tcPr>
+          <w:p>
+            <w:r>
+              <w:rPr>
+                <w:sz w:val="24"/>
+              </w:rPr>
+              <w:t>П4</w:t>
+            </w:r>
+          </w:p>
+        </w:tc>
+      </w:tr>
+      <w:tr>
+        <w:tc>
+          <w:tcPr>
+            <w:tcW w:type="dxa" w:w="1077"/>
+          </w:tcPr>
+          <w:p>
+            <w:r>
+              <w:rPr>
+                <w:sz w:val="24"/>
+              </w:rPr>
+              <w:t>comment</w:t>
+            </w:r>
+          </w:p>
+        </w:tc>
+        <w:tc>
+          <w:tcPr>
+            <w:tcW w:type="dxa" w:w="1361"/>
+          </w:tcPr>
+          <w:p>
+            <w:r>
+              <w:rPr>
+                <w:sz w:val="24"/>
+              </w:rPr>
+              <w:t>string (TEXT), длина 0–500</w:t>
+            </w:r>
+          </w:p>
+        </w:tc>
+        <w:tc>
+          <w:tcPr>
+            <w:tcW w:type="dxa" w:w="1871"/>
+          </w:tcPr>
+          <w:p>
+            <w:r>
+              <w:rPr>
+                <w:sz w:val="24"/>
+              </w:rPr>
+              <w:t>Нет (допустима пустая строка); уникальность: Нет</w:t>
+            </w:r>
+          </w:p>
+        </w:tc>
+        <w:tc>
+          <w:tcPr>
+            <w:tcW w:type="dxa" w:w="2041"/>
+          </w:tcPr>
+          <w:p>
+            <w:r>
+              <w:rPr>
+                <w:sz w:val="24"/>
+              </w:rPr>
+              <w:t>Без маски; пробелы по краям убираются при сохранении</w:t>
+            </w:r>
+          </w:p>
+        </w:tc>
+        <w:tc>
+          <w:tcPr>
+            <w:tcW w:type="dxa" w:w="850"/>
+          </w:tcPr>
+          <w:p>
+            <w:r>
+              <w:rPr>
+                <w:sz w:val="24"/>
+              </w:rPr>
+              <w:t>пусто</w:t>
+            </w:r>
+          </w:p>
+        </w:tc>
+        <w:tc>
+          <w:tcPr>
+            <w:tcW w:type="dxa" w:w="1701"/>
+          </w:tcPr>
+          <w:p>
+            <w:r>
+              <w:rPr>
+                <w:sz w:val="24"/>
+              </w:rPr>
+              <w:t>Связей нет</w:t>
+            </w:r>
+          </w:p>
+        </w:tc>
+        <w:tc>
+          <w:tcPr>
+            <w:tcW w:type="dxa" w:w="737"/>
+          </w:tcPr>
+          <w:p>
+            <w:r>
+              <w:rPr>
+                <w:sz w:val="24"/>
+              </w:rPr>
+              <w:t>П5</w:t>
+            </w:r>
+          </w:p>
+        </w:tc>
+      </w:tr>
+      <w:tr>
+        <w:tc>
+          <w:tcPr>
+            <w:tcW w:type="dxa" w:w="1077"/>
+          </w:tcPr>
+          <w:p>
+            <w:r>
+              <w:rPr>
+                <w:sz w:val="24"/>
+              </w:rPr>
+              <w:t>consent*</w:t>
+            </w:r>
+          </w:p>
+        </w:tc>
+        <w:tc>
+          <w:tcPr>
+            <w:tcW w:type="dxa" w:w="1361"/>
+          </w:tcPr>
+          <w:p>
+            <w:r>
+              <w:rPr>
+                <w:sz w:val="24"/>
+              </w:rPr>
+              <w:t>boolean, длина —</w:t>
+            </w:r>
+          </w:p>
+        </w:tc>
+        <w:tc>
+          <w:tcPr>
+            <w:tcW w:type="dxa" w:w="1871"/>
+          </w:tcPr>
+          <w:p>
+            <w:r>
+              <w:rPr>
+                <w:sz w:val="24"/>
+              </w:rPr>
+              <w:t>Да, значение true; уникальность: —</w:t>
+            </w:r>
+          </w:p>
+        </w:tc>
+        <w:tc>
+          <w:tcPr>
+            <w:tcW w:type="dxa" w:w="2041"/>
+          </w:tcPr>
+          <w:p>
+            <w:r>
+              <w:rPr>
+                <w:sz w:val="24"/>
+              </w:rPr>
+              <w:t>Только true; в записи не хранится</w:t>
+            </w:r>
+          </w:p>
+        </w:tc>
+        <w:tc>
+          <w:tcPr>
+            <w:tcW w:type="dxa" w:w="850"/>
+          </w:tcPr>
+          <w:p>
+            <w:r>
+              <w:rPr>
+                <w:sz w:val="24"/>
+              </w:rPr>
+              <w:t>false</w:t>
+            </w:r>
+          </w:p>
+        </w:tc>
+        <w:tc>
+          <w:tcPr>
+            <w:tcW w:type="dxa" w:w="1701"/>
+          </w:tcPr>
+          <w:p>
+            <w:r>
+              <w:rPr>
+                <w:sz w:val="24"/>
+              </w:rPr>
+              <w:t>→ документ «Политика конфиденциальности» (privacy.html)</w:t>
+            </w:r>
+          </w:p>
+        </w:tc>
+        <w:tc>
+          <w:tcPr>
+            <w:tcW w:type="dxa" w:w="737"/>
+          </w:tcPr>
+          <w:p>
+            <w:r>
+              <w:rPr>
+                <w:sz w:val="24"/>
+              </w:rPr>
+              <w:t>П6</w:t>
+            </w:r>
+          </w:p>
+        </w:tc>
+      </w:tr>
+      <w:tr>
+        <w:tc>
+          <w:tcPr>
+            <w:tcW w:type="dxa" w:w="1077"/>
+          </w:tcPr>
+          <w:p>
+            <w:r>
+              <w:rPr>
+                <w:sz w:val="24"/>
+              </w:rPr>
+              <w:t>createdAt</w:t>
+            </w:r>
+          </w:p>
+        </w:tc>
+        <w:tc>
+          <w:tcPr>
+            <w:tcW w:type="dxa" w:w="1361"/>
+          </w:tcPr>
+          <w:p>
+            <w:r>
+              <w:rPr>
+                <w:sz w:val="24"/>
+              </w:rPr>
+              <w:t>string (ISO 8601, UTC), длина 24</w:t>
+            </w:r>
+          </w:p>
+        </w:tc>
+        <w:tc>
+          <w:tcPr>
+            <w:tcW w:type="dxa" w:w="1871"/>
+          </w:tcPr>
+          <w:p>
+            <w:r>
+              <w:rPr>
+                <w:sz w:val="24"/>
+              </w:rPr>
+              <w:t>Да (формирует система); уникальность: Нет (практически уникально)</w:t>
+            </w:r>
+          </w:p>
+        </w:tc>
+        <w:tc>
+          <w:tcPr>
+            <w:tcW w:type="dxa" w:w="2041"/>
+          </w:tcPr>
+          <w:p>
+            <w:r>
+              <w:rPr>
+                <w:sz w:val="24"/>
+              </w:rPr>
+              <w:t>ГГГГ-ММ-ДДTЧЧ:ММ:СС.ссссZ, Date.toISOString()</w:t>
+            </w:r>
+          </w:p>
+        </w:tc>
+        <w:tc>
+          <w:tcPr>
+            <w:tcW w:type="dxa" w:w="850"/>
+          </w:tcPr>
+          <w:p>
+            <w:r>
+              <w:rPr>
+                <w:sz w:val="24"/>
+              </w:rPr>
+              <w:t>текущее время</w:t>
+            </w:r>
+          </w:p>
+        </w:tc>
+        <w:tc>
+          <w:tcPr>
+            <w:tcW w:type="dxa" w:w="1701"/>
+          </w:tcPr>
+          <w:p>
+            <w:r>
+              <w:rPr>
+                <w:sz w:val="24"/>
+              </w:rPr>
+              <w:t>Связей нет</w:t>
+            </w:r>
+          </w:p>
+        </w:tc>
+        <w:tc>
+          <w:tcPr>
+            <w:tcW w:type="dxa" w:w="737"/>
+          </w:tcPr>
+          <w:p>
+            <w:r>
+              <w:rPr>
+                <w:sz w:val="24"/>
+              </w:rPr>
+              <w:t>—</w:t>
+            </w:r>
+          </w:p>
+        </w:tc>
+      </w:tr>
+    </w:tbl>
+    <w:p/>
+    <w:p>
+      <w:r>
+        <w:t>Хранилище: массив JSON в LocalStorage браузера, ключ dslkit.waitlist (префикс dslkit. задаёт createStorage). Первичного ключа и индексов нет, запись определяется позицией в массиве. Связь «заявка → нотация» N:1 со справочником NOTATIONS из шести значений (site/js/utils/validation.js). * — обязательное поле. Поле consent проверяется, но в запись не попадает.</w:t>
+      </w:r>
+    </w:p>
     <w:p>
       <w:pPr>
         <w:pStyle w:val="Heading2"/>
@@ -2777,7 +3675,7 @@
               <w:rPr>
                 <w:sz w:val="24"/>
               </w:rPr>
-              <w:t>name (#name)</w:t>
+              <w:t>name* (#name)</w:t>
             </w:r>
           </w:p>
         </w:tc>
@@ -2857,7 +3755,7 @@
               <w:rPr>
                 <w:sz w:val="24"/>
               </w:rPr>
-              <w:t>email (#email)</w:t>
+              <w:t>email* (#email)</w:t>
             </w:r>
           </w:p>
         </w:tc>
@@ -2937,7 +3835,7 @@
               <w:rPr>
                 <w:sz w:val="24"/>
               </w:rPr>
-              <w:t>notation (#notation)</w:t>
+              <w:t>notation* (#notation)</w:t>
             </w:r>
           </w:p>
         </w:tc>
@@ -3017,7 +3915,7 @@
               <w:rPr>
                 <w:sz w:val="24"/>
               </w:rPr>
-              <w:t>team (#team)</w:t>
+              <w:t>team* (#team)</w:t>
             </w:r>
           </w:p>
         </w:tc>
@@ -3177,7 +4075,7 @@
               <w:rPr>
                 <w:sz w:val="24"/>
               </w:rPr>
-              <w:t>consent (#consent)</w:t>
+              <w:t>consent* (#consent)</w:t>
             </w:r>
           </w:p>
         </w:tc>

</xml_diff>